<commit_message>
Nouvel exposé jusqu'au "but"
</commit_message>
<xml_diff>
--- a/Nouvel-exposé-des-règles.docx
+++ b/Nouvel-exposé-des-règles.docx
@@ -162,143 +162,7 @@
           <w:kern w:val="0"/>
           <w14:ligatures w14:val="none"/>
         </w:rPr>
-        <w:t xml:space="preserve">Terre de Barons est un jeu </w:t>
-      </w:r>
-      <w:r>
-        <w:rPr>
-          <w:rFonts w:cs="Calibri"/>
-          <w:kern w:val="0"/>
-          <w14:ligatures w14:val="none"/>
-        </w:rPr>
-        <w:t>médiéval</w:t>
-      </w:r>
-      <w:r>
-        <w:rPr>
-          <w:rFonts w:cs="Calibri"/>
-          <w:kern w:val="0"/>
-          <w14:ligatures w14:val="none"/>
-        </w:rPr>
-        <w:t>,</w:t>
-      </w:r>
-      <w:r>
-        <w:rPr>
-          <w:rFonts w:cs="Calibri"/>
-          <w:kern w:val="0"/>
-          <w14:ligatures w14:val="none"/>
-        </w:rPr>
-        <w:t xml:space="preserve"> </w:t>
-      </w:r>
-      <w:r>
-        <w:rPr>
-          <w:rFonts w:cs="Calibri"/>
-          <w:kern w:val="0"/>
-          <w14:ligatures w14:val="none"/>
-        </w:rPr>
-        <w:t xml:space="preserve">de conquête et </w:t>
-      </w:r>
-      <w:r>
-        <w:rPr>
-          <w:rFonts w:cs="Calibri"/>
-          <w:kern w:val="0"/>
-          <w14:ligatures w14:val="none"/>
-        </w:rPr>
-        <w:t>d’opposition</w:t>
-      </w:r>
-      <w:r>
-        <w:rPr>
-          <w:rFonts w:cs="Calibri"/>
-          <w:kern w:val="0"/>
-          <w14:ligatures w14:val="none"/>
-        </w:rPr>
-        <w:t>,</w:t>
-      </w:r>
-      <w:r>
-        <w:rPr>
-          <w:rFonts w:cs="Calibri"/>
-          <w:kern w:val="0"/>
-          <w14:ligatures w14:val="none"/>
-        </w:rPr>
-        <w:t xml:space="preserve"> où v</w:t>
-      </w:r>
-      <w:r>
-        <w:rPr>
-          <w:rFonts w:cs="Calibri"/>
-          <w:kern w:val="0"/>
-          <w14:ligatures w14:val="none"/>
-        </w:rPr>
-        <w:t>o</w:t>
-      </w:r>
-      <w:r>
-        <w:rPr>
-          <w:rFonts w:cs="Calibri"/>
-          <w:kern w:val="0"/>
-          <w14:ligatures w14:val="none"/>
-        </w:rPr>
-        <w:t>u</w:t>
-      </w:r>
-      <w:r>
-        <w:rPr>
-          <w:rFonts w:cs="Calibri"/>
-          <w:kern w:val="0"/>
-          <w14:ligatures w14:val="none"/>
-        </w:rPr>
-        <w:t>s</w:t>
-      </w:r>
-      <w:r>
-        <w:rPr>
-          <w:rFonts w:cs="Calibri"/>
-          <w:kern w:val="0"/>
-          <w14:ligatures w14:val="none"/>
-        </w:rPr>
-        <w:t xml:space="preserve"> déclenchez vos</w:t>
-      </w:r>
-      <w:r>
-        <w:rPr>
-          <w:rFonts w:cs="Calibri"/>
-          <w:kern w:val="0"/>
-          <w14:ligatures w14:val="none"/>
-        </w:rPr>
-        <w:t xml:space="preserve"> actions </w:t>
-      </w:r>
-      <w:r>
-        <w:rPr>
-          <w:rFonts w:cs="Calibri"/>
-          <w:kern w:val="0"/>
-          <w14:ligatures w14:val="none"/>
-        </w:rPr>
-        <w:t>sur votre Baron, vos Chevaliers et vos Troupes</w:t>
-      </w:r>
-      <w:r>
-        <w:rPr>
-          <w:rFonts w:cs="Calibri"/>
-          <w:kern w:val="0"/>
-          <w14:ligatures w14:val="none"/>
-        </w:rPr>
-        <w:t>,</w:t>
-      </w:r>
-      <w:r>
-        <w:rPr>
-          <w:rFonts w:cs="Calibri"/>
-          <w:kern w:val="0"/>
-          <w14:ligatures w14:val="none"/>
-        </w:rPr>
-        <w:t xml:space="preserve"> </w:t>
-      </w:r>
-      <w:r>
-        <w:rPr>
-          <w:rFonts w:cs="Calibri"/>
-          <w:kern w:val="0"/>
-          <w14:ligatures w14:val="none"/>
-        </w:rPr>
-        <w:t>par les cartes de votre deck</w:t>
-      </w:r>
-      <w:r>
-        <w:rPr>
-          <w:rFonts w:cs="Calibri"/>
-          <w:kern w:val="0"/>
-          <w14:ligatures w14:val="none"/>
-        </w:rPr>
-        <w:t>.</w:t>
+        <w:t>Dans Terre de Barons, vous incarnez un stratège médiéval engagé dans la conquête de terres disputées. Sur un plateau modulaire renouvelé à chaque partie, vos actions sont dictées par la gestion des cartes de votre deck.</w:t>
       </w:r>
     </w:p>
     <w:p>
@@ -316,7 +180,7 @@
           <w:kern w:val="0"/>
           <w14:ligatures w14:val="none"/>
         </w:rPr>
-        <w:t xml:space="preserve">Sur </w:t>
+        <w:t>Vos Officiers — un Baron et ses Chevaliers — parcourent le terrain pour assurer la logistique de votre armée</w:t>
       </w:r>
       <w:r>
         <w:rPr>
@@ -324,7 +188,7 @@
           <w:kern w:val="0"/>
           <w14:ligatures w14:val="none"/>
         </w:rPr>
-        <w:t>le terrain</w:t>
+        <w:t xml:space="preserve"> : </w:t>
       </w:r>
       <w:r>
         <w:rPr>
@@ -332,159 +196,7 @@
           <w:kern w:val="0"/>
           <w14:ligatures w14:val="none"/>
         </w:rPr>
-        <w:t xml:space="preserve">, </w:t>
-      </w:r>
-      <w:r>
-        <w:rPr>
-          <w:rFonts w:cs="Calibri"/>
-          <w:kern w:val="0"/>
-          <w14:ligatures w14:val="none"/>
-        </w:rPr>
-        <w:t>vous utilisez</w:t>
-      </w:r>
-      <w:r>
-        <w:rPr>
-          <w:rFonts w:cs="Calibri"/>
-          <w:kern w:val="0"/>
-          <w14:ligatures w14:val="none"/>
-        </w:rPr>
-        <w:t xml:space="preserve"> </w:t>
-      </w:r>
-      <w:r>
-        <w:rPr>
-          <w:rFonts w:cs="Calibri"/>
-          <w:kern w:val="0"/>
-          <w14:ligatures w14:val="none"/>
-        </w:rPr>
-        <w:t xml:space="preserve">vos Officiers, un Baron et </w:t>
-      </w:r>
-      <w:r>
-        <w:rPr>
-          <w:rFonts w:cs="Calibri"/>
-          <w:kern w:val="0"/>
-          <w14:ligatures w14:val="none"/>
-        </w:rPr>
-        <w:t>ses</w:t>
-      </w:r>
-      <w:r>
-        <w:rPr>
-          <w:rFonts w:cs="Calibri"/>
-          <w:kern w:val="0"/>
-          <w14:ligatures w14:val="none"/>
-        </w:rPr>
-        <w:t xml:space="preserve"> Chevaliers</w:t>
-      </w:r>
-      <w:r>
-        <w:rPr>
-          <w:rFonts w:cs="Calibri"/>
-          <w:kern w:val="0"/>
-          <w14:ligatures w14:val="none"/>
-        </w:rPr>
-        <w:t xml:space="preserve">, </w:t>
-      </w:r>
-      <w:r>
-        <w:rPr>
-          <w:rFonts w:cs="Calibri"/>
-          <w:kern w:val="0"/>
-          <w14:ligatures w14:val="none"/>
-        </w:rPr>
-        <w:t>pour</w:t>
-      </w:r>
-      <w:r>
-        <w:rPr>
-          <w:rFonts w:cs="Calibri"/>
-          <w:kern w:val="0"/>
-          <w14:ligatures w14:val="none"/>
-        </w:rPr>
-        <w:t xml:space="preserve"> recrute</w:t>
-      </w:r>
-      <w:r>
-        <w:rPr>
-          <w:rFonts w:cs="Calibri"/>
-          <w:kern w:val="0"/>
-          <w14:ligatures w14:val="none"/>
-        </w:rPr>
-        <w:t>r</w:t>
-      </w:r>
-      <w:r>
-        <w:rPr>
-          <w:rFonts w:cs="Calibri"/>
-          <w:kern w:val="0"/>
-          <w14:ligatures w14:val="none"/>
-        </w:rPr>
-        <w:t xml:space="preserve"> </w:t>
-      </w:r>
-      <w:r>
-        <w:rPr>
-          <w:rFonts w:cs="Calibri"/>
-          <w:kern w:val="0"/>
-          <w14:ligatures w14:val="none"/>
-        </w:rPr>
-        <w:t>des</w:t>
-      </w:r>
-      <w:r>
-        <w:rPr>
-          <w:rFonts w:cs="Calibri"/>
-          <w:kern w:val="0"/>
-          <w14:ligatures w14:val="none"/>
-        </w:rPr>
-        <w:t xml:space="preserve"> Troupes, les déplacer et construire des Donjons</w:t>
-      </w:r>
-      <w:r>
-        <w:rPr>
-          <w:rFonts w:cs="Calibri"/>
-          <w:kern w:val="0"/>
-          <w14:ligatures w14:val="none"/>
-        </w:rPr>
-        <w:t>,</w:t>
-      </w:r>
-      <w:r>
-        <w:rPr>
-          <w:rFonts w:cs="Calibri"/>
-          <w:kern w:val="0"/>
-          <w14:ligatures w14:val="none"/>
-        </w:rPr>
-        <w:t xml:space="preserve"> </w:t>
-      </w:r>
-      <w:r>
-        <w:rPr>
-          <w:rFonts w:cs="Calibri"/>
-          <w:kern w:val="0"/>
-          <w14:ligatures w14:val="none"/>
-        </w:rPr>
-        <w:t>afin</w:t>
-      </w:r>
-      <w:r>
-        <w:rPr>
-          <w:rFonts w:cs="Calibri"/>
-          <w:kern w:val="0"/>
-          <w14:ligatures w14:val="none"/>
-        </w:rPr>
-        <w:t xml:space="preserve"> </w:t>
-      </w:r>
-      <w:r>
-        <w:rPr>
-          <w:rFonts w:cs="Calibri"/>
-          <w:kern w:val="0"/>
-          <w14:ligatures w14:val="none"/>
-        </w:rPr>
-        <w:t>d’accroître</w:t>
-      </w:r>
-      <w:r>
-        <w:rPr>
-          <w:rFonts w:cs="Calibri"/>
-          <w:kern w:val="0"/>
-          <w14:ligatures w14:val="none"/>
-        </w:rPr>
-        <w:t xml:space="preserve"> votre richesse</w:t>
-      </w:r>
-      <w:r>
-        <w:rPr>
-          <w:rFonts w:cs="Calibri"/>
-          <w:kern w:val="0"/>
-          <w14:ligatures w14:val="none"/>
-        </w:rPr>
-        <w:t>.</w:t>
+        <w:t>ils recrutent, déplacent vos Troupes et ordonnent la construction des Donjons, piliers de votre conquête. Les manœuvres de Troupes peuvent provoquer des affrontements décisifs, tandis que le placement stratégique de vos Chevaliers permet de bloquer ou de limiter les ordres adverses.</w:t>
       </w:r>
     </w:p>
     <w:p>
@@ -502,153 +214,7 @@
           <w:kern w:val="0"/>
           <w14:ligatures w14:val="none"/>
         </w:rPr>
-        <w:t xml:space="preserve">Les </w:t>
-      </w:r>
-      <w:r>
-        <w:rPr>
-          <w:rFonts w:cs="Calibri"/>
-          <w:kern w:val="0"/>
-          <w14:ligatures w14:val="none"/>
-        </w:rPr>
-        <w:t xml:space="preserve">dispersions et concentrations de </w:t>
-      </w:r>
-      <w:r>
-        <w:rPr>
-          <w:rFonts w:cs="Calibri"/>
-          <w:kern w:val="0"/>
-          <w14:ligatures w14:val="none"/>
-        </w:rPr>
-        <w:t>Troupes</w:t>
-      </w:r>
-      <w:r>
-        <w:rPr>
-          <w:rFonts w:cs="Calibri"/>
-          <w:kern w:val="0"/>
-          <w14:ligatures w14:val="none"/>
-        </w:rPr>
-        <w:t xml:space="preserve"> </w:t>
-      </w:r>
-      <w:r>
-        <w:rPr>
-          <w:rFonts w:cs="Calibri"/>
-          <w:kern w:val="0"/>
-          <w14:ligatures w14:val="none"/>
-        </w:rPr>
-        <w:t>occasionnent</w:t>
-      </w:r>
-      <w:r>
-        <w:rPr>
-          <w:rFonts w:cs="Calibri"/>
-          <w:kern w:val="0"/>
-          <w14:ligatures w14:val="none"/>
-        </w:rPr>
-        <w:t xml:space="preserve"> </w:t>
-      </w:r>
-      <w:r>
-        <w:rPr>
-          <w:rFonts w:cs="Calibri"/>
-          <w:kern w:val="0"/>
-          <w14:ligatures w14:val="none"/>
-        </w:rPr>
-        <w:t xml:space="preserve">des </w:t>
-      </w:r>
-      <w:r>
-        <w:rPr>
-          <w:rFonts w:cs="Calibri"/>
-          <w:kern w:val="0"/>
-          <w14:ligatures w14:val="none"/>
-        </w:rPr>
-        <w:t>affrontements</w:t>
-      </w:r>
-      <w:r>
-        <w:rPr>
-          <w:rFonts w:cs="Calibri"/>
-          <w:kern w:val="0"/>
-          <w14:ligatures w14:val="none"/>
-        </w:rPr>
-        <w:t>. Les placements de Chevaliers peuvent bloquer ou limiter les ordres donnés aux</w:t>
-      </w:r>
-      <w:r>
-        <w:rPr>
-          <w:rFonts w:cs="Calibri"/>
-          <w:kern w:val="0"/>
-          <w14:ligatures w14:val="none"/>
-        </w:rPr>
-        <w:t xml:space="preserve"> Troupes</w:t>
-      </w:r>
-      <w:r>
-        <w:rPr>
-          <w:rFonts w:cs="Calibri"/>
-          <w:kern w:val="0"/>
-          <w14:ligatures w14:val="none"/>
-        </w:rPr>
-        <w:t>.</w:t>
-      </w:r>
-    </w:p>
-    <w:p>
-      <w:pPr>
-        <w:jc w:val="both"/>
-        <w:rPr>
-          <w:rFonts w:cs="Calibri"/>
-          <w:kern w:val="0"/>
-          <w14:ligatures w14:val="none"/>
-        </w:rPr>
-      </w:pPr>
-      <w:r>
-        <w:rPr>
-          <w:rFonts w:cs="Calibri"/>
-          <w:kern w:val="0"/>
-          <w14:ligatures w14:val="none"/>
-        </w:rPr>
-        <w:t xml:space="preserve">Chaque décision </w:t>
-      </w:r>
-      <w:r>
-        <w:rPr>
-          <w:rFonts w:cs="Calibri"/>
-          <w:kern w:val="0"/>
-          <w14:ligatures w14:val="none"/>
-        </w:rPr>
-        <w:t xml:space="preserve">tactique </w:t>
-      </w:r>
-      <w:r>
-        <w:rPr>
-          <w:rFonts w:cs="Calibri"/>
-          <w:kern w:val="0"/>
-          <w14:ligatures w14:val="none"/>
-        </w:rPr>
-        <w:t>influence le développement de vo</w:t>
-      </w:r>
-      <w:r>
-        <w:rPr>
-          <w:rFonts w:cs="Calibri"/>
-          <w:kern w:val="0"/>
-          <w14:ligatures w14:val="none"/>
-        </w:rPr>
-        <w:t>s</w:t>
-      </w:r>
-      <w:r>
-        <w:rPr>
-          <w:rFonts w:cs="Calibri"/>
-          <w:kern w:val="0"/>
-          <w14:ligatures w14:val="none"/>
-        </w:rPr>
-        <w:t xml:space="preserve"> territoire</w:t>
-      </w:r>
-      <w:r>
-        <w:rPr>
-          <w:rFonts w:cs="Calibri"/>
-          <w:kern w:val="0"/>
-          <w14:ligatures w14:val="none"/>
-        </w:rPr>
-        <w:t>s</w:t>
-      </w:r>
-      <w:r>
-        <w:rPr>
-          <w:rFonts w:cs="Calibri"/>
-          <w:kern w:val="0"/>
-          <w14:ligatures w14:val="none"/>
-        </w:rPr>
-        <w:t xml:space="preserve"> et l’issue des affrontements. Adaptez votre stratégie pour dominer vos adversaires et devenir le Baron le plus puissant.</w:t>
+        <w:t>Qui s’imposera comme le Baron le plus puissant ? Êtes-vous prêt pour une aventure épique où se mêlent stratégie, tactique et prise de risque ?</w:t>
       </w:r>
     </w:p>
     <w:p>
@@ -686,6 +252,774 @@
       <w:bookmarkEnd w:id="1"/>
       <w:bookmarkEnd w:id="2"/>
     </w:p>
+    <w:tbl>
+      <w:tblPr>
+        <w:tblStyle w:val="Grilledutableau"/>
+        <w:tblW w:w="0" w:type="auto"/>
+        <w:jc w:val="center"/>
+        <w:tblLook w:val="04A0" w:firstRow="1" w:lastRow="0" w:firstColumn="1" w:lastColumn="0" w:noHBand="0" w:noVBand="1"/>
+      </w:tblPr>
+      <w:tblGrid>
+        <w:gridCol w:w="1955"/>
+        <w:gridCol w:w="1447"/>
+        <w:gridCol w:w="222"/>
+        <w:gridCol w:w="1110"/>
+        <w:gridCol w:w="222"/>
+        <w:gridCol w:w="2575"/>
+      </w:tblGrid>
+      <w:tr>
+        <w:trPr>
+          <w:jc w:val="center"/>
+        </w:trPr>
+        <w:tc>
+          <w:tcPr>
+            <w:tcW w:w="0" w:type="auto"/>
+            <w:shd w:val="clear" w:color="auto" w:fill="D9D9D9" w:themeFill="background1" w:themeFillShade="D9"/>
+          </w:tcPr>
+          <w:p>
+            <w:pPr>
+              <w:jc w:val="right"/>
+              <w:rPr>
+                <w:rFonts w:eastAsia="Calibri" w:cs="Times New Roman"/>
+                <w:kern w:val="0"/>
+                <w14:ligatures w14:val="none"/>
+              </w:rPr>
+            </w:pPr>
+            <w:r>
+              <w:rPr>
+                <w:rFonts w:eastAsia="Calibri" w:cs="Times New Roman"/>
+                <w:b/>
+                <w:bCs/>
+                <w:kern w:val="0"/>
+                <w:sz w:val="20"/>
+                <w:szCs w:val="20"/>
+                <w14:ligatures w14:val="none"/>
+              </w:rPr>
+              <w:t>Nombre de joueurs</w:t>
+            </w:r>
+            <w:r>
+              <w:rPr>
+                <w:rFonts w:eastAsia="Calibri" w:cs="Times New Roman"/>
+                <w:b/>
+                <w:bCs/>
+                <w:kern w:val="0"/>
+                <w:sz w:val="20"/>
+                <w:szCs w:val="20"/>
+                <w14:ligatures w14:val="none"/>
+              </w:rPr>
+              <w:t xml:space="preserve"> </w:t>
+            </w:r>
+          </w:p>
+        </w:tc>
+        <w:tc>
+          <w:tcPr>
+            <w:tcW w:w="0" w:type="auto"/>
+            <w:tcBorders>
+              <w:right w:val="single" w:sz="4" w:space="0" w:color="auto"/>
+            </w:tcBorders>
+          </w:tcPr>
+          <w:p>
+            <w:pPr>
+              <w:jc w:val="both"/>
+              <w:rPr>
+                <w:rFonts w:eastAsia="Calibri" w:cs="Times New Roman"/>
+                <w:kern w:val="0"/>
+                <w14:ligatures w14:val="none"/>
+              </w:rPr>
+            </w:pPr>
+            <w:r>
+              <w:rPr>
+                <w:rFonts w:eastAsia="Calibri" w:cs="Times New Roman"/>
+                <w:kern w:val="0"/>
+                <w:sz w:val="20"/>
+                <w:szCs w:val="20"/>
+                <w14:ligatures w14:val="none"/>
+              </w:rPr>
+              <w:t>2 à 4</w:t>
+            </w:r>
+          </w:p>
+        </w:tc>
+        <w:tc>
+          <w:tcPr>
+            <w:tcW w:w="0" w:type="auto"/>
+            <w:tcBorders>
+              <w:top w:val="nil"/>
+              <w:left w:val="single" w:sz="4" w:space="0" w:color="auto"/>
+              <w:bottom w:val="nil"/>
+              <w:right w:val="single" w:sz="4" w:space="0" w:color="auto"/>
+            </w:tcBorders>
+          </w:tcPr>
+          <w:p>
+            <w:pPr>
+              <w:jc w:val="both"/>
+              <w:rPr>
+                <w:rFonts w:eastAsia="Calibri" w:cs="Times New Roman"/>
+                <w:kern w:val="0"/>
+                <w:sz w:val="20"/>
+                <w:szCs w:val="20"/>
+                <w14:ligatures w14:val="none"/>
+              </w:rPr>
+            </w:pPr>
+          </w:p>
+        </w:tc>
+        <w:tc>
+          <w:tcPr>
+            <w:tcW w:w="0" w:type="auto"/>
+            <w:tcBorders>
+              <w:left w:val="single" w:sz="4" w:space="0" w:color="auto"/>
+              <w:right w:val="single" w:sz="4" w:space="0" w:color="auto"/>
+            </w:tcBorders>
+            <w:shd w:val="clear" w:color="auto" w:fill="D9D9D9" w:themeFill="background1" w:themeFillShade="D9"/>
+          </w:tcPr>
+          <w:p>
+            <w:pPr>
+              <w:jc w:val="both"/>
+              <w:rPr>
+                <w:rFonts w:eastAsia="Calibri" w:cs="Times New Roman"/>
+                <w:b/>
+                <w:bCs/>
+                <w:kern w:val="0"/>
+                <w:sz w:val="20"/>
+                <w:szCs w:val="20"/>
+                <w14:ligatures w14:val="none"/>
+              </w:rPr>
+            </w:pPr>
+            <w:r>
+              <w:rPr>
+                <w:rFonts w:eastAsia="Calibri" w:cs="Times New Roman"/>
+                <w:b/>
+                <w:bCs/>
+                <w:kern w:val="0"/>
+                <w:sz w:val="20"/>
+                <w:szCs w:val="20"/>
+                <w14:ligatures w14:val="none"/>
+              </w:rPr>
+              <w:t>Genre</w:t>
+            </w:r>
+          </w:p>
+        </w:tc>
+        <w:tc>
+          <w:tcPr>
+            <w:tcW w:w="0" w:type="auto"/>
+            <w:tcBorders>
+              <w:top w:val="nil"/>
+              <w:left w:val="single" w:sz="4" w:space="0" w:color="auto"/>
+              <w:bottom w:val="nil"/>
+              <w:right w:val="single" w:sz="4" w:space="0" w:color="auto"/>
+            </w:tcBorders>
+          </w:tcPr>
+          <w:p>
+            <w:pPr>
+              <w:jc w:val="both"/>
+              <w:rPr>
+                <w:rFonts w:eastAsia="Calibri" w:cs="Times New Roman"/>
+                <w:b/>
+                <w:bCs/>
+                <w:kern w:val="0"/>
+                <w:sz w:val="20"/>
+                <w:szCs w:val="20"/>
+                <w14:ligatures w14:val="none"/>
+              </w:rPr>
+            </w:pPr>
+          </w:p>
+        </w:tc>
+        <w:tc>
+          <w:tcPr>
+            <w:tcW w:w="0" w:type="auto"/>
+            <w:tcBorders>
+              <w:left w:val="single" w:sz="4" w:space="0" w:color="auto"/>
+            </w:tcBorders>
+            <w:shd w:val="clear" w:color="auto" w:fill="D9D9D9" w:themeFill="background1" w:themeFillShade="D9"/>
+          </w:tcPr>
+          <w:p>
+            <w:pPr>
+              <w:jc w:val="both"/>
+              <w:rPr>
+                <w:rFonts w:eastAsia="Calibri" w:cs="Times New Roman"/>
+                <w:kern w:val="0"/>
+                <w:sz w:val="20"/>
+                <w:szCs w:val="20"/>
+                <w14:ligatures w14:val="none"/>
+              </w:rPr>
+            </w:pPr>
+            <w:r>
+              <w:rPr>
+                <w:rFonts w:eastAsia="Calibri" w:cs="Times New Roman"/>
+                <w:b/>
+                <w:bCs/>
+                <w:kern w:val="0"/>
+                <w:sz w:val="20"/>
+                <w:szCs w:val="20"/>
+                <w14:ligatures w14:val="none"/>
+              </w:rPr>
+              <w:t>Mécaniques</w:t>
+            </w:r>
+          </w:p>
+        </w:tc>
+      </w:tr>
+      <w:tr>
+        <w:trPr>
+          <w:jc w:val="center"/>
+        </w:trPr>
+        <w:tc>
+          <w:tcPr>
+            <w:tcW w:w="0" w:type="auto"/>
+            <w:shd w:val="clear" w:color="auto" w:fill="D9D9D9" w:themeFill="background1" w:themeFillShade="D9"/>
+          </w:tcPr>
+          <w:p>
+            <w:pPr>
+              <w:jc w:val="right"/>
+              <w:rPr>
+                <w:rFonts w:eastAsia="Calibri" w:cs="Times New Roman"/>
+                <w:kern w:val="0"/>
+                <w14:ligatures w14:val="none"/>
+              </w:rPr>
+            </w:pPr>
+            <w:r>
+              <w:rPr>
+                <w:rFonts w:eastAsia="Calibri" w:cs="Times New Roman"/>
+                <w:b/>
+                <w:bCs/>
+                <w:kern w:val="0"/>
+                <w:sz w:val="20"/>
+                <w:szCs w:val="20"/>
+                <w14:ligatures w14:val="none"/>
+              </w:rPr>
+              <w:t>Âge</w:t>
+            </w:r>
+            <w:r>
+              <w:rPr>
+                <w:rFonts w:eastAsia="Calibri" w:cs="Times New Roman"/>
+                <w:b/>
+                <w:bCs/>
+                <w:kern w:val="0"/>
+                <w:sz w:val="20"/>
+                <w:szCs w:val="20"/>
+                <w14:ligatures w14:val="none"/>
+              </w:rPr>
+              <w:t xml:space="preserve"> </w:t>
+            </w:r>
+          </w:p>
+        </w:tc>
+        <w:tc>
+          <w:tcPr>
+            <w:tcW w:w="0" w:type="auto"/>
+            <w:tcBorders>
+              <w:right w:val="single" w:sz="4" w:space="0" w:color="auto"/>
+            </w:tcBorders>
+          </w:tcPr>
+          <w:p>
+            <w:pPr>
+              <w:jc w:val="both"/>
+              <w:rPr>
+                <w:rFonts w:eastAsia="Calibri" w:cs="Times New Roman"/>
+                <w:kern w:val="0"/>
+                <w14:ligatures w14:val="none"/>
+              </w:rPr>
+            </w:pPr>
+            <w:r>
+              <w:rPr>
+                <w:rFonts w:eastAsia="Calibri" w:cs="Times New Roman"/>
+                <w:kern w:val="0"/>
+                <w:sz w:val="20"/>
+                <w:szCs w:val="20"/>
+                <w14:ligatures w14:val="none"/>
+              </w:rPr>
+              <w:t>10 ans et plus</w:t>
+            </w:r>
+          </w:p>
+        </w:tc>
+        <w:tc>
+          <w:tcPr>
+            <w:tcW w:w="0" w:type="auto"/>
+            <w:tcBorders>
+              <w:top w:val="nil"/>
+              <w:left w:val="single" w:sz="4" w:space="0" w:color="auto"/>
+              <w:bottom w:val="nil"/>
+              <w:right w:val="single" w:sz="4" w:space="0" w:color="auto"/>
+            </w:tcBorders>
+          </w:tcPr>
+          <w:p>
+            <w:pPr>
+              <w:jc w:val="both"/>
+              <w:rPr>
+                <w:rFonts w:eastAsia="Calibri" w:cs="Times New Roman"/>
+                <w:kern w:val="0"/>
+                <w:sz w:val="20"/>
+                <w:szCs w:val="20"/>
+                <w14:ligatures w14:val="none"/>
+              </w:rPr>
+            </w:pPr>
+          </w:p>
+        </w:tc>
+        <w:tc>
+          <w:tcPr>
+            <w:tcW w:w="0" w:type="auto"/>
+            <w:tcBorders>
+              <w:left w:val="single" w:sz="4" w:space="0" w:color="auto"/>
+              <w:right w:val="single" w:sz="4" w:space="0" w:color="auto"/>
+            </w:tcBorders>
+          </w:tcPr>
+          <w:p>
+            <w:pPr>
+              <w:jc w:val="both"/>
+              <w:rPr>
+                <w:rFonts w:eastAsia="Calibri" w:cs="Times New Roman"/>
+                <w:kern w:val="0"/>
+                <w:sz w:val="20"/>
+                <w:szCs w:val="20"/>
+                <w14:ligatures w14:val="none"/>
+              </w:rPr>
+            </w:pPr>
+            <w:r>
+              <w:rPr>
+                <w:rFonts w:eastAsia="Calibri" w:cs="Times New Roman"/>
+                <w:kern w:val="0"/>
+                <w:sz w:val="20"/>
+                <w:szCs w:val="20"/>
+                <w14:ligatures w14:val="none"/>
+              </w:rPr>
+              <w:t>Conquête</w:t>
+            </w:r>
+          </w:p>
+        </w:tc>
+        <w:tc>
+          <w:tcPr>
+            <w:tcW w:w="0" w:type="auto"/>
+            <w:tcBorders>
+              <w:top w:val="nil"/>
+              <w:left w:val="single" w:sz="4" w:space="0" w:color="auto"/>
+              <w:bottom w:val="nil"/>
+              <w:right w:val="single" w:sz="4" w:space="0" w:color="auto"/>
+            </w:tcBorders>
+          </w:tcPr>
+          <w:p>
+            <w:pPr>
+              <w:jc w:val="both"/>
+              <w:rPr>
+                <w:rFonts w:eastAsia="Calibri" w:cs="Times New Roman"/>
+                <w:kern w:val="0"/>
+                <w:sz w:val="20"/>
+                <w:szCs w:val="20"/>
+                <w14:ligatures w14:val="none"/>
+              </w:rPr>
+            </w:pPr>
+          </w:p>
+        </w:tc>
+        <w:tc>
+          <w:tcPr>
+            <w:tcW w:w="0" w:type="auto"/>
+            <w:tcBorders>
+              <w:left w:val="single" w:sz="4" w:space="0" w:color="auto"/>
+            </w:tcBorders>
+          </w:tcPr>
+          <w:p>
+            <w:pPr>
+              <w:jc w:val="both"/>
+              <w:rPr>
+                <w:rFonts w:eastAsia="Calibri" w:cs="Times New Roman"/>
+                <w:kern w:val="0"/>
+                <w:sz w:val="20"/>
+                <w:szCs w:val="20"/>
+                <w14:ligatures w14:val="none"/>
+              </w:rPr>
+            </w:pPr>
+            <w:r>
+              <w:rPr>
+                <w:rFonts w:eastAsia="Calibri" w:cs="Times New Roman"/>
+                <w:kern w:val="0"/>
+                <w:sz w:val="20"/>
+                <w:szCs w:val="20"/>
+                <w14:ligatures w14:val="none"/>
+              </w:rPr>
+              <w:t>Contrôle de zones</w:t>
+            </w:r>
+          </w:p>
+        </w:tc>
+      </w:tr>
+      <w:tr>
+        <w:trPr>
+          <w:jc w:val="center"/>
+        </w:trPr>
+        <w:tc>
+          <w:tcPr>
+            <w:tcW w:w="0" w:type="auto"/>
+            <w:shd w:val="clear" w:color="auto" w:fill="D9D9D9" w:themeFill="background1" w:themeFillShade="D9"/>
+          </w:tcPr>
+          <w:p>
+            <w:pPr>
+              <w:jc w:val="right"/>
+              <w:rPr>
+                <w:rFonts w:eastAsia="Calibri" w:cs="Times New Roman"/>
+                <w:kern w:val="0"/>
+                <w14:ligatures w14:val="none"/>
+              </w:rPr>
+            </w:pPr>
+            <w:r>
+              <w:rPr>
+                <w:rFonts w:eastAsia="Calibri" w:cs="Times New Roman"/>
+                <w:b/>
+                <w:bCs/>
+                <w:kern w:val="0"/>
+                <w:sz w:val="20"/>
+                <w:szCs w:val="20"/>
+                <w14:ligatures w14:val="none"/>
+              </w:rPr>
+              <w:t>Durée</w:t>
+            </w:r>
+            <w:r>
+              <w:rPr>
+                <w:rFonts w:eastAsia="Calibri" w:cs="Times New Roman"/>
+                <w:b/>
+                <w:bCs/>
+                <w:kern w:val="0"/>
+                <w:sz w:val="20"/>
+                <w:szCs w:val="20"/>
+                <w14:ligatures w14:val="none"/>
+              </w:rPr>
+              <w:t xml:space="preserve"> </w:t>
+            </w:r>
+          </w:p>
+        </w:tc>
+        <w:tc>
+          <w:tcPr>
+            <w:tcW w:w="0" w:type="auto"/>
+            <w:tcBorders>
+              <w:right w:val="single" w:sz="4" w:space="0" w:color="auto"/>
+            </w:tcBorders>
+          </w:tcPr>
+          <w:p>
+            <w:pPr>
+              <w:jc w:val="both"/>
+              <w:rPr>
+                <w:rFonts w:eastAsia="Calibri" w:cs="Times New Roman"/>
+                <w:kern w:val="0"/>
+                <w14:ligatures w14:val="none"/>
+              </w:rPr>
+            </w:pPr>
+            <w:r>
+              <w:rPr>
+                <w:rFonts w:eastAsia="Calibri" w:cs="Times New Roman"/>
+                <w:kern w:val="0"/>
+                <w:sz w:val="20"/>
+                <w:szCs w:val="20"/>
+                <w14:ligatures w14:val="none"/>
+              </w:rPr>
+              <w:t>60 minutes</w:t>
+            </w:r>
+          </w:p>
+        </w:tc>
+        <w:tc>
+          <w:tcPr>
+            <w:tcW w:w="0" w:type="auto"/>
+            <w:tcBorders>
+              <w:top w:val="nil"/>
+              <w:left w:val="single" w:sz="4" w:space="0" w:color="auto"/>
+              <w:bottom w:val="nil"/>
+              <w:right w:val="single" w:sz="4" w:space="0" w:color="auto"/>
+            </w:tcBorders>
+          </w:tcPr>
+          <w:p>
+            <w:pPr>
+              <w:jc w:val="both"/>
+              <w:rPr>
+                <w:rFonts w:eastAsia="Calibri" w:cs="Times New Roman"/>
+                <w:kern w:val="0"/>
+                <w:sz w:val="20"/>
+                <w:szCs w:val="20"/>
+                <w14:ligatures w14:val="none"/>
+              </w:rPr>
+            </w:pPr>
+          </w:p>
+        </w:tc>
+        <w:tc>
+          <w:tcPr>
+            <w:tcW w:w="0" w:type="auto"/>
+            <w:tcBorders>
+              <w:left w:val="single" w:sz="4" w:space="0" w:color="auto"/>
+              <w:right w:val="single" w:sz="4" w:space="0" w:color="auto"/>
+            </w:tcBorders>
+          </w:tcPr>
+          <w:p>
+            <w:pPr>
+              <w:jc w:val="both"/>
+              <w:rPr>
+                <w:rFonts w:eastAsia="Calibri" w:cs="Times New Roman"/>
+                <w:b/>
+                <w:bCs/>
+                <w:kern w:val="0"/>
+                <w:sz w:val="20"/>
+                <w:szCs w:val="20"/>
+                <w14:ligatures w14:val="none"/>
+              </w:rPr>
+            </w:pPr>
+            <w:r>
+              <w:rPr>
+                <w:rFonts w:eastAsia="Calibri" w:cs="Times New Roman"/>
+                <w:kern w:val="0"/>
+                <w:sz w:val="20"/>
+                <w:szCs w:val="20"/>
+                <w14:ligatures w14:val="none"/>
+              </w:rPr>
+              <w:t>Tactique</w:t>
+            </w:r>
+          </w:p>
+        </w:tc>
+        <w:tc>
+          <w:tcPr>
+            <w:tcW w:w="0" w:type="auto"/>
+            <w:tcBorders>
+              <w:top w:val="nil"/>
+              <w:left w:val="single" w:sz="4" w:space="0" w:color="auto"/>
+              <w:bottom w:val="nil"/>
+              <w:right w:val="single" w:sz="4" w:space="0" w:color="auto"/>
+            </w:tcBorders>
+          </w:tcPr>
+          <w:p>
+            <w:pPr>
+              <w:jc w:val="both"/>
+              <w:rPr>
+                <w:rFonts w:eastAsia="Calibri" w:cs="Times New Roman"/>
+                <w:kern w:val="0"/>
+                <w:sz w:val="20"/>
+                <w:szCs w:val="20"/>
+                <w14:ligatures w14:val="none"/>
+              </w:rPr>
+            </w:pPr>
+          </w:p>
+        </w:tc>
+        <w:tc>
+          <w:tcPr>
+            <w:tcW w:w="0" w:type="auto"/>
+            <w:tcBorders>
+              <w:left w:val="single" w:sz="4" w:space="0" w:color="auto"/>
+            </w:tcBorders>
+          </w:tcPr>
+          <w:p>
+            <w:pPr>
+              <w:jc w:val="both"/>
+              <w:rPr>
+                <w:rFonts w:eastAsia="Calibri" w:cs="Times New Roman"/>
+                <w:kern w:val="0"/>
+                <w:sz w:val="20"/>
+                <w:szCs w:val="20"/>
+                <w14:ligatures w14:val="none"/>
+              </w:rPr>
+            </w:pPr>
+            <w:r>
+              <w:rPr>
+                <w:rFonts w:eastAsia="Calibri" w:cs="Times New Roman"/>
+                <w:kern w:val="0"/>
+                <w:sz w:val="20"/>
+                <w:szCs w:val="20"/>
+                <w14:ligatures w14:val="none"/>
+              </w:rPr>
+              <w:t>C</w:t>
+            </w:r>
+            <w:r>
+              <w:rPr>
+                <w:rFonts w:eastAsia="Calibri" w:cs="Times New Roman"/>
+                <w:kern w:val="0"/>
+                <w:sz w:val="20"/>
+                <w:szCs w:val="20"/>
+                <w14:ligatures w14:val="none"/>
+              </w:rPr>
+              <w:t>haîne de commandement</w:t>
+            </w:r>
+          </w:p>
+        </w:tc>
+      </w:tr>
+      <w:tr>
+        <w:trPr>
+          <w:jc w:val="center"/>
+        </w:trPr>
+        <w:tc>
+          <w:tcPr>
+            <w:tcW w:w="0" w:type="auto"/>
+            <w:shd w:val="clear" w:color="auto" w:fill="D9D9D9" w:themeFill="background1" w:themeFillShade="D9"/>
+          </w:tcPr>
+          <w:p>
+            <w:pPr>
+              <w:jc w:val="right"/>
+              <w:rPr>
+                <w:rFonts w:eastAsia="Calibri" w:cs="Times New Roman"/>
+                <w:kern w:val="0"/>
+                <w14:ligatures w14:val="none"/>
+              </w:rPr>
+            </w:pPr>
+            <w:r>
+              <w:rPr>
+                <w:rFonts w:eastAsia="Calibri" w:cs="Times New Roman"/>
+                <w:b/>
+                <w:bCs/>
+                <w:kern w:val="0"/>
+                <w:sz w:val="20"/>
+                <w:szCs w:val="20"/>
+                <w14:ligatures w14:val="none"/>
+              </w:rPr>
+              <w:t>Public</w:t>
+            </w:r>
+            <w:r>
+              <w:rPr>
+                <w:rFonts w:eastAsia="Calibri" w:cs="Times New Roman"/>
+                <w:b/>
+                <w:bCs/>
+                <w:kern w:val="0"/>
+                <w:sz w:val="20"/>
+                <w:szCs w:val="20"/>
+                <w14:ligatures w14:val="none"/>
+              </w:rPr>
+              <w:t xml:space="preserve"> </w:t>
+            </w:r>
+          </w:p>
+        </w:tc>
+        <w:tc>
+          <w:tcPr>
+            <w:tcW w:w="0" w:type="auto"/>
+            <w:tcBorders>
+              <w:right w:val="single" w:sz="4" w:space="0" w:color="auto"/>
+            </w:tcBorders>
+          </w:tcPr>
+          <w:p>
+            <w:pPr>
+              <w:jc w:val="both"/>
+              <w:rPr>
+                <w:rFonts w:eastAsia="Calibri" w:cs="Times New Roman"/>
+                <w:kern w:val="0"/>
+                <w14:ligatures w14:val="none"/>
+              </w:rPr>
+            </w:pPr>
+            <w:r>
+              <w:rPr>
+                <w:rFonts w:eastAsia="Calibri" w:cs="Times New Roman"/>
+                <w:kern w:val="0"/>
+                <w:sz w:val="20"/>
+                <w:szCs w:val="20"/>
+                <w14:ligatures w14:val="none"/>
+              </w:rPr>
+              <w:t>Joueurs initiés</w:t>
+            </w:r>
+          </w:p>
+        </w:tc>
+        <w:tc>
+          <w:tcPr>
+            <w:tcW w:w="0" w:type="auto"/>
+            <w:tcBorders>
+              <w:top w:val="nil"/>
+              <w:left w:val="single" w:sz="4" w:space="0" w:color="auto"/>
+              <w:bottom w:val="nil"/>
+              <w:right w:val="single" w:sz="4" w:space="0" w:color="auto"/>
+            </w:tcBorders>
+          </w:tcPr>
+          <w:p>
+            <w:pPr>
+              <w:jc w:val="both"/>
+              <w:rPr>
+                <w:rFonts w:eastAsia="Calibri" w:cs="Times New Roman"/>
+                <w:kern w:val="0"/>
+                <w:sz w:val="20"/>
+                <w:szCs w:val="20"/>
+                <w14:ligatures w14:val="none"/>
+              </w:rPr>
+            </w:pPr>
+          </w:p>
+        </w:tc>
+        <w:tc>
+          <w:tcPr>
+            <w:tcW w:w="0" w:type="auto"/>
+            <w:tcBorders>
+              <w:left w:val="single" w:sz="4" w:space="0" w:color="auto"/>
+              <w:right w:val="single" w:sz="4" w:space="0" w:color="auto"/>
+            </w:tcBorders>
+          </w:tcPr>
+          <w:p>
+            <w:pPr>
+              <w:jc w:val="both"/>
+              <w:rPr>
+                <w:rFonts w:eastAsia="Calibri" w:cs="Times New Roman"/>
+                <w:kern w:val="0"/>
+                <w:sz w:val="20"/>
+                <w:szCs w:val="20"/>
+                <w14:ligatures w14:val="none"/>
+              </w:rPr>
+            </w:pPr>
+            <w:r>
+              <w:rPr>
+                <w:rFonts w:eastAsia="Calibri" w:cs="Times New Roman"/>
+                <w:kern w:val="0"/>
+                <w:sz w:val="20"/>
+                <w:szCs w:val="20"/>
+                <w14:ligatures w14:val="none"/>
+              </w:rPr>
+              <w:t>Logistique</w:t>
+            </w:r>
+          </w:p>
+        </w:tc>
+        <w:tc>
+          <w:tcPr>
+            <w:tcW w:w="0" w:type="auto"/>
+            <w:tcBorders>
+              <w:top w:val="nil"/>
+              <w:left w:val="single" w:sz="4" w:space="0" w:color="auto"/>
+              <w:bottom w:val="nil"/>
+              <w:right w:val="single" w:sz="4" w:space="0" w:color="auto"/>
+            </w:tcBorders>
+          </w:tcPr>
+          <w:p>
+            <w:pPr>
+              <w:jc w:val="both"/>
+              <w:rPr>
+                <w:rFonts w:eastAsia="Calibri" w:cs="Times New Roman"/>
+                <w:kern w:val="0"/>
+                <w:sz w:val="20"/>
+                <w:szCs w:val="20"/>
+                <w14:ligatures w14:val="none"/>
+              </w:rPr>
+            </w:pPr>
+          </w:p>
+        </w:tc>
+        <w:tc>
+          <w:tcPr>
+            <w:tcW w:w="0" w:type="auto"/>
+            <w:tcBorders>
+              <w:left w:val="single" w:sz="4" w:space="0" w:color="auto"/>
+            </w:tcBorders>
+          </w:tcPr>
+          <w:p>
+            <w:pPr>
+              <w:jc w:val="both"/>
+              <w:rPr>
+                <w:rFonts w:eastAsia="Calibri" w:cs="Times New Roman"/>
+                <w:kern w:val="0"/>
+                <w:sz w:val="20"/>
+                <w:szCs w:val="20"/>
+                <w14:ligatures w14:val="none"/>
+              </w:rPr>
+            </w:pPr>
+            <w:r>
+              <w:rPr>
+                <w:rFonts w:eastAsia="Calibri" w:cs="Times New Roman"/>
+                <w:kern w:val="0"/>
+                <w:sz w:val="20"/>
+                <w:szCs w:val="20"/>
+                <w14:ligatures w14:val="none"/>
+              </w:rPr>
+              <w:t>G</w:t>
+            </w:r>
+            <w:r>
+              <w:rPr>
+                <w:rFonts w:eastAsia="Calibri" w:cs="Times New Roman"/>
+                <w:kern w:val="0"/>
+                <w:sz w:val="20"/>
+                <w:szCs w:val="20"/>
+                <w14:ligatures w14:val="none"/>
+              </w:rPr>
+              <w:t>estion de main</w:t>
+            </w:r>
+          </w:p>
+        </w:tc>
+      </w:tr>
+    </w:tbl>
     <w:p>
       <w:pPr>
         <w:jc w:val="both"/>
@@ -695,56 +1029,6 @@
           <w14:ligatures w14:val="none"/>
         </w:rPr>
       </w:pPr>
-      <w:r>
-        <w:rPr>
-          <w:rFonts w:eastAsia="Calibri" w:cs="Times New Roman"/>
-          <w:kern w:val="0"/>
-          <w14:ligatures w14:val="none"/>
-        </w:rPr>
-        <w:t xml:space="preserve">Nombre de joueurs : 2 à 4 / Age minimum : 10 ans / Durée de partie : </w:t>
-      </w:r>
-      <w:r>
-        <w:rPr>
-          <w:rFonts w:eastAsia="Calibri" w:cs="Times New Roman"/>
-          <w:kern w:val="0"/>
-          <w14:ligatures w14:val="none"/>
-        </w:rPr>
-        <w:t>60</w:t>
-      </w:r>
-      <w:r>
-        <w:rPr>
-          <w:rFonts w:eastAsia="Calibri" w:cs="Times New Roman"/>
-          <w:kern w:val="0"/>
-          <w14:ligatures w14:val="none"/>
-        </w:rPr>
-        <w:t xml:space="preserve"> minutes / Joueurs initiés</w:t>
-      </w:r>
-    </w:p>
-    <w:p>
-      <w:pPr>
-        <w:jc w:val="both"/>
-        <w:rPr>
-          <w:rFonts w:eastAsia="Calibri" w:cs="Times New Roman"/>
-          <w:kern w:val="0"/>
-          <w14:ligatures w14:val="none"/>
-        </w:rPr>
-      </w:pPr>
-      <w:r>
-        <w:rPr>
-          <w:rFonts w:eastAsia="Calibri" w:cs="Times New Roman"/>
-          <w:kern w:val="0"/>
-          <w14:ligatures w14:val="none"/>
-        </w:rPr>
-        <w:t>Type de jeu : tactique, stratégique, conquête</w:t>
-      </w:r>
-      <w:r>
-        <w:rPr>
-          <w:rFonts w:eastAsia="Calibri" w:cs="Times New Roman"/>
-          <w:kern w:val="0"/>
-          <w14:ligatures w14:val="none"/>
-        </w:rPr>
-        <w:t>, opposition</w:t>
-      </w:r>
     </w:p>
     <w:p>
       <w:pPr>
@@ -987,14 +1271,318 @@
           <w:kern w:val="0"/>
           <w14:ligatures w14:val="none"/>
         </w:rPr>
-        <w:t>37 tuiles hexagonales</w:t>
-      </w:r>
-      <w:r>
-        <w:rPr>
-          <w:kern w:val="0"/>
-          <w14:ligatures w14:val="none"/>
-        </w:rPr>
-        <w:t>, chacune identifiable par une couleur et une lettre. Chaque tuile représente, au recto, une terre à conquérir de 1, 2, 3, ou 4 points, et au verso en brun, une montagne infranchissable. Les points des tuiles sont associés à une couleur et à un symbole héraldique : 4=rouge=lion, 3=bleu=aigle, 2=vert=loup, 1=gris=cheval.</w:t>
+        <w:t xml:space="preserve">37 </w:t>
+      </w:r>
+      <w:r>
+        <w:rPr>
+          <w:b/>
+          <w:bCs/>
+          <w:kern w:val="0"/>
+          <w14:ligatures w14:val="none"/>
+        </w:rPr>
+        <w:t>T</w:t>
+      </w:r>
+      <w:r>
+        <w:rPr>
+          <w:b/>
+          <w:bCs/>
+          <w:kern w:val="0"/>
+          <w14:ligatures w14:val="none"/>
+        </w:rPr>
+        <w:t xml:space="preserve">uiles </w:t>
+      </w:r>
+      <w:r>
+        <w:rPr>
+          <w:b/>
+          <w:bCs/>
+          <w:kern w:val="0"/>
+          <w14:ligatures w14:val="none"/>
+        </w:rPr>
+        <w:t>hexagonales</w:t>
+      </w:r>
+      <w:r>
+        <w:rPr>
+          <w:kern w:val="0"/>
+          <w14:ligatures w14:val="none"/>
+        </w:rPr>
+        <w:t xml:space="preserve"> :</w:t>
+      </w:r>
+      <w:r>
+        <w:rPr>
+          <w:kern w:val="0"/>
+          <w14:ligatures w14:val="none"/>
+        </w:rPr>
+        <w:t xml:space="preserve"> au recto, Terre de 1, 2, 3, ou 4 points ; au verso, montagne infranchissable ; c</w:t>
+      </w:r>
+      <w:r>
+        <w:rPr>
+          <w:kern w:val="0"/>
+          <w14:ligatures w14:val="none"/>
+        </w:rPr>
+        <w:t>haque carte est</w:t>
+      </w:r>
+      <w:r>
+        <w:rPr>
+          <w:kern w:val="0"/>
+          <w14:ligatures w14:val="none"/>
+        </w:rPr>
+        <w:t xml:space="preserve"> identifiable par une couleur</w:t>
+      </w:r>
+      <w:r>
+        <w:rPr>
+          <w:kern w:val="0"/>
+          <w14:ligatures w14:val="none"/>
+        </w:rPr>
+        <w:t>, un symbole héraldique</w:t>
+      </w:r>
+      <w:r>
+        <w:rPr>
+          <w:kern w:val="0"/>
+          <w14:ligatures w14:val="none"/>
+        </w:rPr>
+        <w:t xml:space="preserve"> et une lettre</w:t>
+      </w:r>
+      <w:r>
+        <w:rPr>
+          <w:kern w:val="0"/>
+          <w14:ligatures w14:val="none"/>
+        </w:rPr>
+        <w:t xml:space="preserve"> ; </w:t>
+      </w:r>
+      <w:r>
+        <w:rPr>
+          <w:kern w:val="0"/>
+          <w14:ligatures w14:val="none"/>
+        </w:rPr>
+        <w:t xml:space="preserve">la </w:t>
+      </w:r>
+      <w:r>
+        <w:rPr>
+          <w:kern w:val="0"/>
+          <w14:ligatures w14:val="none"/>
+        </w:rPr>
+        <w:t>répartition</w:t>
+      </w:r>
+      <w:r>
+        <w:rPr>
+          <w:kern w:val="0"/>
+          <w14:ligatures w14:val="none"/>
+        </w:rPr>
+        <w:t xml:space="preserve"> est la suivante :</w:t>
+      </w:r>
+    </w:p>
+    <w:p>
+      <w:pPr>
+        <w:pStyle w:val="Paragraphedeliste"/>
+        <w:numPr>
+          <w:ilvl w:val="1"/>
+          <w:numId w:val="7"/>
+        </w:numPr>
+        <w:spacing w:after="120"/>
+        <w:jc w:val="both"/>
+        <w:rPr>
+          <w:kern w:val="0"/>
+          <w14:ligatures w14:val="none"/>
+        </w:rPr>
+      </w:pPr>
+      <w:r>
+        <w:rPr>
+          <w:kern w:val="0"/>
+          <w14:ligatures w14:val="none"/>
+        </w:rPr>
+        <w:t xml:space="preserve">10 cartes de </w:t>
+      </w:r>
+      <w:r>
+        <w:rPr>
+          <w:kern w:val="0"/>
+          <w14:ligatures w14:val="none"/>
+        </w:rPr>
+        <w:t>4</w:t>
+      </w:r>
+      <w:r>
+        <w:rPr>
+          <w:kern w:val="0"/>
+          <w14:ligatures w14:val="none"/>
+        </w:rPr>
+        <w:t xml:space="preserve"> points, </w:t>
+      </w:r>
+      <w:r>
+        <w:rPr>
+          <w:kern w:val="0"/>
+          <w14:ligatures w14:val="none"/>
+        </w:rPr>
+        <w:t>rouge</w:t>
+      </w:r>
+      <w:r>
+        <w:rPr>
+          <w:kern w:val="0"/>
+          <w14:ligatures w14:val="none"/>
+        </w:rPr>
+        <w:t>s avec un L</w:t>
+      </w:r>
+      <w:r>
+        <w:rPr>
+          <w:kern w:val="0"/>
+          <w14:ligatures w14:val="none"/>
+        </w:rPr>
+        <w:t>ion</w:t>
+      </w:r>
+      <w:r>
+        <w:rPr>
+          <w:kern w:val="0"/>
+          <w14:ligatures w14:val="none"/>
+        </w:rPr>
+        <w:t>.</w:t>
+      </w:r>
+    </w:p>
+    <w:p>
+      <w:pPr>
+        <w:pStyle w:val="Paragraphedeliste"/>
+        <w:numPr>
+          <w:ilvl w:val="1"/>
+          <w:numId w:val="7"/>
+        </w:numPr>
+        <w:spacing w:after="120"/>
+        <w:jc w:val="both"/>
+        <w:rPr>
+          <w:kern w:val="0"/>
+          <w14:ligatures w14:val="none"/>
+        </w:rPr>
+      </w:pPr>
+      <w:r>
+        <w:rPr>
+          <w:kern w:val="0"/>
+          <w14:ligatures w14:val="none"/>
+        </w:rPr>
+        <w:t xml:space="preserve">9 cartes de 3 points, bleues avec un </w:t>
+      </w:r>
+      <w:r>
+        <w:rPr>
+          <w:kern w:val="0"/>
+          <w14:ligatures w14:val="none"/>
+        </w:rPr>
+        <w:t>Aigle.</w:t>
+      </w:r>
+    </w:p>
+    <w:p>
+      <w:pPr>
+        <w:pStyle w:val="Paragraphedeliste"/>
+        <w:numPr>
+          <w:ilvl w:val="1"/>
+          <w:numId w:val="7"/>
+        </w:numPr>
+        <w:spacing w:after="120"/>
+        <w:jc w:val="both"/>
+        <w:rPr>
+          <w:kern w:val="0"/>
+          <w14:ligatures w14:val="none"/>
+        </w:rPr>
+      </w:pPr>
+      <w:r>
+        <w:rPr>
+          <w:kern w:val="0"/>
+          <w14:ligatures w14:val="none"/>
+        </w:rPr>
+        <w:t xml:space="preserve">9 cartes de </w:t>
+      </w:r>
+      <w:r>
+        <w:rPr>
+          <w:kern w:val="0"/>
+          <w14:ligatures w14:val="none"/>
+        </w:rPr>
+        <w:t>2</w:t>
+      </w:r>
+      <w:r>
+        <w:rPr>
+          <w:kern w:val="0"/>
+          <w14:ligatures w14:val="none"/>
+        </w:rPr>
+        <w:t xml:space="preserve"> points, </w:t>
+      </w:r>
+      <w:r>
+        <w:rPr>
+          <w:kern w:val="0"/>
+          <w14:ligatures w14:val="none"/>
+        </w:rPr>
+        <w:t>vertes</w:t>
+      </w:r>
+      <w:r>
+        <w:rPr>
+          <w:kern w:val="0"/>
+          <w14:ligatures w14:val="none"/>
+        </w:rPr>
+        <w:t xml:space="preserve"> avec un </w:t>
+      </w:r>
+      <w:r>
+        <w:rPr>
+          <w:kern w:val="0"/>
+          <w14:ligatures w14:val="none"/>
+        </w:rPr>
+        <w:t>Loup.</w:t>
+      </w:r>
+    </w:p>
+    <w:p>
+      <w:pPr>
+        <w:pStyle w:val="Paragraphedeliste"/>
+        <w:numPr>
+          <w:ilvl w:val="1"/>
+          <w:numId w:val="7"/>
+        </w:numPr>
+        <w:spacing w:after="120"/>
+        <w:jc w:val="both"/>
+        <w:rPr>
+          <w:kern w:val="0"/>
+          <w14:ligatures w14:val="none"/>
+        </w:rPr>
+      </w:pPr>
+      <w:r>
+        <w:rPr>
+          <w:kern w:val="0"/>
+          <w14:ligatures w14:val="none"/>
+        </w:rPr>
+        <w:t xml:space="preserve">9 cartes de </w:t>
+      </w:r>
+      <w:r>
+        <w:rPr>
+          <w:kern w:val="0"/>
+          <w14:ligatures w14:val="none"/>
+        </w:rPr>
+        <w:t>1</w:t>
+      </w:r>
+      <w:r>
+        <w:rPr>
+          <w:kern w:val="0"/>
+          <w14:ligatures w14:val="none"/>
+        </w:rPr>
+        <w:t xml:space="preserve"> point, </w:t>
+      </w:r>
+      <w:r>
+        <w:rPr>
+          <w:kern w:val="0"/>
+          <w14:ligatures w14:val="none"/>
+        </w:rPr>
+        <w:t>grise</w:t>
+      </w:r>
+      <w:r>
+        <w:rPr>
+          <w:kern w:val="0"/>
+          <w14:ligatures w14:val="none"/>
+        </w:rPr>
+        <w:t xml:space="preserve"> avec un </w:t>
+      </w:r>
+      <w:r>
+        <w:rPr>
+          <w:kern w:val="0"/>
+          <w14:ligatures w14:val="none"/>
+        </w:rPr>
+        <w:t>Cheval</w:t>
+      </w:r>
+      <w:r>
+        <w:rPr>
+          <w:kern w:val="0"/>
+          <w14:ligatures w14:val="none"/>
+        </w:rPr>
+        <w:t>.</w:t>
       </w:r>
     </w:p>
     <w:p>
@@ -1019,23 +1607,42 @@
           <w:kern w:val="0"/>
           <w14:ligatures w14:val="none"/>
         </w:rPr>
-        <w:t xml:space="preserve">37 cartes </w:t>
-      </w:r>
-      <w:r>
-        <w:rPr>
-          <w:b/>
-          <w:bCs/>
-          <w:kern w:val="0"/>
-          <w14:ligatures w14:val="none"/>
-        </w:rPr>
-        <w:t>de position</w:t>
-      </w:r>
-      <w:r>
-        <w:rPr>
-          <w:kern w:val="0"/>
-          <w14:ligatures w14:val="none"/>
-        </w:rPr>
-        <w:t>, chacune identifiable au recto par une couleur et une lettre, à la façon des tuiles.</w:t>
+        <w:t>37 cartes de position</w:t>
+      </w:r>
+      <w:r>
+        <w:rPr>
+          <w:kern w:val="0"/>
+          <w14:ligatures w14:val="none"/>
+        </w:rPr>
+        <w:t xml:space="preserve"> identifi</w:t>
+      </w:r>
+      <w:r>
+        <w:rPr>
+          <w:kern w:val="0"/>
+          <w14:ligatures w14:val="none"/>
+        </w:rPr>
+        <w:t>ées</w:t>
+      </w:r>
+      <w:r>
+        <w:rPr>
+          <w:kern w:val="0"/>
+          <w14:ligatures w14:val="none"/>
+        </w:rPr>
+        <w:t xml:space="preserve"> par couleur, lettre et symbole (</w:t>
+      </w:r>
+      <w:r>
+        <w:rPr>
+          <w:kern w:val="0"/>
+          <w14:ligatures w14:val="none"/>
+        </w:rPr>
+        <w:t>comme les</w:t>
+      </w:r>
+      <w:r>
+        <w:rPr>
+          <w:kern w:val="0"/>
+          <w14:ligatures w14:val="none"/>
+        </w:rPr>
+        <w:t xml:space="preserve"> Tuiles)</w:t>
       </w:r>
     </w:p>
     <w:p>
@@ -1060,7 +1667,7 @@
           <w:kern w:val="0"/>
           <w14:ligatures w14:val="none"/>
         </w:rPr>
-        <w:t>1</w:t>
+        <w:t>4 c</w:t>
       </w:r>
       <w:r>
         <w:rPr>
@@ -1069,7 +1676,28 @@
           <w:kern w:val="0"/>
           <w14:ligatures w14:val="none"/>
         </w:rPr>
-        <w:t xml:space="preserve"> cube ville franche</w:t>
+        <w:t xml:space="preserve">ubes de prestige : </w:t>
+      </w:r>
+      <w:r>
+        <w:rPr>
+          <w:kern w:val="0"/>
+          <w14:ligatures w14:val="none"/>
+        </w:rPr>
+        <w:t xml:space="preserve">1 cube </w:t>
+      </w:r>
+      <w:r>
+        <w:rPr>
+          <w:kern w:val="0"/>
+          <w14:ligatures w14:val="none"/>
+        </w:rPr>
+        <w:t xml:space="preserve">blanc pour la </w:t>
+      </w:r>
+      <w:r>
+        <w:rPr>
+          <w:kern w:val="0"/>
+          <w14:ligatures w14:val="none"/>
+        </w:rPr>
+        <w:t>ville franche</w:t>
       </w:r>
       <w:r>
         <w:rPr>
@@ -1077,6 +1705,68 @@
           <w14:ligatures w14:val="none"/>
         </w:rPr>
         <w:t>.</w:t>
+      </w:r>
+      <w:r>
+        <w:rPr>
+          <w:kern w:val="0"/>
+          <w14:ligatures w14:val="none"/>
+        </w:rPr>
+        <w:t xml:space="preserve">et </w:t>
+      </w:r>
+      <w:r>
+        <w:rPr>
+          <w:kern w:val="0"/>
+          <w14:ligatures w14:val="none"/>
+        </w:rPr>
+        <w:t xml:space="preserve">3 cubes </w:t>
+      </w:r>
+      <w:r>
+        <w:rPr>
+          <w:kern w:val="0"/>
+          <w14:ligatures w14:val="none"/>
+        </w:rPr>
+        <w:t xml:space="preserve">bois pour les </w:t>
+      </w:r>
+      <w:r>
+        <w:rPr>
+          <w:kern w:val="0"/>
+          <w14:ligatures w14:val="none"/>
+        </w:rPr>
+        <w:t>cités marchandes.</w:t>
+      </w:r>
+    </w:p>
+    <w:p>
+      <w:pPr>
+        <w:pStyle w:val="Paragraphedeliste"/>
+        <w:numPr>
+          <w:ilvl w:val="0"/>
+          <w:numId w:val="7"/>
+        </w:numPr>
+        <w:jc w:val="both"/>
+        <w:rPr>
+          <w:b/>
+          <w:bCs/>
+          <w:kern w:val="0"/>
+          <w14:ligatures w14:val="none"/>
+        </w:rPr>
+      </w:pPr>
+      <w:r>
+        <w:rPr>
+          <w:b/>
+          <w:bCs/>
+          <w:kern w:val="0"/>
+          <w14:ligatures w14:val="none"/>
+        </w:rPr>
+        <w:t xml:space="preserve">1 piste de </w:t>
+      </w:r>
+      <w:r>
+        <w:rPr>
+          <w:b/>
+          <w:bCs/>
+          <w:kern w:val="0"/>
+          <w14:ligatures w14:val="none"/>
+        </w:rPr>
+        <w:t>score</w:t>
       </w:r>
     </w:p>
     <w:p>
@@ -1101,67 +1791,14 @@
           <w:kern w:val="0"/>
           <w14:ligatures w14:val="none"/>
         </w:rPr>
-        <w:t>3 cubes cités marchandes</w:t>
-      </w:r>
-      <w:r>
-        <w:rPr>
-          <w:kern w:val="0"/>
-          <w14:ligatures w14:val="none"/>
-        </w:rPr>
-        <w:t>.</w:t>
-      </w:r>
-    </w:p>
-    <w:p>
-      <w:pPr>
-        <w:pStyle w:val="Paragraphedeliste"/>
-        <w:numPr>
-          <w:ilvl w:val="0"/>
-          <w:numId w:val="7"/>
-        </w:numPr>
-        <w:jc w:val="both"/>
-        <w:rPr>
-          <w:kern w:val="0"/>
-          <w14:ligatures w14:val="none"/>
-        </w:rPr>
-      </w:pPr>
-      <w:r>
-        <w:rPr>
-          <w:b/>
-          <w:bCs/>
-          <w:kern w:val="0"/>
-          <w14:ligatures w14:val="none"/>
-        </w:rPr>
-        <w:t>1 piste</w:t>
-      </w:r>
-      <w:r>
-        <w:rPr>
-          <w:kern w:val="0"/>
-          <w14:ligatures w14:val="none"/>
-        </w:rPr>
-        <w:t xml:space="preserve"> de pointage.</w:t>
-      </w:r>
-    </w:p>
-    <w:p>
-      <w:pPr>
-        <w:pStyle w:val="Paragraphedeliste"/>
-        <w:numPr>
-          <w:ilvl w:val="0"/>
-          <w:numId w:val="7"/>
-        </w:numPr>
-        <w:spacing w:after="120"/>
-        <w:ind w:left="357" w:hanging="357"/>
-        <w:jc w:val="both"/>
-        <w:rPr>
-          <w:kern w:val="0"/>
-          <w14:ligatures w14:val="none"/>
-        </w:rPr>
-      </w:pPr>
-      <w:r>
-        <w:rPr>
-          <w:kern w:val="0"/>
-          <w14:ligatures w14:val="none"/>
-        </w:rPr>
-        <w:t xml:space="preserve">Chaque joueur dispose à sa couleur : </w:t>
+        <w:t>Matériel par joueur (x4) </w:t>
+      </w:r>
+      <w:r>
+        <w:rPr>
+          <w:kern w:val="0"/>
+          <w14:ligatures w14:val="none"/>
+        </w:rPr>
+        <w:t>:</w:t>
       </w:r>
     </w:p>
     <w:p>
@@ -1180,26 +1817,42 @@
       </w:pPr>
       <w:r>
         <w:rPr>
-          <w:kern w:val="0"/>
-          <w14:ligatures w14:val="none"/>
-        </w:rPr>
-        <w:t>d’</w:t>
-      </w:r>
-      <w:r>
-        <w:rPr>
           <w:b/>
           <w:bCs/>
           <w:kern w:val="0"/>
           <w14:ligatures w14:val="none"/>
         </w:rPr>
-        <w:t>un gros pion baron</w:t>
-      </w:r>
-      <w:r>
-        <w:rPr>
-          <w:kern w:val="0"/>
-          <w14:ligatures w14:val="none"/>
-        </w:rPr>
-        <w:t xml:space="preserve">, </w:t>
+        <w:t>1</w:t>
+      </w:r>
+      <w:r>
+        <w:rPr>
+          <w:kern w:val="0"/>
+          <w14:ligatures w14:val="none"/>
+        </w:rPr>
+        <w:t xml:space="preserve"> </w:t>
+      </w:r>
+      <w:r>
+        <w:rPr>
+          <w:kern w:val="0"/>
+          <w14:ligatures w14:val="none"/>
+        </w:rPr>
+        <w:t xml:space="preserve">gros pion </w:t>
+      </w:r>
+      <w:r>
+        <w:rPr>
+          <w:b/>
+          <w:bCs/>
+          <w:kern w:val="0"/>
+          <w14:ligatures w14:val="none"/>
+        </w:rPr>
+        <w:t>baron</w:t>
+      </w:r>
+      <w:r>
+        <w:rPr>
+          <w:kern w:val="0"/>
+          <w14:ligatures w14:val="none"/>
+        </w:rPr>
+        <w:t>,</w:t>
       </w:r>
     </w:p>
     <w:p>
@@ -1218,13 +1871,6 @@
       </w:pPr>
       <w:r>
         <w:rPr>
-          <w:kern w:val="0"/>
-          <w14:ligatures w14:val="none"/>
-        </w:rPr>
-        <w:t xml:space="preserve">de </w:t>
-      </w:r>
-      <w:r>
-        <w:rPr>
           <w:b/>
           <w:bCs/>
           <w:kern w:val="0"/>
@@ -1234,19 +1880,26 @@
       </w:r>
       <w:r>
         <w:rPr>
+          <w:kern w:val="0"/>
+          <w14:ligatures w14:val="none"/>
+        </w:rPr>
+        <w:t xml:space="preserve"> petits pions </w:t>
+      </w:r>
+      <w:r>
+        <w:rPr>
           <w:b/>
           <w:bCs/>
           <w:kern w:val="0"/>
           <w14:ligatures w14:val="none"/>
         </w:rPr>
-        <w:t xml:space="preserve"> petits pions chevaliers</w:t>
-      </w:r>
-      <w:r>
-        <w:rPr>
-          <w:kern w:val="0"/>
-          <w14:ligatures w14:val="none"/>
-        </w:rPr>
-        <w:t xml:space="preserve">, </w:t>
+        <w:t>chevaliers</w:t>
+      </w:r>
+      <w:r>
+        <w:rPr>
+          <w:kern w:val="0"/>
+          <w14:ligatures w14:val="none"/>
+        </w:rPr>
+        <w:t>,</w:t>
       </w:r>
     </w:p>
     <w:p>
@@ -1265,24 +1918,31 @@
       </w:pPr>
       <w:r>
         <w:rPr>
-          <w:kern w:val="0"/>
-          <w14:ligatures w14:val="none"/>
-        </w:rPr>
-        <w:t xml:space="preserve">de </w:t>
-      </w:r>
-      <w:r>
-        <w:rPr>
           <w:b/>
           <w:bCs/>
           <w:kern w:val="0"/>
           <w14:ligatures w14:val="none"/>
         </w:rPr>
-        <w:t>30 jetons de troupes</w:t>
+        <w:t>30</w:t>
+      </w:r>
+      <w:r>
+        <w:rPr>
+          <w:kern w:val="0"/>
+          <w14:ligatures w14:val="none"/>
+        </w:rPr>
+        <w:t xml:space="preserve"> jetons de </w:t>
       </w:r>
       <w:r>
         <w:rPr>
           <w:b/>
           <w:bCs/>
+          <w:kern w:val="0"/>
+          <w14:ligatures w14:val="none"/>
+        </w:rPr>
+        <w:t>troupes</w:t>
+      </w:r>
+      <w:r>
+        <w:rPr>
           <w:kern w:val="0"/>
           <w14:ligatures w14:val="none"/>
         </w:rPr>
@@ -1305,48 +1965,58 @@
       </w:pPr>
       <w:r>
         <w:rPr>
-          <w:kern w:val="0"/>
-          <w14:ligatures w14:val="none"/>
-        </w:rPr>
-        <w:t xml:space="preserve">et de </w:t>
-      </w:r>
-      <w:r>
-        <w:rPr>
           <w:b/>
           <w:bCs/>
           <w:kern w:val="0"/>
           <w14:ligatures w14:val="none"/>
         </w:rPr>
-        <w:t>10 petits donjons cylindriques</w:t>
-      </w:r>
-      <w:r>
-        <w:rPr>
-          <w:kern w:val="0"/>
-          <w14:ligatures w14:val="none"/>
-        </w:rPr>
-        <w:t>.</w:t>
+        <w:t>10</w:t>
+      </w:r>
+      <w:r>
+        <w:rPr>
+          <w:kern w:val="0"/>
+          <w14:ligatures w14:val="none"/>
+        </w:rPr>
+        <w:t xml:space="preserve"> petits </w:t>
+      </w:r>
+      <w:r>
+        <w:rPr>
+          <w:b/>
+          <w:bCs/>
+          <w:kern w:val="0"/>
+          <w14:ligatures w14:val="none"/>
+        </w:rPr>
+        <w:t>donjons</w:t>
+      </w:r>
+      <w:r>
+        <w:rPr>
+          <w:kern w:val="0"/>
+          <w14:ligatures w14:val="none"/>
+        </w:rPr>
+        <w:t xml:space="preserve"> cylindriques</w:t>
+      </w:r>
+      <w:r>
+        <w:rPr>
+          <w:kern w:val="0"/>
+          <w14:ligatures w14:val="none"/>
+        </w:rPr>
+        <w:t>,</w:t>
       </w:r>
     </w:p>
     <w:p>
       <w:pPr>
         <w:pStyle w:val="Paragraphedeliste"/>
         <w:numPr>
-          <w:ilvl w:val="0"/>
+          <w:ilvl w:val="1"/>
           <w:numId w:val="7"/>
         </w:numPr>
+        <w:spacing w:after="120"/>
         <w:jc w:val="both"/>
         <w:rPr>
           <w:kern w:val="0"/>
           <w14:ligatures w14:val="none"/>
         </w:rPr>
       </w:pPr>
-      <w:r>
-        <w:rPr>
-          <w:kern w:val="0"/>
-          <w14:ligatures w14:val="none"/>
-        </w:rPr>
-        <w:t xml:space="preserve">Chaque joueur dispose d’un deck de </w:t>
-      </w:r>
       <w:r>
         <w:rPr>
           <w:b/>
@@ -1354,14 +2024,14 @@
           <w:kern w:val="0"/>
           <w14:ligatures w14:val="none"/>
         </w:rPr>
-        <w:t>40 cartes d’actions</w:t>
-      </w:r>
-      <w:r>
-        <w:rPr>
-          <w:kern w:val="0"/>
-          <w14:ligatures w14:val="none"/>
-        </w:rPr>
-        <w:t xml:space="preserve">, et de </w:t>
+        <w:t>1</w:t>
+      </w:r>
+      <w:r>
+        <w:rPr>
+          <w:kern w:val="0"/>
+          <w14:ligatures w14:val="none"/>
+        </w:rPr>
+        <w:t xml:space="preserve"> </w:t>
       </w:r>
       <w:r>
         <w:rPr>
@@ -1370,7 +2040,35 @@
           <w:kern w:val="0"/>
           <w14:ligatures w14:val="none"/>
         </w:rPr>
-        <w:t>3 cartes calamités</w:t>
+        <w:t>deck</w:t>
+      </w:r>
+      <w:r>
+        <w:rPr>
+          <w:kern w:val="0"/>
+          <w14:ligatures w14:val="none"/>
+        </w:rPr>
+        <w:t xml:space="preserve"> de 40 cartes d’actions</w:t>
+      </w:r>
+      <w:r>
+        <w:rPr>
+          <w:kern w:val="0"/>
+          <w14:ligatures w14:val="none"/>
+        </w:rPr>
+        <w:t xml:space="preserve"> et </w:t>
+      </w:r>
+      <w:r>
+        <w:rPr>
+          <w:kern w:val="0"/>
+          <w14:ligatures w14:val="none"/>
+        </w:rPr>
+        <w:t xml:space="preserve">3 cartes </w:t>
+      </w:r>
+      <w:r>
+        <w:rPr>
+          <w:kern w:val="0"/>
+          <w14:ligatures w14:val="none"/>
+        </w:rPr>
+        <w:t>d’événements</w:t>
       </w:r>
       <w:r>
         <w:rPr>
@@ -1470,16 +2168,7 @@
           <w:kern w:val="0"/>
           <w14:ligatures w14:val="none"/>
         </w:rPr>
-        <w:t>Le but est de gagner le plus de points</w:t>
-      </w:r>
-      <w:r>
-        <w:rPr>
-          <w:rFonts w:eastAsia="Calibri" w:cs="Times New Roman"/>
-          <w:color w:val="000000"/>
-          <w:kern w:val="0"/>
-          <w14:ligatures w14:val="none"/>
-        </w:rPr>
-        <w:t xml:space="preserve"> grâce à la construction de donjons</w:t>
+        <w:t>Le but est de gagner le plus de points grâce à la construction de donjons</w:t>
       </w:r>
       <w:r>
         <w:rPr>
@@ -1639,7 +2328,7 @@
           <w:kern w:val="0"/>
           <w14:ligatures w14:val="none"/>
         </w:rPr>
-        <w:t>, et d’autre part</w:t>
+        <w:t xml:space="preserve"> </w:t>
       </w:r>
       <w:r>
         <w:rPr>
@@ -1648,7 +2337,25 @@
           <w:kern w:val="0"/>
           <w14:ligatures w14:val="none"/>
         </w:rPr>
-        <w:t xml:space="preserve">, des </w:t>
+        <w:t xml:space="preserve">lorsqu’elles sont </w:t>
+      </w:r>
+      <w:r>
+        <w:rPr>
+          <w:rFonts w:eastAsia="Calibri" w:cs="Times New Roman"/>
+          <w:color w:val="000000"/>
+          <w:kern w:val="0"/>
+          <w14:ligatures w14:val="none"/>
+        </w:rPr>
+        <w:t>présentes sur les terres conquises</w:t>
+      </w:r>
+      <w:r>
+        <w:rPr>
+          <w:rFonts w:eastAsia="Calibri" w:cs="Times New Roman"/>
+          <w:color w:val="000000"/>
+          <w:kern w:val="0"/>
+          <w14:ligatures w14:val="none"/>
+        </w:rPr>
+        <w:t xml:space="preserve"> et d’autre part, des </w:t>
       </w:r>
       <w:r>
         <w:rPr>
@@ -1677,7 +2384,25 @@
           <w:kern w:val="0"/>
           <w14:ligatures w14:val="none"/>
         </w:rPr>
-        <w:t xml:space="preserve">associés aux </w:t>
+        <w:t>associés aux</w:t>
+      </w:r>
+      <w:r>
+        <w:rPr>
+          <w:rFonts w:eastAsia="Calibri" w:cs="Times New Roman"/>
+          <w:color w:val="000000"/>
+          <w:kern w:val="0"/>
+          <w14:ligatures w14:val="none"/>
+        </w:rPr>
+        <w:t xml:space="preserve"> nombres de</w:t>
+      </w:r>
+      <w:r>
+        <w:rPr>
+          <w:rFonts w:eastAsia="Calibri" w:cs="Times New Roman"/>
+          <w:color w:val="000000"/>
+          <w:kern w:val="0"/>
+          <w14:ligatures w14:val="none"/>
+        </w:rPr>
+        <w:t xml:space="preserve"> </w:t>
       </w:r>
       <w:r>
         <w:rPr>
@@ -1708,7 +2433,7 @@
           <w:kern w:val="0"/>
           <w14:ligatures w14:val="none"/>
         </w:rPr>
-        <w:t>. S</w:t>
+        <w:t xml:space="preserve"> </w:t>
       </w:r>
       <w:r>
         <w:rPr>
@@ -1717,7 +2442,7 @@
           <w:kern w:val="0"/>
           <w14:ligatures w14:val="none"/>
         </w:rPr>
-        <w:t>i vos donjons sont détruits</w:t>
+        <w:t>conquises</w:t>
       </w:r>
       <w:r>
         <w:rPr>
@@ -1726,7 +2451,7 @@
           <w:kern w:val="0"/>
           <w14:ligatures w14:val="none"/>
         </w:rPr>
-        <w:t>, alors les points associés sont perdus.</w:t>
+        <w:t xml:space="preserve">. </w:t>
       </w:r>
     </w:p>
     <w:tbl>
@@ -2783,6 +3508,71 @@
         <w:jc w:val="both"/>
         <w:rPr>
           <w:rFonts w:eastAsia="Calibri" w:cs="Times New Roman"/>
+          <w:color w:val="000000"/>
+          <w:kern w:val="0"/>
+          <w14:ligatures w14:val="none"/>
+        </w:rPr>
+      </w:pPr>
+      <w:r>
+        <w:rPr>
+          <w:rFonts w:eastAsia="Calibri" w:cs="Times New Roman"/>
+          <w:color w:val="000000"/>
+          <w:kern w:val="0"/>
+          <w14:ligatures w14:val="none"/>
+        </w:rPr>
+        <w:t>La piste de score permet de suivre l’avancement des points après le tour de chaque joueur. Cependant, lorsque des donjons sont détruits vous devez recompter</w:t>
+      </w:r>
+      <w:r>
+        <w:rPr>
+          <w:rFonts w:eastAsia="Calibri" w:cs="Times New Roman"/>
+          <w:color w:val="000000"/>
+          <w:kern w:val="0"/>
+          <w14:ligatures w14:val="none"/>
+        </w:rPr>
+        <w:t>, en repartant de zéro,</w:t>
+      </w:r>
+      <w:r>
+        <w:rPr>
+          <w:rFonts w:eastAsia="Calibri" w:cs="Times New Roman"/>
+          <w:color w:val="000000"/>
+          <w:kern w:val="0"/>
+          <w14:ligatures w14:val="none"/>
+        </w:rPr>
+        <w:t xml:space="preserve"> </w:t>
+      </w:r>
+      <w:r>
+        <w:rPr>
+          <w:rFonts w:eastAsia="Calibri" w:cs="Times New Roman"/>
+          <w:color w:val="000000"/>
+          <w:kern w:val="0"/>
+          <w14:ligatures w14:val="none"/>
+        </w:rPr>
+        <w:t xml:space="preserve">les points des joueurs attaqués </w:t>
+      </w:r>
+      <w:r>
+        <w:rPr>
+          <w:rFonts w:eastAsia="Calibri" w:cs="Times New Roman"/>
+          <w:color w:val="000000"/>
+          <w:kern w:val="0"/>
+          <w14:ligatures w14:val="none"/>
+        </w:rPr>
+        <w:t>d’après l’état du plateau</w:t>
+      </w:r>
+      <w:r>
+        <w:rPr>
+          <w:rFonts w:eastAsia="Calibri" w:cs="Times New Roman"/>
+          <w:color w:val="000000"/>
+          <w:kern w:val="0"/>
+          <w14:ligatures w14:val="none"/>
+        </w:rPr>
+        <w:t>.</w:t>
+      </w:r>
+    </w:p>
+    <w:p>
+      <w:pPr>
+        <w:jc w:val="both"/>
+        <w:rPr>
+          <w:rFonts w:eastAsia="Calibri" w:cs="Times New Roman"/>
           <w:color w:val="000000" w:themeColor="text1"/>
           <w:kern w:val="0"/>
           <w14:ligatures w14:val="none"/>
@@ -2831,7 +3621,7 @@
           <w:kern w:val="0"/>
           <w14:ligatures w14:val="none"/>
         </w:rPr>
-        <w:t xml:space="preserve">, à </w:t>
+        <w:t xml:space="preserve">, </w:t>
       </w:r>
       <w:r>
         <w:rPr>
@@ -2840,7 +3630,7 @@
           <w:kern w:val="0"/>
           <w14:ligatures w14:val="none"/>
         </w:rPr>
-        <w:t>la fin complète du tour d’un joueur</w:t>
+        <w:t xml:space="preserve">mais </w:t>
       </w:r>
       <w:r>
         <w:rPr>
@@ -2849,7 +3639,43 @@
           <w:kern w:val="0"/>
           <w14:ligatures w14:val="none"/>
         </w:rPr>
-        <w:t> :</w:t>
+        <w:t xml:space="preserve">toujours </w:t>
+      </w:r>
+      <w:r>
+        <w:rPr>
+          <w:rFonts w:eastAsia="Calibri" w:cs="Times New Roman"/>
+          <w:color w:val="000000" w:themeColor="text1"/>
+          <w:kern w:val="0"/>
+          <w14:ligatures w14:val="none"/>
+        </w:rPr>
+        <w:t xml:space="preserve">à la fin complète du tour </w:t>
+      </w:r>
+      <w:r>
+        <w:rPr>
+          <w:rFonts w:eastAsia="Calibri" w:cs="Times New Roman"/>
+          <w:color w:val="000000" w:themeColor="text1"/>
+          <w:kern w:val="0"/>
+          <w14:ligatures w14:val="none"/>
+        </w:rPr>
+        <w:t>du</w:t>
+      </w:r>
+      <w:r>
+        <w:rPr>
+          <w:rFonts w:eastAsia="Calibri" w:cs="Times New Roman"/>
+          <w:color w:val="000000" w:themeColor="text1"/>
+          <w:kern w:val="0"/>
+          <w14:ligatures w14:val="none"/>
+        </w:rPr>
+        <w:t xml:space="preserve"> joueur</w:t>
+      </w:r>
+      <w:r>
+        <w:rPr>
+          <w:rFonts w:eastAsia="Calibri" w:cs="Times New Roman"/>
+          <w:color w:val="000000" w:themeColor="text1"/>
+          <w:kern w:val="0"/>
+          <w14:ligatures w14:val="none"/>
+        </w:rPr>
+        <w:t xml:space="preserve"> actif, sous les conditions suivantes :</w:t>
       </w:r>
     </w:p>
     <w:p>
@@ -2874,7 +3700,25 @@
           <w:kern w:val="0"/>
           <w14:ligatures w14:val="none"/>
         </w:rPr>
-        <w:t xml:space="preserve">S’il </w:t>
+        <w:t>S</w:t>
+      </w:r>
+      <w:r>
+        <w:rPr>
+          <w:rFonts w:eastAsia="Calibri" w:cs="Times New Roman"/>
+          <w:color w:val="000000" w:themeColor="text1"/>
+          <w:kern w:val="0"/>
+          <w14:ligatures w14:val="none"/>
+        </w:rPr>
+        <w:t>i le joueur actif</w:t>
+      </w:r>
+      <w:r>
+        <w:rPr>
+          <w:rFonts w:eastAsia="Calibri" w:cs="Times New Roman"/>
+          <w:color w:val="000000" w:themeColor="text1"/>
+          <w:kern w:val="0"/>
+          <w14:ligatures w14:val="none"/>
+        </w:rPr>
+        <w:t xml:space="preserve"> </w:t>
       </w:r>
       <w:r>
         <w:rPr>
@@ -2948,16 +3792,7 @@
           <w:kern w:val="0"/>
           <w14:ligatures w14:val="none"/>
         </w:rPr>
-        <w:t xml:space="preserve"> et réserve compris</w:t>
-      </w:r>
-      <w:r>
-        <w:rPr>
-          <w:rFonts w:eastAsia="Calibri" w:cs="Times New Roman"/>
-          <w:color w:val="000000" w:themeColor="text1"/>
-          <w:kern w:val="0"/>
-          <w14:ligatures w14:val="none"/>
-        </w:rPr>
-        <w:t> ; c’est la fin par « </w:t>
+        <w:t xml:space="preserve"> et réserve compris ; c’est la fin par « </w:t>
       </w:r>
       <w:r>
         <w:rPr>
@@ -2978,6 +3813,35 @@
           <w14:ligatures w14:val="none"/>
         </w:rPr>
         <w:t> ».</w:t>
+      </w:r>
+      <w:r>
+        <w:rPr>
+          <w:rFonts w:eastAsia="Calibri" w:cs="Times New Roman"/>
+          <w:color w:val="000000" w:themeColor="text1"/>
+          <w:kern w:val="0"/>
+          <w14:ligatures w14:val="none"/>
+        </w:rPr>
+        <w:t xml:space="preserve"> </w:t>
+      </w:r>
+      <w:r>
+        <w:rPr>
+          <w:rFonts w:eastAsia="Calibri" w:cs="Times New Roman"/>
+          <w:i/>
+          <w:iCs/>
+          <w:color w:val="0070C0"/>
+          <w:kern w:val="0"/>
+          <w14:ligatures w14:val="none"/>
+        </w:rPr>
+        <w:t>Le sang a trop coulé et les hérauts sonnent la fin des combats</w:t>
+      </w:r>
+      <w:r>
+        <w:rPr>
+          <w:rFonts w:eastAsia="Calibri" w:cs="Times New Roman"/>
+          <w:color w:val="000000" w:themeColor="text1"/>
+          <w:kern w:val="0"/>
+          <w14:ligatures w14:val="none"/>
+        </w:rPr>
+        <w:t>.</w:t>
       </w:r>
     </w:p>
     <w:p>
@@ -3002,7 +3866,43 @@
           <w:kern w:val="0"/>
           <w14:ligatures w14:val="none"/>
         </w:rPr>
-        <w:t xml:space="preserve">S’il a atteint ou dépassé un </w:t>
+        <w:t>S</w:t>
+      </w:r>
+      <w:r>
+        <w:rPr>
+          <w:rFonts w:eastAsia="Calibri" w:cs="Times New Roman"/>
+          <w:color w:val="000000" w:themeColor="text1"/>
+          <w:kern w:val="0"/>
+          <w14:ligatures w14:val="none"/>
+        </w:rPr>
+        <w:t>i le joueur actif</w:t>
+      </w:r>
+      <w:r>
+        <w:rPr>
+          <w:rFonts w:eastAsia="Calibri" w:cs="Times New Roman"/>
+          <w:color w:val="000000" w:themeColor="text1"/>
+          <w:kern w:val="0"/>
+          <w14:ligatures w14:val="none"/>
+        </w:rPr>
+        <w:t xml:space="preserve"> a atteint ou dépassé </w:t>
+      </w:r>
+      <w:r>
+        <w:rPr>
+          <w:rFonts w:eastAsia="Calibri" w:cs="Times New Roman"/>
+          <w:color w:val="000000" w:themeColor="text1"/>
+          <w:kern w:val="0"/>
+          <w14:ligatures w14:val="none"/>
+        </w:rPr>
+        <w:t>le</w:t>
+      </w:r>
+      <w:r>
+        <w:rPr>
+          <w:rFonts w:eastAsia="Calibri" w:cs="Times New Roman"/>
+          <w:color w:val="000000" w:themeColor="text1"/>
+          <w:kern w:val="0"/>
+          <w14:ligatures w14:val="none"/>
+        </w:rPr>
+        <w:t xml:space="preserve"> </w:t>
       </w:r>
       <w:r>
         <w:rPr>
@@ -3031,7 +3931,34 @@
           <w:kern w:val="0"/>
           <w14:ligatures w14:val="none"/>
         </w:rPr>
-        <w:t>; c’est la fin par « </w:t>
+        <w:t>(</w:t>
+      </w:r>
+      <w:r>
+        <w:rPr>
+          <w:rFonts w:eastAsia="Calibri" w:cs="Times New Roman"/>
+          <w:color w:val="000000" w:themeColor="text1"/>
+          <w:kern w:val="0"/>
+          <w14:ligatures w14:val="none"/>
+        </w:rPr>
+        <w:t>qui dépend</w:t>
+      </w:r>
+      <w:r>
+        <w:rPr>
+          <w:rFonts w:eastAsia="Calibri" w:cs="Times New Roman"/>
+          <w:color w:val="000000" w:themeColor="text1"/>
+          <w:kern w:val="0"/>
+          <w14:ligatures w14:val="none"/>
+        </w:rPr>
+        <w:t xml:space="preserve"> du nombre de joueurs) ;</w:t>
+      </w:r>
+      <w:r>
+        <w:rPr>
+          <w:rFonts w:eastAsia="Calibri" w:cs="Times New Roman"/>
+          <w:color w:val="000000" w:themeColor="text1"/>
+          <w:kern w:val="0"/>
+          <w14:ligatures w14:val="none"/>
+        </w:rPr>
+        <w:t xml:space="preserve"> c’est la fin par « </w:t>
       </w:r>
       <w:r>
         <w:rPr>
@@ -3054,6 +3981,35 @@
           <w14:ligatures w14:val="none"/>
         </w:rPr>
         <w:t>suprématie</w:t>
+      </w:r>
+      <w:r>
+        <w:rPr>
+          <w:rFonts w:eastAsia="Calibri" w:cs="Times New Roman"/>
+          <w:color w:val="000000" w:themeColor="text1"/>
+          <w:kern w:val="0"/>
+          <w14:ligatures w14:val="none"/>
+        </w:rPr>
+        <w:t>.</w:t>
+      </w:r>
+      <w:r>
+        <w:rPr>
+          <w:rFonts w:eastAsia="Calibri" w:cs="Times New Roman"/>
+          <w:color w:val="000000" w:themeColor="text1"/>
+          <w:kern w:val="0"/>
+          <w14:ligatures w14:val="none"/>
+        </w:rPr>
+        <w:t xml:space="preserve"> </w:t>
+      </w:r>
+      <w:r>
+        <w:rPr>
+          <w:rFonts w:eastAsia="Calibri" w:cs="Times New Roman"/>
+          <w:i/>
+          <w:iCs/>
+          <w:color w:val="0070C0"/>
+          <w:kern w:val="0"/>
+          <w14:ligatures w14:val="none"/>
+        </w:rPr>
+        <w:t>Son influence est devenue telle que ses rivaux n'ont d'autre choix que de ployer le genou</w:t>
       </w:r>
       <w:r>
         <w:rPr>
@@ -3137,25 +4093,7 @@
                 <w:kern w:val="0"/>
                 <w14:ligatures w14:val="none"/>
               </w:rPr>
-              <w:t xml:space="preserve">Partie à </w:t>
-            </w:r>
-            <w:r>
-              <w:rPr>
-                <w:rFonts w:eastAsia="Calibri" w:cs="Times New Roman"/>
-                <w:color w:val="000000" w:themeColor="text1"/>
-                <w:kern w:val="0"/>
-                <w14:ligatures w14:val="none"/>
-              </w:rPr>
-              <w:t>2</w:t>
-            </w:r>
-            <w:r>
-              <w:rPr>
-                <w:rFonts w:eastAsia="Calibri" w:cs="Times New Roman"/>
-                <w:color w:val="000000" w:themeColor="text1"/>
-                <w:kern w:val="0"/>
-                <w14:ligatures w14:val="none"/>
-              </w:rPr>
-              <w:t xml:space="preserve"> joueurs</w:t>
+              <w:t>Partie à 2 joueurs</w:t>
             </w:r>
           </w:p>
         </w:tc>
@@ -3210,25 +4148,7 @@
                 <w:kern w:val="0"/>
                 <w14:ligatures w14:val="none"/>
               </w:rPr>
-              <w:t xml:space="preserve">Partie à </w:t>
-            </w:r>
-            <w:r>
-              <w:rPr>
-                <w:rFonts w:eastAsia="Calibri" w:cs="Times New Roman"/>
-                <w:color w:val="000000" w:themeColor="text1"/>
-                <w:kern w:val="0"/>
-                <w14:ligatures w14:val="none"/>
-              </w:rPr>
-              <w:t>3</w:t>
-            </w:r>
-            <w:r>
-              <w:rPr>
-                <w:rFonts w:eastAsia="Calibri" w:cs="Times New Roman"/>
-                <w:color w:val="000000" w:themeColor="text1"/>
-                <w:kern w:val="0"/>
-                <w14:ligatures w14:val="none"/>
-              </w:rPr>
-              <w:t xml:space="preserve"> joueurs</w:t>
+              <w:t>Partie à 3 joueurs</w:t>
             </w:r>
           </w:p>
         </w:tc>
@@ -3432,7 +4352,7 @@
           <w:kern w:val="0"/>
           <w14:ligatures w14:val="none"/>
         </w:rPr>
-        <w:t xml:space="preserve">totaux de </w:t>
+        <w:t>scores d</w:t>
       </w:r>
       <w:r>
         <w:rPr>
@@ -3441,7 +4361,7 @@
           <w:kern w:val="0"/>
           <w14:ligatures w14:val="none"/>
         </w:rPr>
-        <w:t>points. Le cas échéant, les joueurs sont départagés</w:t>
+        <w:t xml:space="preserve">e </w:t>
       </w:r>
       <w:r>
         <w:rPr>
@@ -3450,6 +4370,51 @@
           <w:kern w:val="0"/>
           <w14:ligatures w14:val="none"/>
         </w:rPr>
+        <w:t>points</w:t>
+      </w:r>
+      <w:r>
+        <w:rPr>
+          <w:rFonts w:eastAsia="Calibri" w:cs="Times New Roman"/>
+          <w:color w:val="000000"/>
+          <w:kern w:val="0"/>
+          <w14:ligatures w14:val="none"/>
+        </w:rPr>
+        <w:t> :</w:t>
+      </w:r>
+      <w:r>
+        <w:rPr>
+          <w:rFonts w:eastAsia="Calibri" w:cs="Times New Roman"/>
+          <w:color w:val="000000"/>
+          <w:kern w:val="0"/>
+          <w14:ligatures w14:val="none"/>
+        </w:rPr>
+        <w:t xml:space="preserve"> </w:t>
+      </w:r>
+      <w:r>
+        <w:rPr>
+          <w:rFonts w:eastAsia="Calibri" w:cs="Times New Roman"/>
+          <w:color w:val="000000"/>
+          <w:kern w:val="0"/>
+          <w14:ligatures w14:val="none"/>
+        </w:rPr>
+        <w:t>points de tuiles + points de prestige + points de diversité</w:t>
+      </w:r>
+      <w:r>
+        <w:rPr>
+          <w:rFonts w:eastAsia="Calibri" w:cs="Times New Roman"/>
+          <w:color w:val="000000"/>
+          <w:kern w:val="0"/>
+          <w14:ligatures w14:val="none"/>
+        </w:rPr>
+        <w:t>. Le cas échéant, les joueurs sont départagés</w:t>
+      </w:r>
+      <w:r>
+        <w:rPr>
+          <w:rFonts w:eastAsia="Calibri" w:cs="Times New Roman"/>
+          <w:color w:val="000000"/>
+          <w:kern w:val="0"/>
+          <w14:ligatures w14:val="none"/>
+        </w:rPr>
         <w:t>,</w:t>
       </w:r>
       <w:r>
@@ -3460,6 +4425,15 @@
           <w14:ligatures w14:val="none"/>
         </w:rPr>
         <w:t xml:space="preserve"> d’abord par leurs nombres de donjons, puis par leurs troupes disponibles.</w:t>
+      </w:r>
+      <w:r>
+        <w:rPr>
+          <w:rFonts w:eastAsia="Calibri" w:cs="Times New Roman"/>
+          <w:color w:val="000000"/>
+          <w:kern w:val="0"/>
+          <w14:ligatures w14:val="none"/>
+        </w:rPr>
+        <w:t xml:space="preserve"> Si l’égalité persiste, la victoire est partagée !</w:t>
       </w:r>
     </w:p>
     <w:tbl>
@@ -3508,6 +4482,13 @@
               </w:rPr>
               <w:t>Exemples de conquête</w:t>
             </w:r>
+            <w:r>
+              <w:rPr>
+                <w:b/>
+                <w:bCs/>
+              </w:rPr>
+              <w:t>s</w:t>
+            </w:r>
           </w:p>
         </w:tc>
         <w:tc>
@@ -3530,7 +4511,14 @@
                 <w:b/>
                 <w:bCs/>
               </w:rPr>
-              <w:t>Points</w:t>
+              <w:t>Décompte des p</w:t>
+            </w:r>
+            <w:r>
+              <w:rPr>
+                <w:b/>
+                <w:bCs/>
+              </w:rPr>
+              <w:t>oints</w:t>
             </w:r>
           </w:p>
         </w:tc>
@@ -4341,7 +5329,7 @@
               <mc:AlternateContent>
                 <mc:Choice Requires="wpc">
                   <w:drawing>
-                    <wp:inline distT="0" distB="0" distL="0" distR="0" wp14:anchorId="0FE55E30" wp14:editId="6D5B0D89">
+                    <wp:inline distT="0" distB="0" distL="0" distR="0" wp14:anchorId="0FE55E30" wp14:editId="0FB36898">
                       <wp:extent cx="2893925" cy="423545"/>
                       <wp:effectExtent l="0" t="0" r="1905" b="0"/>
                       <wp:docPr id="1579563792" name="Zone de dessin 5"/>
@@ -5014,7 +6002,6 @@
         <w:rPr>
           <w:rFonts w:ascii="Calibri" w:hAnsi="Calibri" w:cs="Calibri"/>
         </w:rPr>
-        <w:lastRenderedPageBreak/>
         <w:t>Les 5 actions de base :</w:t>
       </w:r>
     </w:p>
@@ -5049,6 +6036,7 @@
         <w:rPr>
           <w:rFonts w:ascii="Calibri" w:hAnsi="Calibri" w:cs="Calibri"/>
         </w:rPr>
+        <w:lastRenderedPageBreak/>
         <w:t>Recruter Troupes</w:t>
       </w:r>
     </w:p>
@@ -5301,7 +6289,7 @@
     </w:p>
     <w:sectPr>
       <w:pgSz w:w="11906" w:h="16838"/>
-      <w:pgMar w:top="1417" w:right="1417" w:bottom="1417" w:left="1417" w:header="708" w:footer="708" w:gutter="0"/>
+      <w:pgMar w:top="720" w:right="720" w:bottom="720" w:left="720" w:header="708" w:footer="708" w:gutter="0"/>
       <w:cols w:space="708"/>
       <w:docGrid w:linePitch="360"/>
     </w:sectPr>
@@ -5322,9 +6310,9 @@
       <w:lvlJc w:val="left"/>
       <w:pPr>
         <w:tabs>
-          <w:tab w:val="num" w:pos="720"/>
+          <w:tab w:val="num" w:pos="6107"/>
         </w:tabs>
-        <w:ind w:left="720" w:hanging="360"/>
+        <w:ind w:left="6107" w:hanging="360"/>
       </w:pPr>
     </w:lvl>
     <w:lvl w:ilvl="1" w:tentative="1">
@@ -5334,9 +6322,9 @@
       <w:lvlJc w:val="left"/>
       <w:pPr>
         <w:tabs>
-          <w:tab w:val="num" w:pos="1440"/>
+          <w:tab w:val="num" w:pos="6827"/>
         </w:tabs>
-        <w:ind w:left="1440" w:hanging="360"/>
+        <w:ind w:left="6827" w:hanging="360"/>
       </w:pPr>
     </w:lvl>
     <w:lvl w:ilvl="2" w:tentative="1">
@@ -5346,9 +6334,9 @@
       <w:lvlJc w:val="left"/>
       <w:pPr>
         <w:tabs>
-          <w:tab w:val="num" w:pos="2160"/>
+          <w:tab w:val="num" w:pos="7547"/>
         </w:tabs>
-        <w:ind w:left="2160" w:hanging="360"/>
+        <w:ind w:left="7547" w:hanging="360"/>
       </w:pPr>
     </w:lvl>
     <w:lvl w:ilvl="3" w:tentative="1">
@@ -5358,9 +6346,9 @@
       <w:lvlJc w:val="left"/>
       <w:pPr>
         <w:tabs>
-          <w:tab w:val="num" w:pos="2880"/>
+          <w:tab w:val="num" w:pos="8267"/>
         </w:tabs>
-        <w:ind w:left="2880" w:hanging="360"/>
+        <w:ind w:left="8267" w:hanging="360"/>
       </w:pPr>
     </w:lvl>
     <w:lvl w:ilvl="4" w:tentative="1">
@@ -5370,9 +6358,9 @@
       <w:lvlJc w:val="left"/>
       <w:pPr>
         <w:tabs>
-          <w:tab w:val="num" w:pos="3600"/>
+          <w:tab w:val="num" w:pos="8987"/>
         </w:tabs>
-        <w:ind w:left="3600" w:hanging="360"/>
+        <w:ind w:left="8987" w:hanging="360"/>
       </w:pPr>
     </w:lvl>
     <w:lvl w:ilvl="5" w:tentative="1">
@@ -5382,9 +6370,9 @@
       <w:lvlJc w:val="left"/>
       <w:pPr>
         <w:tabs>
-          <w:tab w:val="num" w:pos="4320"/>
+          <w:tab w:val="num" w:pos="9707"/>
         </w:tabs>
-        <w:ind w:left="4320" w:hanging="360"/>
+        <w:ind w:left="9707" w:hanging="360"/>
       </w:pPr>
     </w:lvl>
     <w:lvl w:ilvl="6" w:tentative="1">
@@ -5394,9 +6382,9 @@
       <w:lvlJc w:val="left"/>
       <w:pPr>
         <w:tabs>
-          <w:tab w:val="num" w:pos="5040"/>
+          <w:tab w:val="num" w:pos="10427"/>
         </w:tabs>
-        <w:ind w:left="5040" w:hanging="360"/>
+        <w:ind w:left="10427" w:hanging="360"/>
       </w:pPr>
     </w:lvl>
     <w:lvl w:ilvl="7" w:tentative="1">
@@ -5406,9 +6394,9 @@
       <w:lvlJc w:val="left"/>
       <w:pPr>
         <w:tabs>
-          <w:tab w:val="num" w:pos="5760"/>
+          <w:tab w:val="num" w:pos="11147"/>
         </w:tabs>
-        <w:ind w:left="5760" w:hanging="360"/>
+        <w:ind w:left="11147" w:hanging="360"/>
       </w:pPr>
     </w:lvl>
     <w:lvl w:ilvl="8" w:tentative="1">
@@ -5418,9 +6406,9 @@
       <w:lvlJc w:val="left"/>
       <w:pPr>
         <w:tabs>
-          <w:tab w:val="num" w:pos="6480"/>
+          <w:tab w:val="num" w:pos="11867"/>
         </w:tabs>
-        <w:ind w:left="6480" w:hanging="360"/>
+        <w:ind w:left="11867" w:hanging="360"/>
       </w:pPr>
     </w:lvl>
   </w:abstractNum>
@@ -5772,6 +6760,155 @@
     </w:lvl>
   </w:abstractNum>
   <w:abstractNum w:abstractNumId="4" w15:restartNumberingAfterBreak="0">
+    <w:nsid w:val="2349535E"/>
+    <w:multiLevelType w:val="multilevel"/>
+    <w:tmpl w:val="0602B34A"/>
+    <w:lvl w:ilvl="0">
+      <w:start w:val="1"/>
+      <w:numFmt w:val="bullet"/>
+      <w:lvlText w:val=""/>
+      <w:lvlJc w:val="left"/>
+      <w:pPr>
+        <w:tabs>
+          <w:tab w:val="num" w:pos="720"/>
+        </w:tabs>
+        <w:ind w:left="720" w:hanging="360"/>
+      </w:pPr>
+      <w:rPr>
+        <w:rFonts w:ascii="Symbol" w:hAnsi="Symbol" w:hint="default"/>
+        <w:sz w:val="20"/>
+      </w:rPr>
+    </w:lvl>
+    <w:lvl w:ilvl="1" w:tentative="1">
+      <w:start w:val="1"/>
+      <w:numFmt w:val="bullet"/>
+      <w:lvlText w:val="o"/>
+      <w:lvlJc w:val="left"/>
+      <w:pPr>
+        <w:tabs>
+          <w:tab w:val="num" w:pos="1440"/>
+        </w:tabs>
+        <w:ind w:left="1440" w:hanging="360"/>
+      </w:pPr>
+      <w:rPr>
+        <w:rFonts w:ascii="Courier New" w:hAnsi="Courier New" w:hint="default"/>
+        <w:sz w:val="20"/>
+      </w:rPr>
+    </w:lvl>
+    <w:lvl w:ilvl="2" w:tentative="1">
+      <w:start w:val="1"/>
+      <w:numFmt w:val="bullet"/>
+      <w:lvlText w:val=""/>
+      <w:lvlJc w:val="left"/>
+      <w:pPr>
+        <w:tabs>
+          <w:tab w:val="num" w:pos="2160"/>
+        </w:tabs>
+        <w:ind w:left="2160" w:hanging="360"/>
+      </w:pPr>
+      <w:rPr>
+        <w:rFonts w:ascii="Wingdings" w:hAnsi="Wingdings" w:hint="default"/>
+        <w:sz w:val="20"/>
+      </w:rPr>
+    </w:lvl>
+    <w:lvl w:ilvl="3" w:tentative="1">
+      <w:start w:val="1"/>
+      <w:numFmt w:val="bullet"/>
+      <w:lvlText w:val=""/>
+      <w:lvlJc w:val="left"/>
+      <w:pPr>
+        <w:tabs>
+          <w:tab w:val="num" w:pos="2880"/>
+        </w:tabs>
+        <w:ind w:left="2880" w:hanging="360"/>
+      </w:pPr>
+      <w:rPr>
+        <w:rFonts w:ascii="Wingdings" w:hAnsi="Wingdings" w:hint="default"/>
+        <w:sz w:val="20"/>
+      </w:rPr>
+    </w:lvl>
+    <w:lvl w:ilvl="4" w:tentative="1">
+      <w:start w:val="1"/>
+      <w:numFmt w:val="bullet"/>
+      <w:lvlText w:val=""/>
+      <w:lvlJc w:val="left"/>
+      <w:pPr>
+        <w:tabs>
+          <w:tab w:val="num" w:pos="3600"/>
+        </w:tabs>
+        <w:ind w:left="3600" w:hanging="360"/>
+      </w:pPr>
+      <w:rPr>
+        <w:rFonts w:ascii="Wingdings" w:hAnsi="Wingdings" w:hint="default"/>
+        <w:sz w:val="20"/>
+      </w:rPr>
+    </w:lvl>
+    <w:lvl w:ilvl="5" w:tentative="1">
+      <w:start w:val="1"/>
+      <w:numFmt w:val="bullet"/>
+      <w:lvlText w:val=""/>
+      <w:lvlJc w:val="left"/>
+      <w:pPr>
+        <w:tabs>
+          <w:tab w:val="num" w:pos="4320"/>
+        </w:tabs>
+        <w:ind w:left="4320" w:hanging="360"/>
+      </w:pPr>
+      <w:rPr>
+        <w:rFonts w:ascii="Wingdings" w:hAnsi="Wingdings" w:hint="default"/>
+        <w:sz w:val="20"/>
+      </w:rPr>
+    </w:lvl>
+    <w:lvl w:ilvl="6" w:tentative="1">
+      <w:start w:val="1"/>
+      <w:numFmt w:val="bullet"/>
+      <w:lvlText w:val=""/>
+      <w:lvlJc w:val="left"/>
+      <w:pPr>
+        <w:tabs>
+          <w:tab w:val="num" w:pos="5040"/>
+        </w:tabs>
+        <w:ind w:left="5040" w:hanging="360"/>
+      </w:pPr>
+      <w:rPr>
+        <w:rFonts w:ascii="Wingdings" w:hAnsi="Wingdings" w:hint="default"/>
+        <w:sz w:val="20"/>
+      </w:rPr>
+    </w:lvl>
+    <w:lvl w:ilvl="7" w:tentative="1">
+      <w:start w:val="1"/>
+      <w:numFmt w:val="bullet"/>
+      <w:lvlText w:val=""/>
+      <w:lvlJc w:val="left"/>
+      <w:pPr>
+        <w:tabs>
+          <w:tab w:val="num" w:pos="5760"/>
+        </w:tabs>
+        <w:ind w:left="5760" w:hanging="360"/>
+      </w:pPr>
+      <w:rPr>
+        <w:rFonts w:ascii="Wingdings" w:hAnsi="Wingdings" w:hint="default"/>
+        <w:sz w:val="20"/>
+      </w:rPr>
+    </w:lvl>
+    <w:lvl w:ilvl="8" w:tentative="1">
+      <w:start w:val="1"/>
+      <w:numFmt w:val="bullet"/>
+      <w:lvlText w:val=""/>
+      <w:lvlJc w:val="left"/>
+      <w:pPr>
+        <w:tabs>
+          <w:tab w:val="num" w:pos="6480"/>
+        </w:tabs>
+        <w:ind w:left="6480" w:hanging="360"/>
+      </w:pPr>
+      <w:rPr>
+        <w:rFonts w:ascii="Wingdings" w:hAnsi="Wingdings" w:hint="default"/>
+        <w:sz w:val="20"/>
+      </w:rPr>
+    </w:lvl>
+  </w:abstractNum>
+  <w:abstractNum w:abstractNumId="5" w15:restartNumberingAfterBreak="0">
     <w:nsid w:val="285D451A"/>
     <w:multiLevelType w:val="multilevel"/>
     <w:tmpl w:val="76F0575E"/>
@@ -5920,7 +7057,156 @@
       </w:rPr>
     </w:lvl>
   </w:abstractNum>
-  <w:abstractNum w:abstractNumId="5" w15:restartNumberingAfterBreak="0">
+  <w:abstractNum w:abstractNumId="6" w15:restartNumberingAfterBreak="0">
+    <w:nsid w:val="2F1C0F73"/>
+    <w:multiLevelType w:val="multilevel"/>
+    <w:tmpl w:val="D50EF206"/>
+    <w:lvl w:ilvl="0">
+      <w:start w:val="1"/>
+      <w:numFmt w:val="bullet"/>
+      <w:lvlText w:val=""/>
+      <w:lvlJc w:val="left"/>
+      <w:pPr>
+        <w:tabs>
+          <w:tab w:val="num" w:pos="720"/>
+        </w:tabs>
+        <w:ind w:left="720" w:hanging="360"/>
+      </w:pPr>
+      <w:rPr>
+        <w:rFonts w:ascii="Symbol" w:hAnsi="Symbol" w:hint="default"/>
+        <w:sz w:val="20"/>
+      </w:rPr>
+    </w:lvl>
+    <w:lvl w:ilvl="1" w:tentative="1">
+      <w:start w:val="1"/>
+      <w:numFmt w:val="bullet"/>
+      <w:lvlText w:val="o"/>
+      <w:lvlJc w:val="left"/>
+      <w:pPr>
+        <w:tabs>
+          <w:tab w:val="num" w:pos="1440"/>
+        </w:tabs>
+        <w:ind w:left="1440" w:hanging="360"/>
+      </w:pPr>
+      <w:rPr>
+        <w:rFonts w:ascii="Courier New" w:hAnsi="Courier New" w:hint="default"/>
+        <w:sz w:val="20"/>
+      </w:rPr>
+    </w:lvl>
+    <w:lvl w:ilvl="2" w:tentative="1">
+      <w:start w:val="1"/>
+      <w:numFmt w:val="bullet"/>
+      <w:lvlText w:val=""/>
+      <w:lvlJc w:val="left"/>
+      <w:pPr>
+        <w:tabs>
+          <w:tab w:val="num" w:pos="2160"/>
+        </w:tabs>
+        <w:ind w:left="2160" w:hanging="360"/>
+      </w:pPr>
+      <w:rPr>
+        <w:rFonts w:ascii="Wingdings" w:hAnsi="Wingdings" w:hint="default"/>
+        <w:sz w:val="20"/>
+      </w:rPr>
+    </w:lvl>
+    <w:lvl w:ilvl="3" w:tentative="1">
+      <w:start w:val="1"/>
+      <w:numFmt w:val="bullet"/>
+      <w:lvlText w:val=""/>
+      <w:lvlJc w:val="left"/>
+      <w:pPr>
+        <w:tabs>
+          <w:tab w:val="num" w:pos="2880"/>
+        </w:tabs>
+        <w:ind w:left="2880" w:hanging="360"/>
+      </w:pPr>
+      <w:rPr>
+        <w:rFonts w:ascii="Wingdings" w:hAnsi="Wingdings" w:hint="default"/>
+        <w:sz w:val="20"/>
+      </w:rPr>
+    </w:lvl>
+    <w:lvl w:ilvl="4" w:tentative="1">
+      <w:start w:val="1"/>
+      <w:numFmt w:val="bullet"/>
+      <w:lvlText w:val=""/>
+      <w:lvlJc w:val="left"/>
+      <w:pPr>
+        <w:tabs>
+          <w:tab w:val="num" w:pos="3600"/>
+        </w:tabs>
+        <w:ind w:left="3600" w:hanging="360"/>
+      </w:pPr>
+      <w:rPr>
+        <w:rFonts w:ascii="Wingdings" w:hAnsi="Wingdings" w:hint="default"/>
+        <w:sz w:val="20"/>
+      </w:rPr>
+    </w:lvl>
+    <w:lvl w:ilvl="5" w:tentative="1">
+      <w:start w:val="1"/>
+      <w:numFmt w:val="bullet"/>
+      <w:lvlText w:val=""/>
+      <w:lvlJc w:val="left"/>
+      <w:pPr>
+        <w:tabs>
+          <w:tab w:val="num" w:pos="4320"/>
+        </w:tabs>
+        <w:ind w:left="4320" w:hanging="360"/>
+      </w:pPr>
+      <w:rPr>
+        <w:rFonts w:ascii="Wingdings" w:hAnsi="Wingdings" w:hint="default"/>
+        <w:sz w:val="20"/>
+      </w:rPr>
+    </w:lvl>
+    <w:lvl w:ilvl="6" w:tentative="1">
+      <w:start w:val="1"/>
+      <w:numFmt w:val="bullet"/>
+      <w:lvlText w:val=""/>
+      <w:lvlJc w:val="left"/>
+      <w:pPr>
+        <w:tabs>
+          <w:tab w:val="num" w:pos="5040"/>
+        </w:tabs>
+        <w:ind w:left="5040" w:hanging="360"/>
+      </w:pPr>
+      <w:rPr>
+        <w:rFonts w:ascii="Wingdings" w:hAnsi="Wingdings" w:hint="default"/>
+        <w:sz w:val="20"/>
+      </w:rPr>
+    </w:lvl>
+    <w:lvl w:ilvl="7" w:tentative="1">
+      <w:start w:val="1"/>
+      <w:numFmt w:val="bullet"/>
+      <w:lvlText w:val=""/>
+      <w:lvlJc w:val="left"/>
+      <w:pPr>
+        <w:tabs>
+          <w:tab w:val="num" w:pos="5760"/>
+        </w:tabs>
+        <w:ind w:left="5760" w:hanging="360"/>
+      </w:pPr>
+      <w:rPr>
+        <w:rFonts w:ascii="Wingdings" w:hAnsi="Wingdings" w:hint="default"/>
+        <w:sz w:val="20"/>
+      </w:rPr>
+    </w:lvl>
+    <w:lvl w:ilvl="8" w:tentative="1">
+      <w:start w:val="1"/>
+      <w:numFmt w:val="bullet"/>
+      <w:lvlText w:val=""/>
+      <w:lvlJc w:val="left"/>
+      <w:pPr>
+        <w:tabs>
+          <w:tab w:val="num" w:pos="6480"/>
+        </w:tabs>
+        <w:ind w:left="6480" w:hanging="360"/>
+      </w:pPr>
+      <w:rPr>
+        <w:rFonts w:ascii="Wingdings" w:hAnsi="Wingdings" w:hint="default"/>
+        <w:sz w:val="20"/>
+      </w:rPr>
+    </w:lvl>
+  </w:abstractNum>
+  <w:abstractNum w:abstractNumId="7" w15:restartNumberingAfterBreak="0">
     <w:nsid w:val="452C626F"/>
     <w:multiLevelType w:val="multilevel"/>
     <w:tmpl w:val="040C001F"/>
@@ -6006,7 +7292,7 @@
       </w:pPr>
     </w:lvl>
   </w:abstractNum>
-  <w:abstractNum w:abstractNumId="6" w15:restartNumberingAfterBreak="0">
+  <w:abstractNum w:abstractNumId="8" w15:restartNumberingAfterBreak="0">
     <w:nsid w:val="5E1F161D"/>
     <w:multiLevelType w:val="multilevel"/>
     <w:tmpl w:val="3C20F2B4"/>
@@ -6155,7 +7441,7 @@
       </w:rPr>
     </w:lvl>
   </w:abstractNum>
-  <w:abstractNum w:abstractNumId="7" w15:restartNumberingAfterBreak="0">
+  <w:abstractNum w:abstractNumId="9" w15:restartNumberingAfterBreak="0">
     <w:nsid w:val="622D247A"/>
     <w:multiLevelType w:val="hybridMultilevel"/>
     <w:tmpl w:val="4580A9DC"/>
@@ -6271,16 +7557,16 @@
     <w:abstractNumId w:val="0"/>
   </w:num>
   <w:num w:numId="2" w16cid:durableId="166755653">
-    <w:abstractNumId w:val="4"/>
+    <w:abstractNumId w:val="5"/>
   </w:num>
   <w:num w:numId="3" w16cid:durableId="937561053">
     <w:abstractNumId w:val="2"/>
   </w:num>
   <w:num w:numId="4" w16cid:durableId="1242374993">
-    <w:abstractNumId w:val="6"/>
+    <w:abstractNumId w:val="8"/>
   </w:num>
   <w:num w:numId="5" w16cid:durableId="1906912870">
-    <w:abstractNumId w:val="5"/>
+    <w:abstractNumId w:val="7"/>
   </w:num>
   <w:num w:numId="6" w16cid:durableId="1541934210">
     <w:abstractNumId w:val="1"/>
@@ -6289,7 +7575,13 @@
     <w:abstractNumId w:val="3"/>
   </w:num>
   <w:num w:numId="8" w16cid:durableId="1944877213">
-    <w:abstractNumId w:val="7"/>
+    <w:abstractNumId w:val="9"/>
+  </w:num>
+  <w:num w:numId="9" w16cid:durableId="1573737688">
+    <w:abstractNumId w:val="4"/>
+  </w:num>
+  <w:num w:numId="10" w16cid:durableId="985817592">
+    <w:abstractNumId w:val="6"/>
   </w:num>
 </w:numbering>
 </file>

</xml_diff>

<commit_message>
Encore des améliorations jusqu'au but compris
</commit_message>
<xml_diff>
--- a/Nouvel-exposé-des-règles.docx
+++ b/Nouvel-exposé-des-règles.docx
@@ -252,6 +252,7 @@
       <w:bookmarkEnd w:id="1"/>
       <w:bookmarkEnd w:id="2"/>
     </w:p>
+    <w:p/>
     <w:tbl>
       <w:tblPr>
         <w:tblStyle w:val="Grilledutableau"/>
@@ -263,7 +264,9 @@
         <w:gridCol w:w="1955"/>
         <w:gridCol w:w="1447"/>
         <w:gridCol w:w="222"/>
+        <w:gridCol w:w="222"/>
         <w:gridCol w:w="1110"/>
+        <w:gridCol w:w="222"/>
         <w:gridCol w:w="222"/>
         <w:gridCol w:w="2575"/>
       </w:tblGrid>
@@ -278,7 +281,7 @@
           </w:tcPr>
           <w:p>
             <w:pPr>
-              <w:jc w:val="right"/>
+              <w:jc w:val="center"/>
               <w:rPr>
                 <w:rFonts w:eastAsia="Calibri" w:cs="Times New Roman"/>
                 <w:kern w:val="0"/>
@@ -296,18 +299,6 @@
                 <w14:ligatures w14:val="none"/>
               </w:rPr>
               <w:t>Nombre de joueurs</w:t>
-            </w:r>
-            <w:r>
-              <w:rPr>
-                <w:rFonts w:eastAsia="Calibri" w:cs="Times New Roman"/>
-                <w:b/>
-                <w:bCs/>
-                <w:kern w:val="0"/>
-                <w:sz w:val="20"/>
-                <w:szCs w:val="20"/>
-                <w14:ligatures w14:val="none"/>
-              </w:rPr>
-              <w:t xml:space="preserve"> </w:t>
             </w:r>
           </w:p>
         </w:tc>
@@ -345,6 +336,29 @@
             <w:tcBorders>
               <w:top w:val="nil"/>
               <w:left w:val="single" w:sz="4" w:space="0" w:color="auto"/>
+              <w:bottom w:val="nil"/>
+              <w:right w:val="nil"/>
+            </w:tcBorders>
+          </w:tcPr>
+          <w:p>
+            <w:pPr>
+              <w:jc w:val="both"/>
+              <w:rPr>
+                <w:rFonts w:eastAsia="Calibri" w:cs="Times New Roman"/>
+                <w:kern w:val="0"/>
+                <w:sz w:val="20"/>
+                <w:szCs w:val="20"/>
+                <w14:ligatures w14:val="none"/>
+              </w:rPr>
+            </w:pPr>
+          </w:p>
+        </w:tc>
+        <w:tc>
+          <w:tcPr>
+            <w:tcW w:w="0" w:type="auto"/>
+            <w:tcBorders>
+              <w:top w:val="nil"/>
+              <w:left w:val="nil"/>
               <w:bottom w:val="nil"/>
               <w:right w:val="single" w:sz="4" w:space="0" w:color="auto"/>
             </w:tcBorders>
@@ -405,6 +419,31 @@
               <w:top w:val="nil"/>
               <w:left w:val="single" w:sz="4" w:space="0" w:color="auto"/>
               <w:bottom w:val="nil"/>
+              <w:right w:val="nil"/>
+            </w:tcBorders>
+          </w:tcPr>
+          <w:p>
+            <w:pPr>
+              <w:jc w:val="both"/>
+              <w:rPr>
+                <w:rFonts w:eastAsia="Calibri" w:cs="Times New Roman"/>
+                <w:b/>
+                <w:bCs/>
+                <w:kern w:val="0"/>
+                <w:sz w:val="20"/>
+                <w:szCs w:val="20"/>
+                <w14:ligatures w14:val="none"/>
+              </w:rPr>
+            </w:pPr>
+          </w:p>
+        </w:tc>
+        <w:tc>
+          <w:tcPr>
+            <w:tcW w:w="0" w:type="auto"/>
+            <w:tcBorders>
+              <w:top w:val="nil"/>
+              <w:left w:val="nil"/>
+              <w:bottom w:val="nil"/>
               <w:right w:val="single" w:sz="4" w:space="0" w:color="auto"/>
             </w:tcBorders>
           </w:tcPr>
@@ -468,7 +507,7 @@
           </w:tcPr>
           <w:p>
             <w:pPr>
-              <w:jc w:val="right"/>
+              <w:jc w:val="center"/>
               <w:rPr>
                 <w:rFonts w:eastAsia="Calibri" w:cs="Times New Roman"/>
                 <w:kern w:val="0"/>
@@ -486,18 +525,6 @@
                 <w14:ligatures w14:val="none"/>
               </w:rPr>
               <w:t>Âge</w:t>
-            </w:r>
-            <w:r>
-              <w:rPr>
-                <w:rFonts w:eastAsia="Calibri" w:cs="Times New Roman"/>
-                <w:b/>
-                <w:bCs/>
-                <w:kern w:val="0"/>
-                <w:sz w:val="20"/>
-                <w:szCs w:val="20"/>
-                <w14:ligatures w14:val="none"/>
-              </w:rPr>
-              <w:t xml:space="preserve"> </w:t>
             </w:r>
           </w:p>
         </w:tc>
@@ -536,6 +563,29 @@
               <w:top w:val="nil"/>
               <w:left w:val="single" w:sz="4" w:space="0" w:color="auto"/>
               <w:bottom w:val="nil"/>
+              <w:right w:val="nil"/>
+            </w:tcBorders>
+          </w:tcPr>
+          <w:p>
+            <w:pPr>
+              <w:jc w:val="both"/>
+              <w:rPr>
+                <w:rFonts w:eastAsia="Calibri" w:cs="Times New Roman"/>
+                <w:kern w:val="0"/>
+                <w:sz w:val="20"/>
+                <w:szCs w:val="20"/>
+                <w14:ligatures w14:val="none"/>
+              </w:rPr>
+            </w:pPr>
+          </w:p>
+        </w:tc>
+        <w:tc>
+          <w:tcPr>
+            <w:tcW w:w="0" w:type="auto"/>
+            <w:tcBorders>
+              <w:top w:val="nil"/>
+              <w:left w:val="nil"/>
+              <w:bottom w:val="nil"/>
               <w:right w:val="single" w:sz="4" w:space="0" w:color="auto"/>
             </w:tcBorders>
           </w:tcPr>
@@ -589,6 +639,29 @@
             <w:tcBorders>
               <w:top w:val="nil"/>
               <w:left w:val="single" w:sz="4" w:space="0" w:color="auto"/>
+              <w:bottom w:val="nil"/>
+              <w:right w:val="nil"/>
+            </w:tcBorders>
+          </w:tcPr>
+          <w:p>
+            <w:pPr>
+              <w:jc w:val="both"/>
+              <w:rPr>
+                <w:rFonts w:eastAsia="Calibri" w:cs="Times New Roman"/>
+                <w:kern w:val="0"/>
+                <w:sz w:val="20"/>
+                <w:szCs w:val="20"/>
+                <w14:ligatures w14:val="none"/>
+              </w:rPr>
+            </w:pPr>
+          </w:p>
+        </w:tc>
+        <w:tc>
+          <w:tcPr>
+            <w:tcW w:w="0" w:type="auto"/>
+            <w:tcBorders>
+              <w:top w:val="nil"/>
+              <w:left w:val="nil"/>
               <w:bottom w:val="nil"/>
               <w:right w:val="single" w:sz="4" w:space="0" w:color="auto"/>
             </w:tcBorders>
@@ -648,7 +721,7 @@
           </w:tcPr>
           <w:p>
             <w:pPr>
-              <w:jc w:val="right"/>
+              <w:jc w:val="center"/>
               <w:rPr>
                 <w:rFonts w:eastAsia="Calibri" w:cs="Times New Roman"/>
                 <w:kern w:val="0"/>
@@ -666,18 +739,6 @@
                 <w14:ligatures w14:val="none"/>
               </w:rPr>
               <w:t>Durée</w:t>
-            </w:r>
-            <w:r>
-              <w:rPr>
-                <w:rFonts w:eastAsia="Calibri" w:cs="Times New Roman"/>
-                <w:b/>
-                <w:bCs/>
-                <w:kern w:val="0"/>
-                <w:sz w:val="20"/>
-                <w:szCs w:val="20"/>
-                <w14:ligatures w14:val="none"/>
-              </w:rPr>
-              <w:t xml:space="preserve"> </w:t>
             </w:r>
           </w:p>
         </w:tc>
@@ -716,6 +777,29 @@
               <w:top w:val="nil"/>
               <w:left w:val="single" w:sz="4" w:space="0" w:color="auto"/>
               <w:bottom w:val="nil"/>
+              <w:right w:val="nil"/>
+            </w:tcBorders>
+          </w:tcPr>
+          <w:p>
+            <w:pPr>
+              <w:jc w:val="both"/>
+              <w:rPr>
+                <w:rFonts w:eastAsia="Calibri" w:cs="Times New Roman"/>
+                <w:kern w:val="0"/>
+                <w:sz w:val="20"/>
+                <w:szCs w:val="20"/>
+                <w14:ligatures w14:val="none"/>
+              </w:rPr>
+            </w:pPr>
+          </w:p>
+        </w:tc>
+        <w:tc>
+          <w:tcPr>
+            <w:tcW w:w="0" w:type="auto"/>
+            <w:tcBorders>
+              <w:top w:val="nil"/>
+              <w:left w:val="nil"/>
+              <w:bottom w:val="nil"/>
               <w:right w:val="single" w:sz="4" w:space="0" w:color="auto"/>
             </w:tcBorders>
           </w:tcPr>
@@ -771,6 +855,29 @@
             <w:tcBorders>
               <w:top w:val="nil"/>
               <w:left w:val="single" w:sz="4" w:space="0" w:color="auto"/>
+              <w:bottom w:val="nil"/>
+              <w:right w:val="nil"/>
+            </w:tcBorders>
+          </w:tcPr>
+          <w:p>
+            <w:pPr>
+              <w:jc w:val="both"/>
+              <w:rPr>
+                <w:rFonts w:eastAsia="Calibri" w:cs="Times New Roman"/>
+                <w:kern w:val="0"/>
+                <w:sz w:val="20"/>
+                <w:szCs w:val="20"/>
+                <w14:ligatures w14:val="none"/>
+              </w:rPr>
+            </w:pPr>
+          </w:p>
+        </w:tc>
+        <w:tc>
+          <w:tcPr>
+            <w:tcW w:w="0" w:type="auto"/>
+            <w:tcBorders>
+              <w:top w:val="nil"/>
+              <w:left w:val="nil"/>
               <w:bottom w:val="nil"/>
               <w:right w:val="single" w:sz="4" w:space="0" w:color="auto"/>
             </w:tcBorders>
@@ -840,7 +947,7 @@
           </w:tcPr>
           <w:p>
             <w:pPr>
-              <w:jc w:val="right"/>
+              <w:jc w:val="center"/>
               <w:rPr>
                 <w:rFonts w:eastAsia="Calibri" w:cs="Times New Roman"/>
                 <w:kern w:val="0"/>
@@ -858,18 +965,6 @@
                 <w14:ligatures w14:val="none"/>
               </w:rPr>
               <w:t>Public</w:t>
-            </w:r>
-            <w:r>
-              <w:rPr>
-                <w:rFonts w:eastAsia="Calibri" w:cs="Times New Roman"/>
-                <w:b/>
-                <w:bCs/>
-                <w:kern w:val="0"/>
-                <w:sz w:val="20"/>
-                <w:szCs w:val="20"/>
-                <w14:ligatures w14:val="none"/>
-              </w:rPr>
-              <w:t xml:space="preserve"> </w:t>
             </w:r>
           </w:p>
         </w:tc>
@@ -908,6 +1003,29 @@
               <w:top w:val="nil"/>
               <w:left w:val="single" w:sz="4" w:space="0" w:color="auto"/>
               <w:bottom w:val="nil"/>
+              <w:right w:val="nil"/>
+            </w:tcBorders>
+          </w:tcPr>
+          <w:p>
+            <w:pPr>
+              <w:jc w:val="both"/>
+              <w:rPr>
+                <w:rFonts w:eastAsia="Calibri" w:cs="Times New Roman"/>
+                <w:kern w:val="0"/>
+                <w:sz w:val="20"/>
+                <w:szCs w:val="20"/>
+                <w14:ligatures w14:val="none"/>
+              </w:rPr>
+            </w:pPr>
+          </w:p>
+        </w:tc>
+        <w:tc>
+          <w:tcPr>
+            <w:tcW w:w="0" w:type="auto"/>
+            <w:tcBorders>
+              <w:top w:val="nil"/>
+              <w:left w:val="nil"/>
+              <w:bottom w:val="nil"/>
               <w:right w:val="single" w:sz="4" w:space="0" w:color="auto"/>
             </w:tcBorders>
           </w:tcPr>
@@ -961,6 +1079,29 @@
             <w:tcBorders>
               <w:top w:val="nil"/>
               <w:left w:val="single" w:sz="4" w:space="0" w:color="auto"/>
+              <w:bottom w:val="nil"/>
+              <w:right w:val="nil"/>
+            </w:tcBorders>
+          </w:tcPr>
+          <w:p>
+            <w:pPr>
+              <w:jc w:val="both"/>
+              <w:rPr>
+                <w:rFonts w:eastAsia="Calibri" w:cs="Times New Roman"/>
+                <w:kern w:val="0"/>
+                <w:sz w:val="20"/>
+                <w:szCs w:val="20"/>
+                <w14:ligatures w14:val="none"/>
+              </w:rPr>
+            </w:pPr>
+          </w:p>
+        </w:tc>
+        <w:tc>
+          <w:tcPr>
+            <w:tcW w:w="0" w:type="auto"/>
+            <w:tcBorders>
+              <w:top w:val="nil"/>
+              <w:left w:val="nil"/>
               <w:bottom w:val="nil"/>
               <w:right w:val="single" w:sz="4" w:space="0" w:color="auto"/>
             </w:tcBorders>
@@ -1312,14 +1453,7 @@
           <w:kern w:val="0"/>
           <w14:ligatures w14:val="none"/>
         </w:rPr>
-        <w:t xml:space="preserve"> au recto, Terre de 1, 2, 3, ou 4 points ; au verso, montagne infranchissable ; c</w:t>
-      </w:r>
-      <w:r>
-        <w:rPr>
-          <w:kern w:val="0"/>
-          <w14:ligatures w14:val="none"/>
-        </w:rPr>
-        <w:t>haque carte est</w:t>
+        <w:t xml:space="preserve"> au recto, Terre de 1, 2, 3, ou 4 points ; au verso, montagne infranchissable ; chaque carte est</w:t>
       </w:r>
       <w:r>
         <w:rPr>
@@ -1333,7 +1467,14 @@
           <w:kern w:val="0"/>
           <w14:ligatures w14:val="none"/>
         </w:rPr>
-        <w:t>, un symbole héraldique</w:t>
+        <w:t xml:space="preserve">, un </w:t>
+      </w:r>
+      <w:r>
+        <w:rPr>
+          <w:kern w:val="0"/>
+          <w14:ligatures w14:val="none"/>
+        </w:rPr>
+        <w:t>blason</w:t>
       </w:r>
       <w:r>
         <w:rPr>
@@ -1454,14 +1595,7 @@
           <w:kern w:val="0"/>
           <w14:ligatures w14:val="none"/>
         </w:rPr>
-        <w:t xml:space="preserve">9 cartes de 3 points, bleues avec un </w:t>
-      </w:r>
-      <w:r>
-        <w:rPr>
-          <w:kern w:val="0"/>
-          <w14:ligatures w14:val="none"/>
-        </w:rPr>
-        <w:t>Aigle.</w:t>
+        <w:t>9 cartes de 3 points, bleues avec un Aigle.</w:t>
       </w:r>
     </w:p>
     <w:p>
@@ -1483,42 +1617,7 @@
           <w:kern w:val="0"/>
           <w14:ligatures w14:val="none"/>
         </w:rPr>
-        <w:t xml:space="preserve">9 cartes de </w:t>
-      </w:r>
-      <w:r>
-        <w:rPr>
-          <w:kern w:val="0"/>
-          <w14:ligatures w14:val="none"/>
-        </w:rPr>
-        <w:t>2</w:t>
-      </w:r>
-      <w:r>
-        <w:rPr>
-          <w:kern w:val="0"/>
-          <w14:ligatures w14:val="none"/>
-        </w:rPr>
-        <w:t xml:space="preserve"> points, </w:t>
-      </w:r>
-      <w:r>
-        <w:rPr>
-          <w:kern w:val="0"/>
-          <w14:ligatures w14:val="none"/>
-        </w:rPr>
-        <w:t>vertes</w:t>
-      </w:r>
-      <w:r>
-        <w:rPr>
-          <w:kern w:val="0"/>
-          <w14:ligatures w14:val="none"/>
-        </w:rPr>
-        <w:t xml:space="preserve"> avec un </w:t>
-      </w:r>
-      <w:r>
-        <w:rPr>
-          <w:kern w:val="0"/>
-          <w14:ligatures w14:val="none"/>
-        </w:rPr>
-        <w:t>Loup.</w:t>
+        <w:t>9 cartes de 2 points, vertes avec un Loup.</w:t>
       </w:r>
     </w:p>
     <w:p>
@@ -1540,49 +1639,7 @@
           <w:kern w:val="0"/>
           <w14:ligatures w14:val="none"/>
         </w:rPr>
-        <w:t xml:space="preserve">9 cartes de </w:t>
-      </w:r>
-      <w:r>
-        <w:rPr>
-          <w:kern w:val="0"/>
-          <w14:ligatures w14:val="none"/>
-        </w:rPr>
-        <w:t>1</w:t>
-      </w:r>
-      <w:r>
-        <w:rPr>
-          <w:kern w:val="0"/>
-          <w14:ligatures w14:val="none"/>
-        </w:rPr>
-        <w:t xml:space="preserve"> point, </w:t>
-      </w:r>
-      <w:r>
-        <w:rPr>
-          <w:kern w:val="0"/>
-          <w14:ligatures w14:val="none"/>
-        </w:rPr>
-        <w:t>grise</w:t>
-      </w:r>
-      <w:r>
-        <w:rPr>
-          <w:kern w:val="0"/>
-          <w14:ligatures w14:val="none"/>
-        </w:rPr>
-        <w:t xml:space="preserve"> avec un </w:t>
-      </w:r>
-      <w:r>
-        <w:rPr>
-          <w:kern w:val="0"/>
-          <w14:ligatures w14:val="none"/>
-        </w:rPr>
-        <w:t>Cheval</w:t>
-      </w:r>
-      <w:r>
-        <w:rPr>
-          <w:kern w:val="0"/>
-          <w14:ligatures w14:val="none"/>
-        </w:rPr>
-        <w:t>.</w:t>
+        <w:t>9 cartes de 1 point, grise avec un Cheval.</w:t>
       </w:r>
     </w:p>
     <w:p>
@@ -1628,7 +1685,28 @@
           <w:kern w:val="0"/>
           <w14:ligatures w14:val="none"/>
         </w:rPr>
-        <w:t xml:space="preserve"> par couleur, lettre et symbole (</w:t>
+        <w:t xml:space="preserve"> par couleur, lettre et </w:t>
+      </w:r>
+      <w:r>
+        <w:rPr>
+          <w:kern w:val="0"/>
+          <w14:ligatures w14:val="none"/>
+        </w:rPr>
+        <w:t>blason</w:t>
+      </w:r>
+      <w:r>
+        <w:rPr>
+          <w:kern w:val="0"/>
+          <w14:ligatures w14:val="none"/>
+        </w:rPr>
+        <w:t xml:space="preserve"> </w:t>
+      </w:r>
+      <w:r>
+        <w:rPr>
+          <w:kern w:val="0"/>
+          <w14:ligatures w14:val="none"/>
+        </w:rPr>
+        <w:t>(</w:t>
       </w:r>
       <w:r>
         <w:rPr>
@@ -2150,308 +2228,277 @@
       <w:bookmarkEnd w:id="10"/>
       <w:bookmarkEnd w:id="11"/>
       <w:bookmarkEnd w:id="12"/>
+      <w:r>
+        <w:rPr>
+          <w:rFonts w:eastAsia="Times New Roman" w:cs="Times New Roman"/>
+          <w:color w:val="0070C0"/>
+          <w:kern w:val="0"/>
+          <w:sz w:val="32"/>
+          <w:szCs w:val="32"/>
+          <w14:ligatures w14:val="none"/>
+        </w:rPr>
+        <w:t xml:space="preserve"> – F</w:t>
+      </w:r>
+      <w:r>
+        <w:rPr>
+          <w:rFonts w:eastAsia="Times New Roman" w:cs="Times New Roman"/>
+          <w:color w:val="0070C0"/>
+          <w:kern w:val="0"/>
+          <w:sz w:val="32"/>
+          <w:szCs w:val="32"/>
+          <w14:ligatures w14:val="none"/>
+        </w:rPr>
+        <w:t>in</w:t>
+      </w:r>
+      <w:r>
+        <w:rPr>
+          <w:rFonts w:eastAsia="Times New Roman" w:cs="Times New Roman"/>
+          <w:color w:val="0070C0"/>
+          <w:kern w:val="0"/>
+          <w:sz w:val="32"/>
+          <w:szCs w:val="32"/>
+          <w14:ligatures w14:val="none"/>
+        </w:rPr>
+        <w:t>s</w:t>
+      </w:r>
+      <w:r>
+        <w:rPr>
+          <w:rFonts w:eastAsia="Times New Roman" w:cs="Times New Roman"/>
+          <w:color w:val="0070C0"/>
+          <w:kern w:val="0"/>
+          <w:sz w:val="32"/>
+          <w:szCs w:val="32"/>
+          <w14:ligatures w14:val="none"/>
+        </w:rPr>
+        <w:t xml:space="preserve"> de partie</w:t>
+      </w:r>
+      <w:r>
+        <w:rPr>
+          <w:rFonts w:eastAsia="Times New Roman" w:cs="Times New Roman"/>
+          <w:color w:val="0070C0"/>
+          <w:kern w:val="0"/>
+          <w:sz w:val="32"/>
+          <w:szCs w:val="32"/>
+          <w14:ligatures w14:val="none"/>
+        </w:rPr>
+        <w:t xml:space="preserve"> – </w:t>
+      </w:r>
+      <w:r>
+        <w:rPr>
+          <w:rFonts w:eastAsia="Times New Roman" w:cs="Times New Roman"/>
+          <w:color w:val="0070C0"/>
+          <w:kern w:val="0"/>
+          <w:sz w:val="32"/>
+          <w:szCs w:val="32"/>
+          <w14:ligatures w14:val="none"/>
+        </w:rPr>
+        <w:t>Vainqueur</w:t>
+      </w:r>
     </w:p>
     <w:p>
       <w:pPr>
-        <w:jc w:val="both"/>
-        <w:rPr>
-          <w:rFonts w:eastAsia="Calibri" w:cs="Times New Roman"/>
-          <w:color w:val="000000"/>
-          <w:kern w:val="0"/>
-          <w14:ligatures w14:val="none"/>
-        </w:rPr>
-      </w:pPr>
-      <w:r>
-        <w:rPr>
-          <w:rFonts w:eastAsia="Calibri" w:cs="Times New Roman"/>
-          <w:color w:val="000000"/>
-          <w:kern w:val="0"/>
-          <w14:ligatures w14:val="none"/>
-        </w:rPr>
-        <w:t>Le but est de gagner le plus de points grâce à la construction de donjons</w:t>
-      </w:r>
-      <w:r>
-        <w:rPr>
-          <w:rFonts w:eastAsia="Calibri" w:cs="Times New Roman"/>
-          <w:color w:val="000000"/>
-          <w:kern w:val="0"/>
-          <w14:ligatures w14:val="none"/>
-        </w:rPr>
-        <w:t xml:space="preserve"> sur des terres à conquérir.</w:t>
+        <w:keepNext/>
+        <w:keepLines/>
+        <w:numPr>
+          <w:ilvl w:val="1"/>
+          <w:numId w:val="6"/>
+        </w:numPr>
+        <w:spacing w:before="240" w:after="0"/>
+        <w:outlineLvl w:val="0"/>
+        <w:rPr>
+          <w:rFonts w:eastAsia="Times New Roman" w:cs="Times New Roman"/>
+          <w:color w:val="0070C0"/>
+          <w:kern w:val="0"/>
+          <w:sz w:val="32"/>
+          <w:szCs w:val="32"/>
+          <w14:ligatures w14:val="none"/>
+        </w:rPr>
+      </w:pPr>
+      <w:r>
+        <w:rPr>
+          <w:rFonts w:eastAsia="Times New Roman" w:cs="Times New Roman"/>
+          <w:color w:val="0070C0"/>
+          <w:kern w:val="0"/>
+          <w:sz w:val="32"/>
+          <w:szCs w:val="32"/>
+          <w14:ligatures w14:val="none"/>
+        </w:rPr>
+        <w:t>But du jeu</w:t>
       </w:r>
     </w:p>
     <w:p>
       <w:pPr>
         <w:jc w:val="both"/>
         <w:rPr>
-          <w:rFonts w:eastAsia="Calibri" w:cs="Times New Roman"/>
-          <w:color w:val="000000"/>
-          <w:kern w:val="0"/>
-          <w14:ligatures w14:val="none"/>
-        </w:rPr>
-      </w:pPr>
-      <w:r>
-        <w:rPr>
-          <w:rFonts w:eastAsia="Calibri" w:cs="Times New Roman"/>
-          <w:color w:val="000000"/>
-          <w:kern w:val="0"/>
-          <w14:ligatures w14:val="none"/>
-        </w:rPr>
-        <w:t xml:space="preserve">Vous gagnez les </w:t>
-      </w:r>
-      <w:r>
-        <w:rPr>
-          <w:rFonts w:eastAsia="Calibri" w:cs="Times New Roman"/>
+          <w:kern w:val="0"/>
+          <w14:ligatures w14:val="none"/>
+        </w:rPr>
+      </w:pPr>
+      <w:r>
+        <w:rPr>
+          <w:kern w:val="0"/>
+          <w14:ligatures w14:val="none"/>
+        </w:rPr>
+        <w:t>Le but</w:t>
+      </w:r>
+      <w:r>
+        <w:rPr>
+          <w:kern w:val="0"/>
+          <w14:ligatures w14:val="none"/>
+        </w:rPr>
+        <w:t xml:space="preserve"> est d’accumuler le plus de points en affirmant votre domination par la construction de </w:t>
+      </w:r>
+      <w:r>
+        <w:rPr>
           <w:b/>
           <w:bCs/>
-          <w:color w:val="EE0000"/>
-          <w:kern w:val="0"/>
-          <w14:ligatures w14:val="none"/>
-        </w:rPr>
-        <w:t xml:space="preserve">points des </w:t>
-      </w:r>
-      <w:r>
-        <w:rPr>
-          <w:rFonts w:eastAsia="Calibri" w:cs="Times New Roman"/>
+          <w:kern w:val="0"/>
+          <w14:ligatures w14:val="none"/>
+        </w:rPr>
+        <w:t>Donjons</w:t>
+      </w:r>
+      <w:r>
+        <w:rPr>
+          <w:kern w:val="0"/>
+          <w14:ligatures w14:val="none"/>
+        </w:rPr>
+        <w:t>. Votre score total est la somme de trois types de gains</w:t>
+      </w:r>
+      <w:r>
+        <w:rPr>
+          <w:kern w:val="0"/>
+          <w14:ligatures w14:val="none"/>
+        </w:rPr>
+        <w:t> :</w:t>
+      </w:r>
+    </w:p>
+    <w:p>
+      <w:pPr>
+        <w:numPr>
+          <w:ilvl w:val="0"/>
+          <w:numId w:val="11"/>
+        </w:numPr>
+        <w:jc w:val="both"/>
+        <w:rPr>
+          <w:kern w:val="0"/>
+          <w14:ligatures w14:val="none"/>
+        </w:rPr>
+      </w:pPr>
+      <w:r>
+        <w:rPr>
           <w:b/>
           <w:bCs/>
-          <w:color w:val="EE0000"/>
-          <w:kern w:val="0"/>
-          <w14:ligatures w14:val="none"/>
-        </w:rPr>
-        <w:t>terres</w:t>
-      </w:r>
-      <w:r>
-        <w:rPr>
-          <w:rFonts w:eastAsia="Calibri" w:cs="Times New Roman"/>
-          <w:color w:val="EE0000"/>
-          <w:kern w:val="0"/>
-          <w14:ligatures w14:val="none"/>
-        </w:rPr>
-        <w:t xml:space="preserve"> </w:t>
-      </w:r>
-      <w:r>
-        <w:rPr>
-          <w:rFonts w:eastAsia="Calibri" w:cs="Times New Roman"/>
-          <w:color w:val="000000"/>
-          <w:kern w:val="0"/>
-          <w14:ligatures w14:val="none"/>
-        </w:rPr>
-        <w:t>en y construisant des donjons</w:t>
-      </w:r>
-      <w:r>
-        <w:rPr>
-          <w:rFonts w:eastAsia="Calibri" w:cs="Times New Roman"/>
-          <w:color w:val="000000"/>
-          <w:kern w:val="0"/>
-          <w14:ligatures w14:val="none"/>
-        </w:rPr>
-        <w:t xml:space="preserve">. S’y ajoutent d’une part, des </w:t>
-      </w:r>
-      <w:r>
-        <w:rPr>
-          <w:rFonts w:eastAsia="Calibri" w:cs="Times New Roman"/>
+          <w:kern w:val="0"/>
+          <w14:ligatures w14:val="none"/>
+        </w:rPr>
+        <w:t>Points de Terre :</w:t>
+      </w:r>
+      <w:r>
+        <w:rPr>
+          <w:kern w:val="0"/>
+          <w14:ligatures w14:val="none"/>
+        </w:rPr>
+        <w:t xml:space="preserve"> La valeur de chaque </w:t>
+      </w:r>
+      <w:r>
+        <w:rPr>
+          <w:kern w:val="0"/>
+          <w14:ligatures w14:val="none"/>
+        </w:rPr>
+        <w:t>T</w:t>
+      </w:r>
+      <w:r>
+        <w:rPr>
+          <w:kern w:val="0"/>
+          <w14:ligatures w14:val="none"/>
+        </w:rPr>
+        <w:t>uile où vous possédez un Donjon.</w:t>
+      </w:r>
+    </w:p>
+    <w:p>
+      <w:pPr>
+        <w:numPr>
+          <w:ilvl w:val="0"/>
+          <w:numId w:val="11"/>
+        </w:numPr>
+        <w:jc w:val="both"/>
+        <w:rPr>
+          <w:kern w:val="0"/>
+          <w14:ligatures w14:val="none"/>
+        </w:rPr>
+      </w:pPr>
+      <w:r>
+        <w:rPr>
           <w:b/>
           <w:bCs/>
-          <w:color w:val="EE0000"/>
-          <w:kern w:val="0"/>
-          <w14:ligatures w14:val="none"/>
-        </w:rPr>
-        <w:t>points de prestige</w:t>
-      </w:r>
-      <w:r>
-        <w:rPr>
-          <w:rFonts w:eastAsia="Calibri" w:cs="Times New Roman"/>
-          <w:color w:val="000000"/>
-          <w:kern w:val="0"/>
-          <w14:ligatures w14:val="none"/>
-        </w:rPr>
-        <w:t xml:space="preserve"> associés à la </w:t>
-      </w:r>
-      <w:r>
-        <w:rPr>
-          <w:rFonts w:eastAsia="Calibri" w:cs="Times New Roman"/>
+          <w:kern w:val="0"/>
+          <w14:ligatures w14:val="none"/>
+        </w:rPr>
+        <w:t>Points de Prestige :</w:t>
+      </w:r>
+      <w:r>
+        <w:rPr>
+          <w:kern w:val="0"/>
+          <w14:ligatures w14:val="none"/>
+        </w:rPr>
+        <w:t xml:space="preserve"> Des bonus accordés si vos Donjons occupent </w:t>
+      </w:r>
+      <w:r>
+        <w:rPr>
+          <w:kern w:val="0"/>
+          <w14:ligatures w14:val="none"/>
+        </w:rPr>
+        <w:t xml:space="preserve">des Tuiles avec </w:t>
+      </w:r>
+      <w:r>
+        <w:rPr>
+          <w:kern w:val="0"/>
+          <w14:ligatures w14:val="none"/>
+        </w:rPr>
+        <w:t>la Ville Franche ou des Cités Marchandes.</w:t>
+      </w:r>
+    </w:p>
+    <w:p>
+      <w:pPr>
+        <w:numPr>
+          <w:ilvl w:val="0"/>
+          <w:numId w:val="11"/>
+        </w:numPr>
+        <w:jc w:val="both"/>
+        <w:rPr>
+          <w:kern w:val="0"/>
+          <w14:ligatures w14:val="none"/>
+        </w:rPr>
+      </w:pPr>
+      <w:r>
+        <w:rPr>
           <w:b/>
           <w:bCs/>
-          <w:color w:val="000000"/>
-          <w:kern w:val="0"/>
-          <w14:ligatures w14:val="none"/>
-        </w:rPr>
-        <w:t>ville</w:t>
-      </w:r>
-      <w:r>
-        <w:rPr>
-          <w:rFonts w:eastAsia="Calibri" w:cs="Times New Roman"/>
-          <w:b/>
-          <w:bCs/>
-          <w:color w:val="000000"/>
-          <w:kern w:val="0"/>
-          <w14:ligatures w14:val="none"/>
-        </w:rPr>
-        <w:t xml:space="preserve"> </w:t>
-      </w:r>
-      <w:r>
-        <w:rPr>
-          <w:rFonts w:eastAsia="Calibri" w:cs="Times New Roman"/>
-          <w:b/>
-          <w:bCs/>
-          <w:color w:val="000000"/>
-          <w:kern w:val="0"/>
-          <w14:ligatures w14:val="none"/>
-        </w:rPr>
-        <w:t>franche</w:t>
-      </w:r>
-      <w:r>
-        <w:rPr>
-          <w:rFonts w:eastAsia="Calibri" w:cs="Times New Roman"/>
-          <w:color w:val="000000"/>
-          <w:kern w:val="0"/>
-          <w14:ligatures w14:val="none"/>
-        </w:rPr>
-        <w:t xml:space="preserve"> et aux </w:t>
-      </w:r>
-      <w:r>
-        <w:rPr>
-          <w:rFonts w:eastAsia="Calibri" w:cs="Times New Roman"/>
-          <w:b/>
-          <w:bCs/>
-          <w:color w:val="000000"/>
-          <w:kern w:val="0"/>
-          <w14:ligatures w14:val="none"/>
-        </w:rPr>
-        <w:t>cités marchandes</w:t>
-      </w:r>
-      <w:r>
-        <w:rPr>
-          <w:rFonts w:eastAsia="Calibri" w:cs="Times New Roman"/>
-          <w:color w:val="000000"/>
-          <w:kern w:val="0"/>
-          <w14:ligatures w14:val="none"/>
-        </w:rPr>
-        <w:t xml:space="preserve"> </w:t>
-      </w:r>
-      <w:r>
-        <w:rPr>
-          <w:rFonts w:eastAsia="Calibri" w:cs="Times New Roman"/>
-          <w:color w:val="000000"/>
-          <w:kern w:val="0"/>
-          <w14:ligatures w14:val="none"/>
-        </w:rPr>
-        <w:t xml:space="preserve">lorsqu’elles sont </w:t>
-      </w:r>
-      <w:r>
-        <w:rPr>
-          <w:rFonts w:eastAsia="Calibri" w:cs="Times New Roman"/>
-          <w:color w:val="000000"/>
-          <w:kern w:val="0"/>
-          <w14:ligatures w14:val="none"/>
-        </w:rPr>
-        <w:t>présentes sur les terres conquises</w:t>
-      </w:r>
-      <w:r>
-        <w:rPr>
-          <w:rFonts w:eastAsia="Calibri" w:cs="Times New Roman"/>
-          <w:color w:val="000000"/>
-          <w:kern w:val="0"/>
-          <w14:ligatures w14:val="none"/>
-        </w:rPr>
-        <w:t xml:space="preserve"> et d’autre part, des </w:t>
-      </w:r>
-      <w:r>
-        <w:rPr>
-          <w:rFonts w:eastAsia="Calibri" w:cs="Times New Roman"/>
-          <w:b/>
-          <w:bCs/>
-          <w:color w:val="EE0000"/>
-          <w:kern w:val="0"/>
-          <w14:ligatures w14:val="none"/>
-        </w:rPr>
-        <w:t>points de diversité</w:t>
-      </w:r>
-      <w:r>
-        <w:rPr>
-          <w:rFonts w:eastAsia="Calibri" w:cs="Times New Roman"/>
-          <w:color w:val="EE0000"/>
-          <w:kern w:val="0"/>
-          <w14:ligatures w14:val="none"/>
-        </w:rPr>
-        <w:t xml:space="preserve"> </w:t>
-      </w:r>
-      <w:r>
-        <w:rPr>
-          <w:rFonts w:eastAsia="Calibri" w:cs="Times New Roman"/>
-          <w:color w:val="000000"/>
-          <w:kern w:val="0"/>
-          <w14:ligatures w14:val="none"/>
-        </w:rPr>
-        <w:t>associés aux</w:t>
-      </w:r>
-      <w:r>
-        <w:rPr>
-          <w:rFonts w:eastAsia="Calibri" w:cs="Times New Roman"/>
-          <w:color w:val="000000"/>
-          <w:kern w:val="0"/>
-          <w14:ligatures w14:val="none"/>
-        </w:rPr>
-        <w:t xml:space="preserve"> nombres de</w:t>
-      </w:r>
-      <w:r>
-        <w:rPr>
-          <w:rFonts w:eastAsia="Calibri" w:cs="Times New Roman"/>
-          <w:color w:val="000000"/>
-          <w:kern w:val="0"/>
-          <w14:ligatures w14:val="none"/>
-        </w:rPr>
-        <w:t xml:space="preserve"> </w:t>
-      </w:r>
-      <w:r>
-        <w:rPr>
-          <w:rFonts w:eastAsia="Calibri" w:cs="Times New Roman"/>
-          <w:b/>
-          <w:bCs/>
-          <w:color w:val="000000"/>
-          <w:kern w:val="0"/>
-          <w14:ligatures w14:val="none"/>
-        </w:rPr>
-        <w:t xml:space="preserve">couleurs des </w:t>
-      </w:r>
-      <w:r>
-        <w:rPr>
-          <w:rFonts w:eastAsia="Calibri" w:cs="Times New Roman"/>
-          <w:b/>
-          <w:bCs/>
-          <w:color w:val="000000"/>
-          <w:kern w:val="0"/>
-          <w14:ligatures w14:val="none"/>
-        </w:rPr>
-        <w:t>terres</w:t>
-      </w:r>
-      <w:r>
-        <w:rPr>
-          <w:rFonts w:eastAsia="Calibri" w:cs="Times New Roman"/>
-          <w:color w:val="000000"/>
-          <w:kern w:val="0"/>
-          <w14:ligatures w14:val="none"/>
-        </w:rPr>
-        <w:t xml:space="preserve"> </w:t>
-      </w:r>
-      <w:r>
-        <w:rPr>
-          <w:rFonts w:eastAsia="Calibri" w:cs="Times New Roman"/>
-          <w:color w:val="000000"/>
-          <w:kern w:val="0"/>
-          <w14:ligatures w14:val="none"/>
-        </w:rPr>
-        <w:t>conquises</w:t>
-      </w:r>
-      <w:r>
-        <w:rPr>
-          <w:rFonts w:eastAsia="Calibri" w:cs="Times New Roman"/>
-          <w:color w:val="000000"/>
-          <w:kern w:val="0"/>
-          <w14:ligatures w14:val="none"/>
-        </w:rPr>
-        <w:t xml:space="preserve">. </w:t>
+          <w:kern w:val="0"/>
+          <w14:ligatures w14:val="none"/>
+        </w:rPr>
+        <w:t>Points de Diversité :</w:t>
+      </w:r>
+      <w:r>
+        <w:rPr>
+          <w:kern w:val="0"/>
+          <w14:ligatures w14:val="none"/>
+        </w:rPr>
+        <w:t xml:space="preserve"> Un bonus récompensant la variété des blasons (</w:t>
+      </w:r>
+      <w:r>
+        <w:rPr>
+          <w:kern w:val="0"/>
+          <w14:ligatures w14:val="none"/>
+        </w:rPr>
+        <w:t xml:space="preserve">= </w:t>
+      </w:r>
+      <w:r>
+        <w:rPr>
+          <w:kern w:val="0"/>
+          <w14:ligatures w14:val="none"/>
+        </w:rPr>
+        <w:t>couleurs) sous votre contrôle.</w:t>
       </w:r>
     </w:p>
     <w:tbl>
@@ -2504,17 +2551,7 @@
                 <w:kern w:val="0"/>
                 <w14:ligatures w14:val="none"/>
               </w:rPr>
-              <w:t xml:space="preserve">Points de </w:t>
-            </w:r>
-            <w:r>
-              <w:rPr>
-                <w:rFonts w:eastAsia="Calibri" w:cs="Times New Roman"/>
-                <w:b/>
-                <w:bCs/>
-                <w:kern w:val="0"/>
-                <w14:ligatures w14:val="none"/>
-              </w:rPr>
-              <w:t>la terre</w:t>
+              <w:t>Points de la terre</w:t>
             </w:r>
           </w:p>
         </w:tc>
@@ -3496,8 +3533,6 @@
       <w:pPr>
         <w:jc w:val="both"/>
         <w:rPr>
-          <w:rFonts w:eastAsia="Calibri" w:cs="Times New Roman"/>
-          <w:color w:val="000000"/>
           <w:kern w:val="0"/>
           <w14:ligatures w14:val="none"/>
         </w:rPr>
@@ -3507,34 +3542,105 @@
       <w:pPr>
         <w:jc w:val="both"/>
         <w:rPr>
-          <w:rFonts w:eastAsia="Calibri" w:cs="Times New Roman"/>
-          <w:color w:val="000000"/>
-          <w:kern w:val="0"/>
-          <w14:ligatures w14:val="none"/>
-        </w:rPr>
-      </w:pPr>
-      <w:r>
-        <w:rPr>
-          <w:rFonts w:eastAsia="Calibri" w:cs="Times New Roman"/>
-          <w:color w:val="000000"/>
-          <w:kern w:val="0"/>
-          <w14:ligatures w14:val="none"/>
-        </w:rPr>
-        <w:t>La piste de score permet de suivre l’avancement des points après le tour de chaque joueur. Cependant, lorsque des donjons sont détruits vous devez recompter</w:t>
-      </w:r>
-      <w:r>
-        <w:rPr>
-          <w:rFonts w:eastAsia="Calibri" w:cs="Times New Roman"/>
-          <w:color w:val="000000"/>
-          <w:kern w:val="0"/>
-          <w14:ligatures w14:val="none"/>
-        </w:rPr>
-        <w:t>, en repartant de zéro,</w:t>
-      </w:r>
-      <w:r>
-        <w:rPr>
-          <w:rFonts w:eastAsia="Calibri" w:cs="Times New Roman"/>
-          <w:color w:val="000000"/>
+          <w:kern w:val="0"/>
+          <w14:ligatures w14:val="none"/>
+        </w:rPr>
+      </w:pPr>
+      <w:r>
+        <w:rPr>
+          <w:b/>
+          <w:bCs/>
+          <w:kern w:val="0"/>
+          <w14:ligatures w14:val="none"/>
+        </w:rPr>
+        <w:t>Note importante :</w:t>
+      </w:r>
+      <w:r>
+        <w:rPr>
+          <w:kern w:val="0"/>
+          <w14:ligatures w14:val="none"/>
+        </w:rPr>
+        <w:t xml:space="preserve"> La piste de score suit l'évolution d</w:t>
+      </w:r>
+      <w:r>
+        <w:rPr>
+          <w:kern w:val="0"/>
+          <w14:ligatures w14:val="none"/>
+        </w:rPr>
+        <w:t>es scores</w:t>
+      </w:r>
+      <w:r>
+        <w:rPr>
+          <w:kern w:val="0"/>
+          <w14:ligatures w14:val="none"/>
+        </w:rPr>
+        <w:t xml:space="preserve"> en temps réel.</w:t>
+      </w:r>
+      <w:r>
+        <w:rPr>
+          <w:kern w:val="0"/>
+          <w14:ligatures w14:val="none"/>
+        </w:rPr>
+        <w:t xml:space="preserve"> Vous la mettez à jour à la fin du tour de chaque joueur, lorsque des donjons </w:t>
+      </w:r>
+      <w:r>
+        <w:rPr>
+          <w:kern w:val="0"/>
+          <w14:ligatures w14:val="none"/>
+        </w:rPr>
+        <w:t>ont été</w:t>
+      </w:r>
+      <w:r>
+        <w:rPr>
+          <w:kern w:val="0"/>
+          <w14:ligatures w14:val="none"/>
+        </w:rPr>
+        <w:t xml:space="preserve"> construits ou détruits.</w:t>
+      </w:r>
+      <w:r>
+        <w:rPr>
+          <w:kern w:val="0"/>
+          <w14:ligatures w14:val="none"/>
+        </w:rPr>
+        <w:t xml:space="preserve"> Aucun point n'est définitif : </w:t>
+      </w:r>
+      <w:r>
+        <w:rPr>
+          <w:kern w:val="0"/>
+          <w14:ligatures w14:val="none"/>
+        </w:rPr>
+        <w:t>les</w:t>
+      </w:r>
+      <w:r>
+        <w:rPr>
+          <w:kern w:val="0"/>
+          <w14:ligatures w14:val="none"/>
+        </w:rPr>
+        <w:t xml:space="preserve"> score</w:t>
+      </w:r>
+      <w:r>
+        <w:rPr>
+          <w:kern w:val="0"/>
+          <w14:ligatures w14:val="none"/>
+        </w:rPr>
+        <w:t>s</w:t>
+      </w:r>
+      <w:r>
+        <w:rPr>
+          <w:kern w:val="0"/>
+          <w14:ligatures w14:val="none"/>
+        </w:rPr>
+        <w:t xml:space="preserve"> dépend</w:t>
+      </w:r>
+      <w:r>
+        <w:rPr>
+          <w:kern w:val="0"/>
+          <w14:ligatures w14:val="none"/>
+        </w:rPr>
+        <w:t>ent</w:t>
+      </w:r>
+      <w:r>
+        <w:rPr>
           <w:kern w:val="0"/>
           <w14:ligatures w14:val="none"/>
         </w:rPr>
@@ -3542,483 +3648,195 @@
       </w:r>
       <w:r>
         <w:rPr>
-          <w:rFonts w:eastAsia="Calibri" w:cs="Times New Roman"/>
-          <w:color w:val="000000"/>
-          <w:kern w:val="0"/>
-          <w14:ligatures w14:val="none"/>
-        </w:rPr>
-        <w:t xml:space="preserve">les points des joueurs attaqués </w:t>
-      </w:r>
-      <w:r>
-        <w:rPr>
-          <w:rFonts w:eastAsia="Calibri" w:cs="Times New Roman"/>
-          <w:color w:val="000000"/>
-          <w:kern w:val="0"/>
-          <w14:ligatures w14:val="none"/>
-        </w:rPr>
-        <w:t>d’après l’état du plateau</w:t>
-      </w:r>
-      <w:r>
-        <w:rPr>
-          <w:rFonts w:eastAsia="Calibri" w:cs="Times New Roman"/>
-          <w:color w:val="000000"/>
-          <w:kern w:val="0"/>
-          <w14:ligatures w14:val="none"/>
-        </w:rPr>
-        <w:t>.</w:t>
-      </w:r>
-    </w:p>
-    <w:p>
-      <w:pPr>
-        <w:jc w:val="both"/>
-        <w:rPr>
-          <w:rFonts w:eastAsia="Calibri" w:cs="Times New Roman"/>
-          <w:color w:val="000000" w:themeColor="text1"/>
-          <w:kern w:val="0"/>
-          <w14:ligatures w14:val="none"/>
-        </w:rPr>
-      </w:pPr>
-      <w:r>
-        <w:rPr>
-          <w:rFonts w:eastAsia="Calibri" w:cs="Times New Roman"/>
-          <w:color w:val="000000" w:themeColor="text1"/>
-          <w:kern w:val="0"/>
-          <w14:ligatures w14:val="none"/>
-        </w:rPr>
-        <w:t>L</w:t>
-      </w:r>
-      <w:r>
-        <w:rPr>
-          <w:rFonts w:eastAsia="Calibri" w:cs="Times New Roman"/>
-          <w:color w:val="000000" w:themeColor="text1"/>
-          <w:kern w:val="0"/>
-          <w14:ligatures w14:val="none"/>
-        </w:rPr>
-        <w:t>a partie s’arrête immédiatement</w:t>
-      </w:r>
-      <w:r>
-        <w:rPr>
-          <w:rFonts w:eastAsia="Calibri" w:cs="Times New Roman"/>
-          <w:color w:val="000000" w:themeColor="text1"/>
-          <w:kern w:val="0"/>
-          <w14:ligatures w14:val="none"/>
-        </w:rPr>
-        <w:t>,</w:t>
-      </w:r>
-      <w:r>
-        <w:rPr>
-          <w:rFonts w:eastAsia="Calibri" w:cs="Times New Roman"/>
-          <w:color w:val="000000" w:themeColor="text1"/>
-          <w:kern w:val="0"/>
-          <w14:ligatures w14:val="none"/>
-        </w:rPr>
-        <w:t xml:space="preserve"> sans terminer le tour de table</w:t>
-      </w:r>
-      <w:r>
-        <w:rPr>
-          <w:rFonts w:eastAsia="Calibri" w:cs="Times New Roman"/>
-          <w:color w:val="000000" w:themeColor="text1"/>
-          <w:kern w:val="0"/>
-          <w14:ligatures w14:val="none"/>
-        </w:rPr>
-        <w:t xml:space="preserve">, </w:t>
-      </w:r>
-      <w:r>
-        <w:rPr>
-          <w:rFonts w:eastAsia="Calibri" w:cs="Times New Roman"/>
-          <w:color w:val="000000" w:themeColor="text1"/>
-          <w:kern w:val="0"/>
-          <w14:ligatures w14:val="none"/>
-        </w:rPr>
-        <w:t xml:space="preserve">mais </w:t>
-      </w:r>
-      <w:r>
-        <w:rPr>
-          <w:rFonts w:eastAsia="Calibri" w:cs="Times New Roman"/>
-          <w:color w:val="000000" w:themeColor="text1"/>
-          <w:kern w:val="0"/>
-          <w14:ligatures w14:val="none"/>
-        </w:rPr>
-        <w:t xml:space="preserve">toujours </w:t>
-      </w:r>
-      <w:r>
-        <w:rPr>
-          <w:rFonts w:eastAsia="Calibri" w:cs="Times New Roman"/>
-          <w:color w:val="000000" w:themeColor="text1"/>
-          <w:kern w:val="0"/>
-          <w14:ligatures w14:val="none"/>
-        </w:rPr>
-        <w:t xml:space="preserve">à la fin complète du tour </w:t>
-      </w:r>
-      <w:r>
-        <w:rPr>
-          <w:rFonts w:eastAsia="Calibri" w:cs="Times New Roman"/>
-          <w:color w:val="000000" w:themeColor="text1"/>
-          <w:kern w:val="0"/>
-          <w14:ligatures w14:val="none"/>
-        </w:rPr>
-        <w:t>du</w:t>
-      </w:r>
-      <w:r>
-        <w:rPr>
-          <w:rFonts w:eastAsia="Calibri" w:cs="Times New Roman"/>
-          <w:color w:val="000000" w:themeColor="text1"/>
-          <w:kern w:val="0"/>
-          <w14:ligatures w14:val="none"/>
-        </w:rPr>
-        <w:t xml:space="preserve"> joueur</w:t>
-      </w:r>
-      <w:r>
-        <w:rPr>
-          <w:rFonts w:eastAsia="Calibri" w:cs="Times New Roman"/>
-          <w:color w:val="000000" w:themeColor="text1"/>
-          <w:kern w:val="0"/>
-          <w14:ligatures w14:val="none"/>
-        </w:rPr>
-        <w:t xml:space="preserve"> actif, sous les conditions suivantes :</w:t>
-      </w:r>
-    </w:p>
-    <w:p>
-      <w:pPr>
-        <w:pStyle w:val="Paragraphedeliste"/>
-        <w:numPr>
-          <w:ilvl w:val="0"/>
-          <w:numId w:val="7"/>
-        </w:numPr>
-        <w:jc w:val="both"/>
-        <w:rPr>
-          <w:rFonts w:eastAsia="Calibri" w:cs="Times New Roman"/>
-          <w:color w:val="000000" w:themeColor="text1"/>
-          <w:kern w:val="0"/>
-          <w14:ligatures w14:val="none"/>
-        </w:rPr>
-      </w:pPr>
-      <w:r>
-        <w:rPr>
-          <w:rFonts w:eastAsia="Calibri" w:cs="Times New Roman"/>
-          <w:color w:val="000000" w:themeColor="text1"/>
-          <w:kern w:val="0"/>
-          <w14:ligatures w14:val="none"/>
-        </w:rPr>
-        <w:t>S</w:t>
-      </w:r>
-      <w:r>
-        <w:rPr>
-          <w:rFonts w:eastAsia="Calibri" w:cs="Times New Roman"/>
-          <w:color w:val="000000" w:themeColor="text1"/>
-          <w:kern w:val="0"/>
-          <w14:ligatures w14:val="none"/>
-        </w:rPr>
-        <w:t>i le joueur actif</w:t>
-      </w:r>
-      <w:r>
-        <w:rPr>
-          <w:rFonts w:eastAsia="Calibri" w:cs="Times New Roman"/>
-          <w:color w:val="000000" w:themeColor="text1"/>
-          <w:kern w:val="0"/>
-          <w14:ligatures w14:val="none"/>
-        </w:rPr>
-        <w:t xml:space="preserve"> </w:t>
-      </w:r>
-      <w:r>
-        <w:rPr>
-          <w:rFonts w:eastAsia="Calibri" w:cs="Times New Roman"/>
-          <w:color w:val="000000" w:themeColor="text1"/>
-          <w:kern w:val="0"/>
-          <w14:ligatures w14:val="none"/>
-        </w:rPr>
-        <w:t xml:space="preserve">ne </w:t>
-      </w:r>
-      <w:r>
-        <w:rPr>
-          <w:rFonts w:eastAsia="Calibri" w:cs="Times New Roman"/>
-          <w:color w:val="000000" w:themeColor="text1"/>
-          <w:kern w:val="0"/>
-          <w14:ligatures w14:val="none"/>
-        </w:rPr>
-        <w:t>possède</w:t>
-      </w:r>
-      <w:r>
-        <w:rPr>
-          <w:rFonts w:eastAsia="Calibri" w:cs="Times New Roman"/>
-          <w:color w:val="000000" w:themeColor="text1"/>
-          <w:kern w:val="0"/>
-          <w14:ligatures w14:val="none"/>
-        </w:rPr>
-        <w:t xml:space="preserve"> plus que</w:t>
-      </w:r>
-      <w:r>
-        <w:rPr>
-          <w:rFonts w:eastAsia="Calibri" w:cs="Times New Roman"/>
-          <w:color w:val="000000" w:themeColor="text1"/>
-          <w:kern w:val="0"/>
-          <w14:ligatures w14:val="none"/>
-        </w:rPr>
-        <w:t xml:space="preserve"> </w:t>
-      </w:r>
-      <w:r>
-        <w:rPr>
-          <w:rFonts w:eastAsia="Calibri" w:cs="Times New Roman"/>
           <w:b/>
           <w:bCs/>
           <w:color w:val="EE0000"/>
           <w:kern w:val="0"/>
           <w14:ligatures w14:val="none"/>
         </w:rPr>
-        <w:t>5 troupes ou moins</w:t>
-      </w:r>
-      <w:r>
-        <w:rPr>
-          <w:rFonts w:eastAsia="Calibri" w:cs="Times New Roman"/>
+        <w:t xml:space="preserve">uniquement </w:t>
+      </w:r>
+      <w:r>
+        <w:rPr>
           <w:color w:val="000000" w:themeColor="text1"/>
           <w:kern w:val="0"/>
           <w14:ligatures w14:val="none"/>
         </w:rPr>
-        <w:t xml:space="preserve">, </w:t>
-      </w:r>
-      <w:r>
-        <w:rPr>
-          <w:rFonts w:eastAsia="Calibri" w:cs="Times New Roman"/>
-          <w:color w:val="000000" w:themeColor="text1"/>
-          <w:kern w:val="0"/>
-          <w14:ligatures w14:val="none"/>
-        </w:rPr>
-        <w:t>terrain</w:t>
-      </w:r>
-      <w:r>
-        <w:rPr>
-          <w:rFonts w:eastAsia="Calibri" w:cs="Times New Roman"/>
-          <w:color w:val="000000" w:themeColor="text1"/>
-          <w:kern w:val="0"/>
-          <w14:ligatures w14:val="none"/>
-        </w:rPr>
-        <w:t xml:space="preserve"> et réserve compris ; c’est la fin par « </w:t>
-      </w:r>
-      <w:r>
-        <w:rPr>
-          <w:rFonts w:eastAsia="Calibri" w:cs="Times New Roman"/>
+        <w:t>de</w:t>
+      </w:r>
+      <w:r>
+        <w:rPr>
           <w:b/>
           <w:bCs/>
-          <w:color w:val="000000" w:themeColor="text1"/>
-          <w:kern w:val="0"/>
-          <w14:ligatures w14:val="none"/>
-        </w:rPr>
-        <w:t>épuisement des troupes</w:t>
-      </w:r>
-      <w:r>
-        <w:rPr>
-          <w:rFonts w:eastAsia="Calibri" w:cs="Times New Roman"/>
-          <w:color w:val="000000" w:themeColor="text1"/>
-          <w:kern w:val="0"/>
-          <w14:ligatures w14:val="none"/>
-        </w:rPr>
-        <w:t> ».</w:t>
-      </w:r>
-      <w:r>
-        <w:rPr>
-          <w:rFonts w:eastAsia="Calibri" w:cs="Times New Roman"/>
-          <w:color w:val="000000" w:themeColor="text1"/>
-          <w:kern w:val="0"/>
-          <w14:ligatures w14:val="none"/>
-        </w:rPr>
-        <w:t xml:space="preserve"> </w:t>
-      </w:r>
-      <w:r>
-        <w:rPr>
-          <w:rFonts w:eastAsia="Calibri" w:cs="Times New Roman"/>
+          <w:color w:val="EE0000"/>
+          <w:kern w:val="0"/>
+          <w14:ligatures w14:val="none"/>
+        </w:rPr>
+        <w:t xml:space="preserve"> l'état courant du plateau</w:t>
+      </w:r>
+      <w:r>
+        <w:rPr>
+          <w:kern w:val="0"/>
+          <w14:ligatures w14:val="none"/>
+        </w:rPr>
+        <w:t>. Si un Donjon est détruit, les points associés sont perdus.</w:t>
+      </w:r>
+    </w:p>
+    <w:p>
+      <w:pPr>
+        <w:keepNext/>
+        <w:keepLines/>
+        <w:numPr>
+          <w:ilvl w:val="1"/>
+          <w:numId w:val="6"/>
+        </w:numPr>
+        <w:spacing w:before="240" w:after="0"/>
+        <w:outlineLvl w:val="0"/>
+        <w:rPr>
+          <w:rFonts w:eastAsia="Times New Roman" w:cs="Times New Roman"/>
+          <w:color w:val="0070C0"/>
+          <w:kern w:val="0"/>
+          <w:sz w:val="32"/>
+          <w:szCs w:val="32"/>
+          <w14:ligatures w14:val="none"/>
+        </w:rPr>
+      </w:pPr>
+      <w:r>
+        <w:rPr>
+          <w:rFonts w:eastAsia="Times New Roman" w:cs="Times New Roman"/>
+          <w:color w:val="0070C0"/>
+          <w:kern w:val="0"/>
+          <w:sz w:val="32"/>
+          <w:szCs w:val="32"/>
+          <w14:ligatures w14:val="none"/>
+        </w:rPr>
+        <w:t>Fin de la partie</w:t>
+      </w:r>
+    </w:p>
+    <w:p>
+      <w:pPr>
+        <w:jc w:val="both"/>
+        <w:rPr>
+          <w:kern w:val="0"/>
+          <w14:ligatures w14:val="none"/>
+        </w:rPr>
+      </w:pPr>
+      <w:r>
+        <w:rPr>
+          <w:kern w:val="0"/>
+          <w14:ligatures w14:val="none"/>
+        </w:rPr>
+        <w:t>La partie s’arrête immédiatement à la fin du tour du joueur actif si l'une des deux conditions suivantes est remplie :</w:t>
+      </w:r>
+    </w:p>
+    <w:p>
+      <w:pPr>
+        <w:numPr>
+          <w:ilvl w:val="0"/>
+          <w:numId w:val="12"/>
+        </w:numPr>
+        <w:jc w:val="both"/>
+        <w:rPr>
+          <w:kern w:val="0"/>
+          <w14:ligatures w14:val="none"/>
+        </w:rPr>
+      </w:pPr>
+      <w:r>
+        <w:rPr>
+          <w:b/>
+          <w:bCs/>
+          <w:kern w:val="0"/>
+          <w14:ligatures w14:val="none"/>
+        </w:rPr>
+        <w:t>La Suprématie :</w:t>
+      </w:r>
+      <w:r>
+        <w:rPr>
+          <w:kern w:val="0"/>
+          <w14:ligatures w14:val="none"/>
+        </w:rPr>
+        <w:t xml:space="preserve"> Le joueur actif atteint ou dépasse le </w:t>
+      </w:r>
+      <w:r>
+        <w:rPr>
+          <w:b/>
+          <w:bCs/>
+          <w:kern w:val="0"/>
+          <w14:ligatures w14:val="none"/>
+        </w:rPr>
+        <w:t>Seuil Critique</w:t>
+      </w:r>
+      <w:r>
+        <w:rPr>
+          <w:kern w:val="0"/>
+          <w14:ligatures w14:val="none"/>
+        </w:rPr>
+        <w:t xml:space="preserve"> de points. </w:t>
+      </w:r>
+      <w:r>
+        <w:rPr>
           <w:i/>
           <w:iCs/>
           <w:color w:val="0070C0"/>
           <w:kern w:val="0"/>
           <w14:ligatures w14:val="none"/>
         </w:rPr>
-        <w:t>Le sang a trop coulé et les hérauts sonnent la fin des combats</w:t>
-      </w:r>
-      <w:r>
-        <w:rPr>
-          <w:rFonts w:eastAsia="Calibri" w:cs="Times New Roman"/>
-          <w:color w:val="000000" w:themeColor="text1"/>
-          <w:kern w:val="0"/>
-          <w14:ligatures w14:val="none"/>
-        </w:rPr>
-        <w:t>.</w:t>
+        <w:t>Son influence est telle que ses rivaux n'ont d'autre choix que de ployer le genou.</w:t>
       </w:r>
     </w:p>
     <w:p>
       <w:pPr>
-        <w:pStyle w:val="Paragraphedeliste"/>
         <w:numPr>
           <w:ilvl w:val="0"/>
-          <w:numId w:val="7"/>
+          <w:numId w:val="12"/>
         </w:numPr>
         <w:jc w:val="both"/>
         <w:rPr>
-          <w:rFonts w:eastAsia="Calibri" w:cs="Times New Roman"/>
-          <w:color w:val="000000" w:themeColor="text1"/>
-          <w:kern w:val="0"/>
-          <w14:ligatures w14:val="none"/>
-        </w:rPr>
-      </w:pPr>
-      <w:r>
-        <w:rPr>
-          <w:rFonts w:eastAsia="Calibri" w:cs="Times New Roman"/>
-          <w:color w:val="000000" w:themeColor="text1"/>
-          <w:kern w:val="0"/>
-          <w14:ligatures w14:val="none"/>
-        </w:rPr>
-        <w:t>S</w:t>
-      </w:r>
-      <w:r>
-        <w:rPr>
-          <w:rFonts w:eastAsia="Calibri" w:cs="Times New Roman"/>
-          <w:color w:val="000000" w:themeColor="text1"/>
-          <w:kern w:val="0"/>
-          <w14:ligatures w14:val="none"/>
-        </w:rPr>
-        <w:t>i le joueur actif</w:t>
-      </w:r>
-      <w:r>
-        <w:rPr>
-          <w:rFonts w:eastAsia="Calibri" w:cs="Times New Roman"/>
-          <w:color w:val="000000" w:themeColor="text1"/>
-          <w:kern w:val="0"/>
-          <w14:ligatures w14:val="none"/>
-        </w:rPr>
-        <w:t xml:space="preserve"> a atteint ou dépassé </w:t>
-      </w:r>
-      <w:r>
-        <w:rPr>
-          <w:rFonts w:eastAsia="Calibri" w:cs="Times New Roman"/>
-          <w:color w:val="000000" w:themeColor="text1"/>
-          <w:kern w:val="0"/>
-          <w14:ligatures w14:val="none"/>
-        </w:rPr>
-        <w:t>le</w:t>
-      </w:r>
-      <w:r>
-        <w:rPr>
-          <w:rFonts w:eastAsia="Calibri" w:cs="Times New Roman"/>
-          <w:color w:val="000000" w:themeColor="text1"/>
-          <w:kern w:val="0"/>
-          <w14:ligatures w14:val="none"/>
-        </w:rPr>
-        <w:t xml:space="preserve"> </w:t>
-      </w:r>
-      <w:r>
-        <w:rPr>
-          <w:rFonts w:eastAsia="Calibri" w:cs="Times New Roman"/>
+          <w:kern w:val="0"/>
+          <w14:ligatures w14:val="none"/>
+        </w:rPr>
+      </w:pPr>
+      <w:r>
+        <w:rPr>
           <w:b/>
           <w:bCs/>
-          <w:color w:val="EE0000"/>
-          <w:kern w:val="0"/>
-          <w14:ligatures w14:val="none"/>
-        </w:rPr>
-        <w:t>seuil critique de points</w:t>
-      </w:r>
-      <w:r>
-        <w:rPr>
-          <w:rFonts w:eastAsia="Calibri" w:cs="Times New Roman"/>
-          <w:color w:val="EE0000"/>
-          <w:kern w:val="0"/>
-          <w14:ligatures w14:val="none"/>
-        </w:rPr>
-        <w:t> </w:t>
-      </w:r>
-      <w:r>
-        <w:rPr>
-          <w:rFonts w:eastAsia="Calibri" w:cs="Times New Roman"/>
-          <w:color w:val="000000" w:themeColor="text1"/>
-          <w:kern w:val="0"/>
-          <w14:ligatures w14:val="none"/>
-        </w:rPr>
-        <w:t>(</w:t>
-      </w:r>
-      <w:r>
-        <w:rPr>
-          <w:rFonts w:eastAsia="Calibri" w:cs="Times New Roman"/>
-          <w:color w:val="000000" w:themeColor="text1"/>
-          <w:kern w:val="0"/>
-          <w14:ligatures w14:val="none"/>
-        </w:rPr>
-        <w:t>qui dépend</w:t>
-      </w:r>
-      <w:r>
-        <w:rPr>
-          <w:rFonts w:eastAsia="Calibri" w:cs="Times New Roman"/>
-          <w:color w:val="000000" w:themeColor="text1"/>
-          <w:kern w:val="0"/>
-          <w14:ligatures w14:val="none"/>
-        </w:rPr>
-        <w:t xml:space="preserve"> du nombre de joueurs) ;</w:t>
-      </w:r>
-      <w:r>
-        <w:rPr>
-          <w:rFonts w:eastAsia="Calibri" w:cs="Times New Roman"/>
-          <w:color w:val="000000" w:themeColor="text1"/>
-          <w:kern w:val="0"/>
-          <w14:ligatures w14:val="none"/>
-        </w:rPr>
-        <w:t xml:space="preserve"> c’est la fin par « </w:t>
-      </w:r>
-      <w:r>
-        <w:rPr>
-          <w:rFonts w:eastAsia="Calibri" w:cs="Times New Roman"/>
+          <w:kern w:val="0"/>
+          <w14:ligatures w14:val="none"/>
+        </w:rPr>
+        <w:t>L’Épuisement :</w:t>
+      </w:r>
+      <w:r>
+        <w:rPr>
+          <w:kern w:val="0"/>
+          <w14:ligatures w14:val="none"/>
+        </w:rPr>
+        <w:t xml:space="preserve"> Le joueur actif ne possède plus que </w:t>
+      </w:r>
+      <w:r>
+        <w:rPr>
           <w:b/>
           <w:bCs/>
-          <w:color w:val="000000" w:themeColor="text1"/>
-          <w:kern w:val="0"/>
-          <w14:ligatures w14:val="none"/>
-        </w:rPr>
-        <w:t xml:space="preserve">atteinte de la </w:t>
-      </w:r>
-      <w:r>
-        <w:rPr>
-          <w:rFonts w:eastAsia="Calibri" w:cs="Times New Roman"/>
-          <w:b/>
-          <w:bCs/>
-          <w:color w:val="000000" w:themeColor="text1"/>
-          <w:kern w:val="0"/>
-          <w14:ligatures w14:val="none"/>
-        </w:rPr>
-        <w:t>suprématie</w:t>
-      </w:r>
-      <w:r>
-        <w:rPr>
-          <w:rFonts w:eastAsia="Calibri" w:cs="Times New Roman"/>
-          <w:color w:val="000000" w:themeColor="text1"/>
-          <w:kern w:val="0"/>
-          <w14:ligatures w14:val="none"/>
-        </w:rPr>
-        <w:t>.</w:t>
-      </w:r>
-      <w:r>
-        <w:rPr>
-          <w:rFonts w:eastAsia="Calibri" w:cs="Times New Roman"/>
-          <w:color w:val="000000" w:themeColor="text1"/>
-          <w:kern w:val="0"/>
-          <w14:ligatures w14:val="none"/>
-        </w:rPr>
-        <w:t xml:space="preserve"> </w:t>
-      </w:r>
-      <w:r>
-        <w:rPr>
-          <w:rFonts w:eastAsia="Calibri" w:cs="Times New Roman"/>
+          <w:kern w:val="0"/>
+          <w14:ligatures w14:val="none"/>
+        </w:rPr>
+        <w:t>5 Troupes ou moins</w:t>
+      </w:r>
+      <w:r>
+        <w:rPr>
+          <w:kern w:val="0"/>
+          <w14:ligatures w14:val="none"/>
+        </w:rPr>
+        <w:t xml:space="preserve"> (plateau et réserve compris). </w:t>
+      </w:r>
+      <w:r>
+        <w:rPr>
           <w:i/>
           <w:iCs/>
           <w:color w:val="0070C0"/>
           <w:kern w:val="0"/>
           <w14:ligatures w14:val="none"/>
         </w:rPr>
-        <w:t>Son influence est devenue telle que ses rivaux n'ont d'autre choix que de ployer le genou</w:t>
-      </w:r>
-      <w:r>
-        <w:rPr>
-          <w:rFonts w:eastAsia="Calibri" w:cs="Times New Roman"/>
-          <w:color w:val="000000" w:themeColor="text1"/>
-          <w:kern w:val="0"/>
-          <w14:ligatures w14:val="none"/>
-        </w:rPr>
-        <w:t>.</w:t>
+        <w:t>Le sang a trop coulé et les hérauts sonnent la fin des combats.</w:t>
       </w:r>
     </w:p>
     <w:tbl>
@@ -4029,8 +3847,8 @@
         <w:tblLook w:val="04A0" w:firstRow="1" w:lastRow="0" w:firstColumn="1" w:lastColumn="0" w:noHBand="0" w:noVBand="1"/>
       </w:tblPr>
       <w:tblGrid>
-        <w:gridCol w:w="1858"/>
-        <w:gridCol w:w="1093"/>
+        <w:gridCol w:w="1912"/>
+        <w:gridCol w:w="1124"/>
       </w:tblGrid>
       <w:tr>
         <w:trPr>
@@ -4063,7 +3881,29 @@
                 <w:kern w:val="0"/>
                 <w14:ligatures w14:val="none"/>
               </w:rPr>
-              <w:t>Seuil de suprématie</w:t>
+              <w:t xml:space="preserve">Seuil </w:t>
+            </w:r>
+            <w:r>
+              <w:rPr>
+                <w:rFonts w:eastAsia="Calibri" w:cs="Times New Roman"/>
+                <w:b/>
+                <w:bCs/>
+                <w:color w:val="000000" w:themeColor="text1"/>
+                <w:kern w:val="0"/>
+                <w14:ligatures w14:val="none"/>
+              </w:rPr>
+              <w:t xml:space="preserve">critique </w:t>
+            </w:r>
+            <w:r>
+              <w:rPr>
+                <w:rFonts w:eastAsia="Calibri" w:cs="Times New Roman"/>
+                <w:b/>
+                <w:bCs/>
+                <w:color w:val="000000" w:themeColor="text1"/>
+                <w:kern w:val="0"/>
+                <w14:ligatures w14:val="none"/>
+              </w:rPr>
+              <w:t>de suprématie</w:t>
             </w:r>
           </w:p>
         </w:tc>
@@ -4203,16 +4043,7 @@
                 <w:kern w:val="0"/>
                 <w14:ligatures w14:val="none"/>
               </w:rPr>
-              <w:t>Partie à 4</w:t>
-            </w:r>
-            <w:r>
-              <w:rPr>
-                <w:rFonts w:eastAsia="Calibri" w:cs="Times New Roman"/>
-                <w:color w:val="000000" w:themeColor="text1"/>
-                <w:kern w:val="0"/>
-                <w14:ligatures w14:val="none"/>
-              </w:rPr>
-              <w:t xml:space="preserve"> joueurs</w:t>
+              <w:t>Partie à 4 joueurs</w:t>
             </w:r>
           </w:p>
         </w:tc>
@@ -4247,8 +4078,6 @@
       <w:pPr>
         <w:jc w:val="both"/>
         <w:rPr>
-          <w:rFonts w:eastAsia="Calibri" w:cs="Times New Roman"/>
-          <w:color w:val="000000" w:themeColor="text1"/>
           <w:kern w:val="0"/>
           <w14:ligatures w14:val="none"/>
         </w:rPr>
@@ -4256,45 +4085,52 @@
     </w:p>
     <w:p>
       <w:pPr>
+        <w:keepNext/>
+        <w:keepLines/>
+        <w:numPr>
+          <w:ilvl w:val="1"/>
+          <w:numId w:val="6"/>
+        </w:numPr>
+        <w:spacing w:before="240" w:after="0"/>
+        <w:outlineLvl w:val="0"/>
+        <w:rPr>
+          <w:rFonts w:eastAsia="Times New Roman" w:cs="Times New Roman"/>
+          <w:color w:val="0070C0"/>
+          <w:kern w:val="0"/>
+          <w:sz w:val="32"/>
+          <w:szCs w:val="32"/>
+          <w14:ligatures w14:val="none"/>
+        </w:rPr>
+      </w:pPr>
+      <w:r>
+        <w:rPr>
+          <w:rFonts w:eastAsia="Times New Roman" w:cs="Times New Roman"/>
+          <w:color w:val="0070C0"/>
+          <w:kern w:val="0"/>
+          <w:sz w:val="32"/>
+          <w:szCs w:val="32"/>
+          <w14:ligatures w14:val="none"/>
+        </w:rPr>
+        <w:t>Détermination du Vainqueur</w:t>
+      </w:r>
+    </w:p>
+    <w:p>
+      <w:pPr>
         <w:jc w:val="both"/>
         <w:rPr>
-          <w:rFonts w:eastAsia="Calibri" w:cs="Times New Roman"/>
-          <w:color w:val="000000"/>
-          <w:kern w:val="0"/>
-          <w14:ligatures w14:val="none"/>
-        </w:rPr>
-      </w:pPr>
-      <w:r>
-        <w:rPr>
-          <w:rFonts w:eastAsia="Calibri" w:cs="Times New Roman"/>
-          <w:color w:val="000000"/>
-          <w:kern w:val="0"/>
-          <w14:ligatures w14:val="none"/>
-        </w:rPr>
-        <w:t>Quel que</w:t>
-      </w:r>
-      <w:r>
-        <w:rPr>
-          <w:rFonts w:eastAsia="Calibri" w:cs="Times New Roman"/>
-          <w:color w:val="000000"/>
-          <w:kern w:val="0"/>
-          <w14:ligatures w14:val="none"/>
-        </w:rPr>
-        <w:t xml:space="preserve"> soit</w:t>
-      </w:r>
-      <w:r>
-        <w:rPr>
-          <w:rFonts w:eastAsia="Calibri" w:cs="Times New Roman"/>
-          <w:color w:val="000000"/>
-          <w:kern w:val="0"/>
-          <w14:ligatures w14:val="none"/>
-        </w:rPr>
-        <w:t xml:space="preserve"> </w:t>
-      </w:r>
-      <w:r>
-        <w:rPr>
-          <w:rFonts w:eastAsia="Calibri" w:cs="Times New Roman"/>
-          <w:color w:val="000000"/>
+          <w:kern w:val="0"/>
+          <w14:ligatures w14:val="none"/>
+        </w:rPr>
+      </w:pPr>
+      <w:r>
+        <w:rPr>
+          <w:kern w:val="0"/>
+          <w14:ligatures w14:val="none"/>
+        </w:rPr>
+        <w:t xml:space="preserve">Une fois </w:t>
+      </w:r>
+      <w:r>
+        <w:rPr>
           <w:kern w:val="0"/>
           <w14:ligatures w14:val="none"/>
         </w:rPr>
@@ -4302,139 +4138,171 @@
       </w:r>
       <w:r>
         <w:rPr>
-          <w:rFonts w:eastAsia="Calibri" w:cs="Times New Roman"/>
-          <w:color w:val="000000"/>
-          <w:kern w:val="0"/>
-          <w14:ligatures w14:val="none"/>
-        </w:rPr>
-        <w:t xml:space="preserve">, les joueurs sont classés </w:t>
-      </w:r>
-      <w:r>
-        <w:rPr>
-          <w:rFonts w:eastAsia="Calibri" w:cs="Times New Roman"/>
-          <w:color w:val="000000"/>
-          <w:kern w:val="0"/>
-          <w14:ligatures w14:val="none"/>
-        </w:rPr>
-        <w:t xml:space="preserve">selon </w:t>
-      </w:r>
-      <w:r>
-        <w:rPr>
-          <w:rFonts w:eastAsia="Calibri" w:cs="Times New Roman"/>
-          <w:color w:val="000000"/>
-          <w:kern w:val="0"/>
-          <w14:ligatures w14:val="none"/>
-        </w:rPr>
-        <w:t>leur</w:t>
-      </w:r>
-      <w:r>
-        <w:rPr>
-          <w:rFonts w:eastAsia="Calibri" w:cs="Times New Roman"/>
-          <w:color w:val="000000"/>
-          <w:kern w:val="0"/>
-          <w14:ligatures w14:val="none"/>
-        </w:rPr>
-        <w:t>s</w:t>
-      </w:r>
-      <w:r>
-        <w:rPr>
-          <w:rFonts w:eastAsia="Calibri" w:cs="Times New Roman"/>
-          <w:color w:val="000000"/>
-          <w:kern w:val="0"/>
-          <w14:ligatures w14:val="none"/>
-        </w:rPr>
-        <w:t xml:space="preserve"> </w:t>
-      </w:r>
-      <w:r>
-        <w:rPr>
-          <w:rFonts w:eastAsia="Calibri" w:cs="Times New Roman"/>
-          <w:color w:val="000000"/>
-          <w:kern w:val="0"/>
-          <w14:ligatures w14:val="none"/>
-        </w:rPr>
-        <w:t>scores d</w:t>
-      </w:r>
-      <w:r>
-        <w:rPr>
-          <w:rFonts w:eastAsia="Calibri" w:cs="Times New Roman"/>
-          <w:color w:val="000000"/>
-          <w:kern w:val="0"/>
-          <w14:ligatures w14:val="none"/>
-        </w:rPr>
-        <w:t xml:space="preserve">e </w:t>
-      </w:r>
-      <w:r>
-        <w:rPr>
-          <w:rFonts w:eastAsia="Calibri" w:cs="Times New Roman"/>
-          <w:color w:val="000000"/>
-          <w:kern w:val="0"/>
-          <w14:ligatures w14:val="none"/>
-        </w:rPr>
-        <w:t>points</w:t>
-      </w:r>
-      <w:r>
-        <w:rPr>
-          <w:rFonts w:eastAsia="Calibri" w:cs="Times New Roman"/>
-          <w:color w:val="000000"/>
-          <w:kern w:val="0"/>
-          <w14:ligatures w14:val="none"/>
-        </w:rPr>
-        <w:t> :</w:t>
-      </w:r>
-      <w:r>
-        <w:rPr>
-          <w:rFonts w:eastAsia="Calibri" w:cs="Times New Roman"/>
-          <w:color w:val="000000"/>
-          <w:kern w:val="0"/>
-          <w14:ligatures w14:val="none"/>
-        </w:rPr>
-        <w:t xml:space="preserve"> </w:t>
-      </w:r>
-      <w:r>
-        <w:rPr>
-          <w:rFonts w:eastAsia="Calibri" w:cs="Times New Roman"/>
-          <w:color w:val="000000"/>
-          <w:kern w:val="0"/>
-          <w14:ligatures w14:val="none"/>
-        </w:rPr>
-        <w:t>points de tuiles + points de prestige + points de diversité</w:t>
-      </w:r>
-      <w:r>
-        <w:rPr>
-          <w:rFonts w:eastAsia="Calibri" w:cs="Times New Roman"/>
-          <w:color w:val="000000"/>
-          <w:kern w:val="0"/>
-          <w14:ligatures w14:val="none"/>
-        </w:rPr>
-        <w:t>. Le cas échéant, les joueurs sont départagés</w:t>
-      </w:r>
-      <w:r>
-        <w:rPr>
-          <w:rFonts w:eastAsia="Calibri" w:cs="Times New Roman"/>
-          <w:color w:val="000000"/>
-          <w:kern w:val="0"/>
-          <w14:ligatures w14:val="none"/>
-        </w:rPr>
-        <w:t>,</w:t>
-      </w:r>
-      <w:r>
-        <w:rPr>
-          <w:rFonts w:eastAsia="Calibri" w:cs="Times New Roman"/>
-          <w:color w:val="000000"/>
-          <w:kern w:val="0"/>
-          <w14:ligatures w14:val="none"/>
-        </w:rPr>
-        <w:t xml:space="preserve"> d’abord par leurs nombres de donjons, puis par leurs troupes disponibles.</w:t>
-      </w:r>
-      <w:r>
-        <w:rPr>
-          <w:rFonts w:eastAsia="Calibri" w:cs="Times New Roman"/>
-          <w:color w:val="000000"/>
-          <w:kern w:val="0"/>
-          <w14:ligatures w14:val="none"/>
-        </w:rPr>
-        <w:t xml:space="preserve"> Si l’égalité persiste, la victoire est partagée !</w:t>
-      </w:r>
+          <w:kern w:val="0"/>
+          <w14:ligatures w14:val="none"/>
+        </w:rPr>
+        <w:t xml:space="preserve"> prononcé</w:t>
+      </w:r>
+      <w:r>
+        <w:rPr>
+          <w:kern w:val="0"/>
+          <w14:ligatures w14:val="none"/>
+        </w:rPr>
+        <w:t>e</w:t>
+      </w:r>
+      <w:r>
+        <w:rPr>
+          <w:kern w:val="0"/>
+          <w14:ligatures w14:val="none"/>
+        </w:rPr>
+        <w:t>, le joueur ayant le score le plus élevé l'emporte. En cas d'égalité, les joueurs sont départagés selon l'ordre suivant :</w:t>
+      </w:r>
+    </w:p>
+    <w:p>
+      <w:pPr>
+        <w:numPr>
+          <w:ilvl w:val="0"/>
+          <w:numId w:val="14"/>
+        </w:numPr>
+        <w:jc w:val="both"/>
+        <w:rPr>
+          <w:kern w:val="0"/>
+          <w14:ligatures w14:val="none"/>
+        </w:rPr>
+      </w:pPr>
+      <w:r>
+        <w:rPr>
+          <w:kern w:val="0"/>
+          <w14:ligatures w14:val="none"/>
+        </w:rPr>
+        <w:t xml:space="preserve">Le plus grand nombre de </w:t>
+      </w:r>
+      <w:r>
+        <w:rPr>
+          <w:b/>
+          <w:bCs/>
+          <w:kern w:val="0"/>
+          <w14:ligatures w14:val="none"/>
+        </w:rPr>
+        <w:t>Donjons</w:t>
+      </w:r>
+      <w:r>
+        <w:rPr>
+          <w:kern w:val="0"/>
+          <w14:ligatures w14:val="none"/>
+        </w:rPr>
+        <w:t xml:space="preserve"> sur le plateau.</w:t>
+      </w:r>
+    </w:p>
+    <w:p>
+      <w:pPr>
+        <w:numPr>
+          <w:ilvl w:val="0"/>
+          <w:numId w:val="14"/>
+        </w:numPr>
+        <w:jc w:val="both"/>
+        <w:rPr>
+          <w:kern w:val="0"/>
+          <w14:ligatures w14:val="none"/>
+        </w:rPr>
+      </w:pPr>
+      <w:r>
+        <w:rPr>
+          <w:kern w:val="0"/>
+          <w14:ligatures w14:val="none"/>
+        </w:rPr>
+        <w:t xml:space="preserve">Le plus grand nombre de </w:t>
+      </w:r>
+      <w:r>
+        <w:rPr>
+          <w:b/>
+          <w:bCs/>
+          <w:kern w:val="0"/>
+          <w14:ligatures w14:val="none"/>
+        </w:rPr>
+        <w:t>Troupes</w:t>
+      </w:r>
+      <w:r>
+        <w:rPr>
+          <w:kern w:val="0"/>
+          <w14:ligatures w14:val="none"/>
+        </w:rPr>
+        <w:t xml:space="preserve"> disponibles (</w:t>
+      </w:r>
+      <w:r>
+        <w:rPr>
+          <w:kern w:val="0"/>
+          <w14:ligatures w14:val="none"/>
+        </w:rPr>
+        <w:t>plateau et réserve compris</w:t>
+      </w:r>
+      <w:r>
+        <w:rPr>
+          <w:kern w:val="0"/>
+          <w14:ligatures w14:val="none"/>
+        </w:rPr>
+        <w:t>).</w:t>
+      </w:r>
+    </w:p>
+    <w:p>
+      <w:pPr>
+        <w:numPr>
+          <w:ilvl w:val="0"/>
+          <w:numId w:val="14"/>
+        </w:numPr>
+        <w:jc w:val="both"/>
+        <w:rPr>
+          <w:kern w:val="0"/>
+          <w14:ligatures w14:val="none"/>
+        </w:rPr>
+      </w:pPr>
+      <w:r>
+        <w:rPr>
+          <w:kern w:val="0"/>
+          <w14:ligatures w14:val="none"/>
+        </w:rPr>
+        <w:t>Si l'égalité persiste, la victoire est partagée !</w:t>
+      </w:r>
+    </w:p>
+    <w:p>
+      <w:pPr>
+        <w:keepNext/>
+        <w:keepLines/>
+        <w:numPr>
+          <w:ilvl w:val="1"/>
+          <w:numId w:val="6"/>
+        </w:numPr>
+        <w:spacing w:before="240" w:after="0"/>
+        <w:outlineLvl w:val="0"/>
+        <w:rPr>
+          <w:rFonts w:eastAsia="Times New Roman" w:cs="Times New Roman"/>
+          <w:color w:val="0070C0"/>
+          <w:kern w:val="0"/>
+          <w:sz w:val="32"/>
+          <w:szCs w:val="32"/>
+          <w14:ligatures w14:val="none"/>
+        </w:rPr>
+      </w:pPr>
+      <w:r>
+        <w:rPr>
+          <w:rFonts w:eastAsia="Times New Roman" w:cs="Times New Roman"/>
+          <w:color w:val="0070C0"/>
+          <w:kern w:val="0"/>
+          <w:sz w:val="32"/>
+          <w:szCs w:val="32"/>
+          <w14:ligatures w14:val="none"/>
+        </w:rPr>
+        <w:t>Exemples de décomptes</w:t>
+      </w:r>
+    </w:p>
+    <w:p>
+      <w:pPr>
+        <w:jc w:val="both"/>
+        <w:rPr>
+          <w:kern w:val="0"/>
+          <w14:ligatures w14:val="none"/>
+        </w:rPr>
+      </w:pPr>
     </w:p>
     <w:tbl>
       <w:tblPr>
@@ -4451,7 +4319,7 @@
       </w:tblPr>
       <w:tblGrid>
         <w:gridCol w:w="4687"/>
-        <w:gridCol w:w="725"/>
+        <w:gridCol w:w="1939"/>
         <w:gridCol w:w="927"/>
         <w:gridCol w:w="1009"/>
         <w:gridCol w:w="599"/>
@@ -4463,7 +4331,6 @@
         <w:tc>
           <w:tcPr>
             <w:tcW w:w="0" w:type="auto"/>
-            <w:vMerge w:val="restart"/>
             <w:shd w:val="pct10" w:color="auto" w:fill="auto"/>
             <w:vAlign w:val="center"/>
           </w:tcPr>
@@ -4480,13 +4347,20 @@
                 <w:b/>
                 <w:bCs/>
               </w:rPr>
-              <w:t>Exemples de conquête</w:t>
+              <w:t>C</w:t>
             </w:r>
             <w:r>
               <w:rPr>
                 <w:b/>
                 <w:bCs/>
               </w:rPr>
+              <w:t>onquête</w:t>
+            </w:r>
+            <w:r>
+              <w:rPr>
+                <w:b/>
+                <w:bCs/>
+              </w:rPr>
               <w:t>s</w:t>
             </w:r>
           </w:p>
@@ -4494,7 +4368,6 @@
         <w:tc>
           <w:tcPr>
             <w:tcW w:w="0" w:type="auto"/>
-            <w:gridSpan w:val="4"/>
             <w:shd w:val="pct10" w:color="auto" w:fill="auto"/>
             <w:vAlign w:val="center"/>
           </w:tcPr>
@@ -4511,14 +4384,79 @@
                 <w:b/>
                 <w:bCs/>
               </w:rPr>
-              <w:t>Décompte des p</w:t>
+              <w:t>Terres</w:t>
             </w:r>
-            <w:r>
+          </w:p>
+        </w:tc>
+        <w:tc>
+          <w:tcPr>
+            <w:tcW w:w="0" w:type="auto"/>
+            <w:shd w:val="pct10" w:color="auto" w:fill="auto"/>
+            <w:vAlign w:val="center"/>
+          </w:tcPr>
+          <w:p>
+            <w:pPr>
+              <w:jc w:val="center"/>
               <w:rPr>
                 <w:b/>
                 <w:bCs/>
-              </w:rPr>
-              <w:t>oints</w:t>
+                <w:color w:val="000000" w:themeColor="text1"/>
+              </w:rPr>
+            </w:pPr>
+            <w:r>
+              <w:rPr>
+                <w:b/>
+                <w:bCs/>
+                <w:color w:val="000000" w:themeColor="text1"/>
+              </w:rPr>
+              <w:t>Prestige</w:t>
+            </w:r>
+          </w:p>
+        </w:tc>
+        <w:tc>
+          <w:tcPr>
+            <w:tcW w:w="0" w:type="auto"/>
+            <w:shd w:val="pct10" w:color="auto" w:fill="auto"/>
+          </w:tcPr>
+          <w:p>
+            <w:pPr>
+              <w:jc w:val="center"/>
+              <w:rPr>
+                <w:b/>
+                <w:bCs/>
+                <w:color w:val="000000" w:themeColor="text1"/>
+              </w:rPr>
+            </w:pPr>
+            <w:r>
+              <w:rPr>
+                <w:b/>
+                <w:bCs/>
+                <w:color w:val="000000" w:themeColor="text1"/>
+              </w:rPr>
+              <w:t>Diversité</w:t>
+            </w:r>
+          </w:p>
+        </w:tc>
+        <w:tc>
+          <w:tcPr>
+            <w:tcW w:w="0" w:type="auto"/>
+            <w:shd w:val="pct10" w:color="auto" w:fill="auto"/>
+            <w:vAlign w:val="center"/>
+          </w:tcPr>
+          <w:p>
+            <w:pPr>
+              <w:jc w:val="center"/>
+              <w:rPr>
+                <w:b/>
+                <w:bCs/>
+              </w:rPr>
+            </w:pPr>
+            <w:r>
+              <w:rPr>
+                <w:b/>
+                <w:bCs/>
+              </w:rPr>
+              <w:t>Total</w:t>
             </w:r>
           </w:p>
         </w:tc>
@@ -4530,122 +4468,6 @@
         <w:tc>
           <w:tcPr>
             <w:tcW w:w="0" w:type="auto"/>
-            <w:vMerge/>
-            <w:shd w:val="pct10" w:color="auto" w:fill="auto"/>
-            <w:vAlign w:val="center"/>
-          </w:tcPr>
-          <w:p>
-            <w:pPr>
-              <w:jc w:val="center"/>
-              <w:rPr>
-                <w:b/>
-                <w:bCs/>
-              </w:rPr>
-            </w:pPr>
-          </w:p>
-        </w:tc>
-        <w:tc>
-          <w:tcPr>
-            <w:tcW w:w="0" w:type="auto"/>
-            <w:shd w:val="pct10" w:color="auto" w:fill="auto"/>
-            <w:vAlign w:val="center"/>
-          </w:tcPr>
-          <w:p>
-            <w:pPr>
-              <w:jc w:val="center"/>
-              <w:rPr>
-                <w:b/>
-                <w:bCs/>
-              </w:rPr>
-            </w:pPr>
-            <w:r>
-              <w:rPr>
-                <w:b/>
-                <w:bCs/>
-              </w:rPr>
-              <w:t>Terres</w:t>
-            </w:r>
-          </w:p>
-        </w:tc>
-        <w:tc>
-          <w:tcPr>
-            <w:tcW w:w="0" w:type="auto"/>
-            <w:shd w:val="pct10" w:color="auto" w:fill="auto"/>
-            <w:vAlign w:val="center"/>
-          </w:tcPr>
-          <w:p>
-            <w:pPr>
-              <w:jc w:val="center"/>
-              <w:rPr>
-                <w:b/>
-                <w:bCs/>
-                <w:color w:val="FF0000"/>
-              </w:rPr>
-            </w:pPr>
-            <w:r>
-              <w:rPr>
-                <w:b/>
-                <w:bCs/>
-                <w:color w:val="FF0000"/>
-              </w:rPr>
-              <w:t>Prestige</w:t>
-            </w:r>
-          </w:p>
-        </w:tc>
-        <w:tc>
-          <w:tcPr>
-            <w:tcW w:w="0" w:type="auto"/>
-            <w:shd w:val="pct10" w:color="auto" w:fill="auto"/>
-          </w:tcPr>
-          <w:p>
-            <w:pPr>
-              <w:jc w:val="center"/>
-              <w:rPr>
-                <w:b/>
-                <w:bCs/>
-              </w:rPr>
-            </w:pPr>
-            <w:r>
-              <w:rPr>
-                <w:b/>
-                <w:bCs/>
-                <w:color w:val="FF0000"/>
-              </w:rPr>
-              <w:t>Diversité</w:t>
-            </w:r>
-          </w:p>
-        </w:tc>
-        <w:tc>
-          <w:tcPr>
-            <w:tcW w:w="0" w:type="auto"/>
-            <w:shd w:val="pct10" w:color="auto" w:fill="auto"/>
-            <w:vAlign w:val="center"/>
-          </w:tcPr>
-          <w:p>
-            <w:pPr>
-              <w:jc w:val="center"/>
-              <w:rPr>
-                <w:b/>
-                <w:bCs/>
-              </w:rPr>
-            </w:pPr>
-            <w:r>
-              <w:rPr>
-                <w:b/>
-                <w:bCs/>
-              </w:rPr>
-              <w:t>Total</w:t>
-            </w:r>
-          </w:p>
-        </w:tc>
-      </w:tr>
-      <w:tr>
-        <w:trPr>
-          <w:jc w:val="center"/>
-        </w:trPr>
-        <w:tc>
-          <w:tcPr>
-            <w:tcW w:w="0" w:type="auto"/>
             <w:vAlign w:val="center"/>
           </w:tcPr>
           <w:p>
@@ -4659,10 +4481,10 @@
               <mc:AlternateContent>
                 <mc:Choice Requires="wpc">
                   <w:drawing>
-                    <wp:inline distT="0" distB="0" distL="0" distR="0" wp14:anchorId="298D9F9F" wp14:editId="39316A88">
+                    <wp:inline distT="0" distB="0" distL="0" distR="0" wp14:anchorId="4363D9EE" wp14:editId="68AC53C1">
                       <wp:extent cx="2898949" cy="423545"/>
                       <wp:effectExtent l="0" t="0" r="0" b="0"/>
-                      <wp:docPr id="702881531" name="Zone de dessin 5"/>
+                      <wp:docPr id="2020550174" name="Zone de dessin 5"/>
                       <wp:cNvGraphicFramePr>
                         <a:graphicFrameLocks xmlns:a="http://schemas.openxmlformats.org/drawingml/2006/main" noChangeAspect="1"/>
                       </wp:cNvGraphicFramePr>
@@ -4677,7 +4499,7 @@
                             <wpc:whole/>
                             <pic:pic xmlns:pic="http://schemas.openxmlformats.org/drawingml/2006/picture">
                               <pic:nvPicPr>
-                                <pic:cNvPr id="717972038" name="Image 717972038"/>
+                                <pic:cNvPr id="790827220" name="Image 790827220"/>
                                 <pic:cNvPicPr>
                                   <a:picLocks noChangeAspect="1"/>
                                 </pic:cNvPicPr>
@@ -4708,7 +4530,7 @@
                             </pic:pic>
                             <pic:pic xmlns:pic="http://schemas.openxmlformats.org/drawingml/2006/picture">
                               <pic:nvPicPr>
-                                <pic:cNvPr id="690649683" name="Image 690649683"/>
+                                <pic:cNvPr id="1843665140" name="Image 1843665140"/>
                                 <pic:cNvPicPr>
                                   <a:picLocks noChangeAspect="1"/>
                                 </pic:cNvPicPr>
@@ -4739,7 +4561,7 @@
                             </pic:pic>
                             <pic:pic xmlns:pic="http://schemas.openxmlformats.org/drawingml/2006/picture">
                               <pic:nvPicPr>
-                                <pic:cNvPr id="1993848717" name="Image 1993848717"/>
+                                <pic:cNvPr id="777098419" name="Image 777098419"/>
                                 <pic:cNvPicPr>
                                   <a:picLocks noChangeAspect="1"/>
                                 </pic:cNvPicPr>
@@ -4770,7 +4592,7 @@
                             </pic:pic>
                             <pic:pic xmlns:pic="http://schemas.openxmlformats.org/drawingml/2006/picture">
                               <pic:nvPicPr>
-                                <pic:cNvPr id="494711082" name="Image 494711082"/>
+                                <pic:cNvPr id="998215774" name="Image 998215774"/>
                                 <pic:cNvPicPr>
                                   <a:picLocks noChangeAspect="1"/>
                                 </pic:cNvPicPr>
@@ -4801,7 +4623,7 @@
                             </pic:pic>
                             <pic:pic xmlns:pic="http://schemas.openxmlformats.org/drawingml/2006/picture">
                               <pic:nvPicPr>
-                                <pic:cNvPr id="53163942" name="Image 53163942" descr="Une image contenant boîte, pouf&#10;&#10;Le contenu généré par l’IA peut être incorrect."/>
+                                <pic:cNvPr id="1118964870" name="Image 1118964870" descr="Une image contenant boîte, pouf&#10;&#10;Le contenu généré par l’IA peut être incorrect."/>
                                 <pic:cNvPicPr>
                                   <a:picLocks noChangeAspect="1"/>
                                 </pic:cNvPicPr>
@@ -4853,7 +4675,7 @@
                 </mc:Choice>
                 <mc:Fallback>
                   <w:pict>
-                    <v:group w14:anchorId="09083E52" id="Zone de dessin 5" o:spid="_x0000_s1026" editas="canvas" style="width:228.25pt;height:33.35pt;mso-position-horizontal-relative:char;mso-position-vertical-relative:line" coordsize="28987,4235" o:gfxdata="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">
+                    <v:group w14:anchorId="6920E6E1" id="Zone de dessin 5" o:spid="_x0000_s1026" editas="canvas" style="width:228.25pt;height:33.35pt;mso-position-horizontal-relative:char;mso-position-vertical-relative:line" coordsize="28987,4235" o:gfxdata="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">
                       <v:shapetype id="_x0000_t75" coordsize="21600,21600" o:spt="75" o:preferrelative="t" path="m@4@5l@4@11@9@11@9@5xe" filled="f" stroked="f">
                         <v:stroke joinstyle="miter"/>
                         <v:formulas>
@@ -4877,19 +4699,19 @@
                         <v:fill o:detectmouseclick="t"/>
                         <v:path o:connecttype="none"/>
                       </v:shape>
-                      <v:shape id="Image 717972038" o:spid="_x0000_s1028" type="#_x0000_t75" style="position:absolute;left:814;top:409;width:4174;height:3600;visibility:visible;mso-wrap-style:square" o:gfxdata="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">
+                      <v:shape id="Image 790827220" o:spid="_x0000_s1028" type="#_x0000_t75" style="position:absolute;left:814;top:409;width:4174;height:3600;visibility:visible;mso-wrap-style:square" o:gfxdata="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">
                         <v:imagedata r:id="rId11" o:title=""/>
                       </v:shape>
-                      <v:shape id="Image 690649683" o:spid="_x0000_s1029" type="#_x0000_t75" style="position:absolute;left:5475;top:412;width:4172;height:3594;visibility:visible;mso-wrap-style:square" o:gfxdata="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">
+                      <v:shape id="Image 1843665140" o:spid="_x0000_s1029" type="#_x0000_t75" style="position:absolute;left:5475;top:412;width:4172;height:3594;visibility:visible;mso-wrap-style:square" o:gfxdata="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">
                         <v:imagedata r:id="rId12" o:title=""/>
                       </v:shape>
-                      <v:shape id="Image 1993848717" o:spid="_x0000_s1030" type="#_x0000_t75" style="position:absolute;left:10137;top:406;width:4172;height:3594;visibility:visible;mso-wrap-style:square" o:gfxdata="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">
+                      <v:shape id="Image 777098419" o:spid="_x0000_s1030" type="#_x0000_t75" style="position:absolute;left:10137;top:406;width:4172;height:3594;visibility:visible;mso-wrap-style:square" o:gfxdata="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">
                         <v:imagedata r:id="rId12" o:title=""/>
                       </v:shape>
-                      <v:shape id="Image 494711082" o:spid="_x0000_s1031" type="#_x0000_t75" style="position:absolute;left:14798;top:412;width:4165;height:3594;visibility:visible;mso-wrap-style:square" o:gfxdata="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">
+                      <v:shape id="Image 998215774" o:spid="_x0000_s1031" type="#_x0000_t75" style="position:absolute;left:14798;top:412;width:4165;height:3594;visibility:visible;mso-wrap-style:square" o:gfxdata="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">
                         <v:imagedata r:id="rId12" o:title=""/>
                       </v:shape>
-                      <v:shape id="Image 53163942" o:spid="_x0000_s1032" type="#_x0000_t75" alt="Une image contenant boîte, pouf&#10;&#10;Le contenu généré par l’IA peut être incorrect." style="position:absolute;left:19453;top:412;width:3740;height:3594;visibility:visible;mso-wrap-style:square" o:gfxdata="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">
+                      <v:shape id="Image 1118964870" o:spid="_x0000_s1032" type="#_x0000_t75" alt="Une image contenant boîte, pouf&#10;&#10;Le contenu généré par l’IA peut être incorrect." style="position:absolute;left:19453;top:412;width:3740;height:3594;visibility:visible;mso-wrap-style:square" o:gfxdata="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">
                         <v:imagedata r:id="rId13" o:title="Une image contenant boîte, pouf&#10;&#10;Le contenu généré par l’IA peut être incorrect" croptop="3188f" cropbottom="6289f" cropleft="2886f" cropright="2554f" recolortarget="#676767 [1454]"/>
                       </v:shape>
                       <w10:anchorlock/>
@@ -4910,7 +4732,7 @@
               <w:jc w:val="center"/>
             </w:pPr>
             <w:r>
-              <w:t>16</w:t>
+              <w:t>4+4+4+4 = 16</w:t>
             </w:r>
           </w:p>
         </w:tc>
@@ -4923,12 +4745,12 @@
             <w:pPr>
               <w:jc w:val="center"/>
               <w:rPr>
-                <w:color w:val="FF0000"/>
+                <w:color w:val="000000" w:themeColor="text1"/>
               </w:rPr>
             </w:pPr>
             <w:r>
               <w:rPr>
-                <w:color w:val="FF0000"/>
+                <w:color w:val="000000" w:themeColor="text1"/>
               </w:rPr>
               <w:t>4</w:t>
             </w:r>
@@ -4942,10 +4764,13 @@
           <w:p>
             <w:pPr>
               <w:jc w:val="center"/>
+              <w:rPr>
+                <w:color w:val="000000" w:themeColor="text1"/>
+              </w:rPr>
             </w:pPr>
             <w:r>
               <w:rPr>
-                <w:color w:val="FF0000"/>
+                <w:color w:val="000000" w:themeColor="text1"/>
               </w:rPr>
               <w:t>0</w:t>
             </w:r>
@@ -4983,13 +4808,14 @@
               <w:rPr>
                 <w:noProof/>
               </w:rPr>
+              <w:lastRenderedPageBreak/>
               <mc:AlternateContent>
                 <mc:Choice Requires="wpc">
                   <w:drawing>
-                    <wp:inline distT="0" distB="0" distL="0" distR="0" wp14:anchorId="37D0C018" wp14:editId="5E6626A5">
+                    <wp:inline distT="0" distB="0" distL="0" distR="0" wp14:anchorId="3615FA37" wp14:editId="042CE76D">
                       <wp:extent cx="2903973" cy="423545"/>
                       <wp:effectExtent l="0" t="0" r="0" b="0"/>
-                      <wp:docPr id="1451583641" name="Zone de dessin 5"/>
+                      <wp:docPr id="244798677" name="Zone de dessin 5"/>
                       <wp:cNvGraphicFramePr>
                         <a:graphicFrameLocks xmlns:a="http://schemas.openxmlformats.org/drawingml/2006/main" noChangeAspect="1"/>
                       </wp:cNvGraphicFramePr>
@@ -5004,7 +4830,7 @@
                             <wpc:whole/>
                             <pic:pic xmlns:pic="http://schemas.openxmlformats.org/drawingml/2006/picture">
                               <pic:nvPicPr>
-                                <pic:cNvPr id="1474360154" name="Image 1474360154"/>
+                                <pic:cNvPr id="708332321" name="Image 708332321"/>
                                 <pic:cNvPicPr>
                                   <a:picLocks noChangeAspect="1"/>
                                 </pic:cNvPicPr>
@@ -5035,7 +4861,7 @@
                             </pic:pic>
                             <pic:pic xmlns:pic="http://schemas.openxmlformats.org/drawingml/2006/picture">
                               <pic:nvPicPr>
-                                <pic:cNvPr id="1112997641" name="Image 1112997641"/>
+                                <pic:cNvPr id="1095466651" name="Image 1095466651"/>
                                 <pic:cNvPicPr>
                                   <a:picLocks noChangeAspect="1"/>
                                 </pic:cNvPicPr>
@@ -5066,7 +4892,7 @@
                             </pic:pic>
                             <pic:pic xmlns:pic="http://schemas.openxmlformats.org/drawingml/2006/picture">
                               <pic:nvPicPr>
-                                <pic:cNvPr id="1752962811" name="Image 1752962811"/>
+                                <pic:cNvPr id="1166859351" name="Image 1166859351"/>
                                 <pic:cNvPicPr>
                                   <a:picLocks noChangeAspect="1"/>
                                 </pic:cNvPicPr>
@@ -5097,7 +4923,7 @@
                             </pic:pic>
                             <pic:pic xmlns:pic="http://schemas.openxmlformats.org/drawingml/2006/picture">
                               <pic:nvPicPr>
-                                <pic:cNvPr id="1578393257" name="Image 1578393257"/>
+                                <pic:cNvPr id="1194763272" name="Image 1194763272"/>
                                 <pic:cNvPicPr>
                                   <a:picLocks noChangeAspect="1"/>
                                 </pic:cNvPicPr>
@@ -5128,7 +4954,7 @@
                             </pic:pic>
                             <pic:pic xmlns:pic="http://schemas.openxmlformats.org/drawingml/2006/picture">
                               <pic:nvPicPr>
-                                <pic:cNvPr id="1623856905" name="Image 1623856905" descr="Une image contenant nourriture, confiserie&#10;&#10;Le contenu généré par l’IA peut être incorrect."/>
+                                <pic:cNvPr id="981731205" name="Image 981731205" descr="Une image contenant nourriture, confiserie&#10;&#10;Le contenu généré par l’IA peut être incorrect."/>
                                 <pic:cNvPicPr>
                                   <a:picLocks noChangeAspect="1"/>
                                 </pic:cNvPicPr>
@@ -5167,7 +4993,7 @@
                             </pic:pic>
                             <pic:pic xmlns:pic="http://schemas.openxmlformats.org/drawingml/2006/picture">
                               <pic:nvPicPr>
-                                <pic:cNvPr id="239417245" name="Image 239417245" descr="Une image contenant nourriture, confiserie&#10;&#10;Le contenu généré par l’IA peut être incorrect."/>
+                                <pic:cNvPr id="2078084010" name="Image 2078084010" descr="Une image contenant nourriture, confiserie&#10;&#10;Le contenu généré par l’IA peut être incorrect."/>
                                 <pic:cNvPicPr>
                                   <a:picLocks noChangeAspect="1"/>
                                 </pic:cNvPicPr>
@@ -5212,27 +5038,27 @@
                 </mc:Choice>
                 <mc:Fallback>
                   <w:pict>
-                    <v:group w14:anchorId="6B05BAB4" id="Zone de dessin 5" o:spid="_x0000_s1026" editas="canvas" style="width:228.65pt;height:33.35pt;mso-position-horizontal-relative:char;mso-position-vertical-relative:line" coordsize="29038,4235" o:gfxdata="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">
+                    <v:group w14:anchorId="07F47B99" id="Zone de dessin 5" o:spid="_x0000_s1026" editas="canvas" style="width:228.65pt;height:33.35pt;mso-position-horizontal-relative:char;mso-position-vertical-relative:line" coordsize="29038,4235" o:gfxdata="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">
                       <v:shape id="_x0000_s1027" type="#_x0000_t75" style="position:absolute;width:29038;height:4235;visibility:visible;mso-wrap-style:square" filled="t">
                         <v:fill o:detectmouseclick="t"/>
                         <v:path o:connecttype="none"/>
                       </v:shape>
-                      <v:shape id="Image 1474360154" o:spid="_x0000_s1028" type="#_x0000_t75" style="position:absolute;left:865;top:418;width:4172;height:3594;visibility:visible;mso-wrap-style:square" o:gfxdata="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">
+                      <v:shape id="Image 708332321" o:spid="_x0000_s1028" type="#_x0000_t75" style="position:absolute;left:865;top:418;width:4172;height:3594;visibility:visible;mso-wrap-style:square" o:gfxdata="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">
                         <v:imagedata r:id="rId17" o:title=""/>
                       </v:shape>
-                      <v:shape id="Image 1112997641" o:spid="_x0000_s1029" type="#_x0000_t75" style="position:absolute;left:5517;top:418;width:4165;height:3594;visibility:visible;mso-wrap-style:square" o:gfxdata="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">
+                      <v:shape id="Image 1095466651" o:spid="_x0000_s1029" type="#_x0000_t75" style="position:absolute;left:5517;top:418;width:4165;height:3594;visibility:visible;mso-wrap-style:square" o:gfxdata="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">
                         <v:imagedata r:id="rId12" o:title=""/>
                       </v:shape>
-                      <v:shape id="Image 1752962811" o:spid="_x0000_s1030" type="#_x0000_t75" style="position:absolute;left:14780;top:409;width:4147;height:3600;visibility:visible;mso-wrap-style:square" o:gfxdata="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">
+                      <v:shape id="Image 1166859351" o:spid="_x0000_s1030" type="#_x0000_t75" style="position:absolute;left:14780;top:409;width:4147;height:3600;visibility:visible;mso-wrap-style:square" o:gfxdata="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">
                         <v:imagedata r:id="rId18" o:title=""/>
                       </v:shape>
-                      <v:shape id="Image 1578393257" o:spid="_x0000_s1031" type="#_x0000_t75" style="position:absolute;left:10159;top:411;width:4147;height:3600;visibility:visible;mso-wrap-style:square" o:gfxdata="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">
+                      <v:shape id="Image 1194763272" o:spid="_x0000_s1031" type="#_x0000_t75" style="position:absolute;left:10159;top:411;width:4147;height:3600;visibility:visible;mso-wrap-style:square" o:gfxdata="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">
                         <v:imagedata r:id="rId18" o:title=""/>
                       </v:shape>
-                      <v:shape id="Image 1623856905" o:spid="_x0000_s1032" type="#_x0000_t75" alt="Une image contenant nourriture, confiserie&#10;&#10;Le contenu généré par l’IA peut être incorrect." style="position:absolute;left:19402;top:416;width:2985;height:3594;visibility:visible;mso-wrap-style:square" o:gfxdata="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">
+                      <v:shape id="Image 981731205" o:spid="_x0000_s1032" type="#_x0000_t75" alt="Une image contenant nourriture, confiserie&#10;&#10;Le contenu généré par l’IA peut être incorrect." style="position:absolute;left:19402;top:416;width:2985;height:3594;visibility:visible;mso-wrap-style:square" o:gfxdata="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">
                         <v:imagedata r:id="rId19" o:title="Une image contenant nourriture, confiserie&#10;&#10;Le contenu généré par l’IA peut être incorrect" croptop="2887f" cropbottom="2593f" cropright="4235f"/>
                       </v:shape>
-                      <v:shape id="Image 239417245" o:spid="_x0000_s1033" type="#_x0000_t75" alt="Une image contenant nourriture, confiserie&#10;&#10;Le contenu généré par l’IA peut être incorrect." style="position:absolute;left:22861;top:413;width:2984;height:3594;visibility:visible;mso-wrap-style:square" o:gfxdata="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">
+                      <v:shape id="Image 2078084010" o:spid="_x0000_s1033" type="#_x0000_t75" alt="Une image contenant nourriture, confiserie&#10;&#10;Le contenu généré par l’IA peut être incorrect." style="position:absolute;left:22861;top:413;width:2984;height:3594;visibility:visible;mso-wrap-style:square" o:gfxdata="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">
                         <v:imagedata r:id="rId19" o:title="Une image contenant nourriture, confiserie&#10;&#10;Le contenu généré par l’IA peut être incorrect" croptop="2887f" cropbottom="2593f" cropright="4235f"/>
                       </v:shape>
                       <w10:anchorlock/>
@@ -5253,7 +5079,7 @@
               <w:jc w:val="center"/>
             </w:pPr>
             <w:r>
-              <w:t>12</w:t>
+              <w:t>4+4+3+3 = 14</w:t>
             </w:r>
           </w:p>
         </w:tc>
@@ -5266,14 +5092,14 @@
             <w:pPr>
               <w:jc w:val="center"/>
               <w:rPr>
-                <w:color w:val="FF0000"/>
+                <w:color w:val="000000" w:themeColor="text1"/>
               </w:rPr>
             </w:pPr>
             <w:r>
               <w:rPr>
-                <w:color w:val="FF0000"/>
-              </w:rPr>
-              <w:t>4</w:t>
+                <w:color w:val="000000" w:themeColor="text1"/>
+              </w:rPr>
+              <w:t>2+2=4</w:t>
             </w:r>
           </w:p>
         </w:tc>
@@ -5285,10 +5111,13 @@
           <w:p>
             <w:pPr>
               <w:jc w:val="center"/>
+              <w:rPr>
+                <w:color w:val="000000" w:themeColor="text1"/>
+              </w:rPr>
             </w:pPr>
             <w:r>
               <w:rPr>
-                <w:color w:val="FF0000"/>
+                <w:color w:val="000000" w:themeColor="text1"/>
               </w:rPr>
               <w:t>2</w:t>
             </w:r>
@@ -5329,10 +5158,10 @@
               <mc:AlternateContent>
                 <mc:Choice Requires="wpc">
                   <w:drawing>
-                    <wp:inline distT="0" distB="0" distL="0" distR="0" wp14:anchorId="0FE55E30" wp14:editId="0FB36898">
+                    <wp:inline distT="0" distB="0" distL="0" distR="0" wp14:anchorId="49B6F319" wp14:editId="0A98F042">
                       <wp:extent cx="2893925" cy="423545"/>
                       <wp:effectExtent l="0" t="0" r="1905" b="0"/>
-                      <wp:docPr id="1579563792" name="Zone de dessin 5"/>
+                      <wp:docPr id="1001814873" name="Zone de dessin 5"/>
                       <wp:cNvGraphicFramePr>
                         <a:graphicFrameLocks xmlns:a="http://schemas.openxmlformats.org/drawingml/2006/main" noChangeAspect="1"/>
                       </wp:cNvGraphicFramePr>
@@ -5347,7 +5176,7 @@
                             <wpc:whole/>
                             <pic:pic xmlns:pic="http://schemas.openxmlformats.org/drawingml/2006/picture">
                               <pic:nvPicPr>
-                                <pic:cNvPr id="1837629275" name="Image 1837629275"/>
+                                <pic:cNvPr id="2087856023" name="Image 2087856023"/>
                                 <pic:cNvPicPr>
                                   <a:picLocks noChangeAspect="1"/>
                                 </pic:cNvPicPr>
@@ -5378,7 +5207,7 @@
                             </pic:pic>
                             <pic:pic xmlns:pic="http://schemas.openxmlformats.org/drawingml/2006/picture">
                               <pic:nvPicPr>
-                                <pic:cNvPr id="1584231125" name="Image 1584231125"/>
+                                <pic:cNvPr id="142622810" name="Image 142622810"/>
                                 <pic:cNvPicPr>
                                   <a:picLocks noChangeAspect="1"/>
                                 </pic:cNvPicPr>
@@ -5409,7 +5238,7 @@
                             </pic:pic>
                             <pic:pic xmlns:pic="http://schemas.openxmlformats.org/drawingml/2006/picture">
                               <pic:nvPicPr>
-                                <pic:cNvPr id="371388948" name="Image 371388948"/>
+                                <pic:cNvPr id="581876053" name="Image 581876053"/>
                                 <pic:cNvPicPr>
                                   <a:picLocks noChangeAspect="1"/>
                                 </pic:cNvPicPr>
@@ -5440,7 +5269,7 @@
                             </pic:pic>
                             <pic:pic xmlns:pic="http://schemas.openxmlformats.org/drawingml/2006/picture">
                               <pic:nvPicPr>
-                                <pic:cNvPr id="1815669211" name="Image 1815669211"/>
+                                <pic:cNvPr id="1534803598" name="Image 1534803598"/>
                                 <pic:cNvPicPr>
                                   <a:picLocks noChangeAspect="1"/>
                                 </pic:cNvPicPr>
@@ -5471,7 +5300,7 @@
                             </pic:pic>
                             <pic:pic xmlns:pic="http://schemas.openxmlformats.org/drawingml/2006/picture">
                               <pic:nvPicPr>
-                                <pic:cNvPr id="1084122920" name="Image 1084122920"/>
+                                <pic:cNvPr id="683340104" name="Image 683340104"/>
                                 <pic:cNvPicPr>
                                   <a:picLocks noChangeAspect="1"/>
                                 </pic:cNvPicPr>
@@ -5502,7 +5331,7 @@
                             </pic:pic>
                             <pic:pic xmlns:pic="http://schemas.openxmlformats.org/drawingml/2006/picture">
                               <pic:nvPicPr>
-                                <pic:cNvPr id="807437057" name="Image 807437057"/>
+                                <pic:cNvPr id="389313530" name="Image 389313530"/>
                                 <pic:cNvPicPr>
                                   <a:picLocks noChangeAspect="1"/>
                                 </pic:cNvPicPr>
@@ -5539,27 +5368,27 @@
                 </mc:Choice>
                 <mc:Fallback>
                   <w:pict>
-                    <v:group w14:anchorId="1376E569" id="Zone de dessin 5" o:spid="_x0000_s1026" editas="canvas" style="width:227.85pt;height:33.35pt;mso-position-horizontal-relative:char;mso-position-vertical-relative:line" coordsize="28936,4235" o:gfxdata="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">
+                    <v:group w14:anchorId="41432691" id="Zone de dessin 5" o:spid="_x0000_s1026" editas="canvas" style="width:227.85pt;height:33.35pt;mso-position-horizontal-relative:char;mso-position-vertical-relative:line" coordsize="28936,4235" o:gfxdata="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">
                       <v:shape id="_x0000_s1027" type="#_x0000_t75" style="position:absolute;width:28936;height:4235;visibility:visible;mso-wrap-style:square" filled="t">
                         <v:fill o:detectmouseclick="t"/>
                         <v:path o:connecttype="none"/>
                       </v:shape>
-                      <v:shape id="Image 1837629275" o:spid="_x0000_s1028" type="#_x0000_t75" style="position:absolute;left:10045;top:292;width:4141;height:3600;visibility:visible;mso-wrap-style:square" o:gfxdata="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">
+                      <v:shape id="Image 2087856023" o:spid="_x0000_s1028" type="#_x0000_t75" style="position:absolute;left:10045;top:292;width:4141;height:3600;visibility:visible;mso-wrap-style:square" o:gfxdata="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">
                         <v:imagedata r:id="rId22" o:title=""/>
                       </v:shape>
-                      <v:shape id="Image 1584231125" o:spid="_x0000_s1029" type="#_x0000_t75" style="position:absolute;left:874;top:296;width:4166;height:3594;visibility:visible;mso-wrap-style:square" o:gfxdata="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">
+                      <v:shape id="Image 142622810" o:spid="_x0000_s1029" type="#_x0000_t75" style="position:absolute;left:874;top:296;width:4166;height:3594;visibility:visible;mso-wrap-style:square" o:gfxdata="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">
                         <v:imagedata r:id="rId12" o:title=""/>
                       </v:shape>
-                      <v:shape id="Image 371388948" o:spid="_x0000_s1030" type="#_x0000_t75" style="position:absolute;left:5463;top:296;width:4160;height:3594;visibility:visible;mso-wrap-style:square" o:gfxdata="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">
+                      <v:shape id="Image 581876053" o:spid="_x0000_s1030" type="#_x0000_t75" style="position:absolute;left:5463;top:296;width:4160;height:3594;visibility:visible;mso-wrap-style:square" o:gfxdata="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">
                         <v:imagedata r:id="rId12" o:title=""/>
                       </v:shape>
-                      <v:shape id="Image 1815669211" o:spid="_x0000_s1031" type="#_x0000_t75" style="position:absolute;left:14612;top:296;width:4140;height:3594;visibility:visible;mso-wrap-style:square" o:gfxdata="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">
+                      <v:shape id="Image 1534803598" o:spid="_x0000_s1031" type="#_x0000_t75" style="position:absolute;left:14612;top:296;width:4140;height:3594;visibility:visible;mso-wrap-style:square" o:gfxdata="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">
                         <v:imagedata r:id="rId18" o:title=""/>
                       </v:shape>
-                      <v:shape id="Image 1084122920" o:spid="_x0000_s1032" type="#_x0000_t75" style="position:absolute;left:19183;top:296;width:4165;height:3594;visibility:visible;mso-wrap-style:square" o:gfxdata="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">
+                      <v:shape id="Image 683340104" o:spid="_x0000_s1032" type="#_x0000_t75" style="position:absolute;left:19183;top:296;width:4165;height:3594;visibility:visible;mso-wrap-style:square" o:gfxdata="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">
                         <v:imagedata r:id="rId23" o:title=""/>
                       </v:shape>
-                      <v:shape id="Image 807437057" o:spid="_x0000_s1033" type="#_x0000_t75" style="position:absolute;left:23769;top:292;width:4159;height:3594;visibility:visible;mso-wrap-style:square" o:gfxdata="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">
+                      <v:shape id="Image 389313530" o:spid="_x0000_s1033" type="#_x0000_t75" style="position:absolute;left:23769;top:292;width:4159;height:3594;visibility:visible;mso-wrap-style:square" o:gfxdata="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">
                         <v:imagedata r:id="rId23" o:title=""/>
                       </v:shape>
                       <w10:anchorlock/>
@@ -5580,7 +5409,7 @@
               <w:jc w:val="center"/>
             </w:pPr>
             <w:r>
-              <w:t>15</w:t>
+              <w:t>4+4+3+2+1 + 1 = 15</w:t>
             </w:r>
           </w:p>
         </w:tc>
@@ -5593,12 +5422,12 @@
             <w:pPr>
               <w:jc w:val="center"/>
               <w:rPr>
-                <w:color w:val="FF0000"/>
+                <w:color w:val="000000" w:themeColor="text1"/>
               </w:rPr>
             </w:pPr>
             <w:r>
               <w:rPr>
-                <w:color w:val="FF0000"/>
+                <w:color w:val="000000" w:themeColor="text1"/>
               </w:rPr>
               <w:t>0</w:t>
             </w:r>
@@ -5612,10 +5441,13 @@
           <w:p>
             <w:pPr>
               <w:jc w:val="center"/>
+              <w:rPr>
+                <w:color w:val="000000" w:themeColor="text1"/>
+              </w:rPr>
             </w:pPr>
             <w:r>
               <w:rPr>
-                <w:color w:val="FF0000"/>
+                <w:color w:val="000000" w:themeColor="text1"/>
               </w:rPr>
               <w:t>4</w:t>
             </w:r>
@@ -5656,10 +5488,10 @@
               <mc:AlternateContent>
                 <mc:Choice Requires="wpc">
                   <w:drawing>
-                    <wp:inline distT="0" distB="0" distL="0" distR="0" wp14:anchorId="59232027" wp14:editId="33955ADA">
+                    <wp:inline distT="0" distB="0" distL="0" distR="0" wp14:anchorId="2845D637" wp14:editId="1A37C557">
                       <wp:extent cx="2793443" cy="423545"/>
                       <wp:effectExtent l="0" t="0" r="6985" b="0"/>
-                      <wp:docPr id="73830458" name="Zone de dessin 5"/>
+                      <wp:docPr id="195833343" name="Zone de dessin 5"/>
                       <wp:cNvGraphicFramePr>
                         <a:graphicFrameLocks xmlns:a="http://schemas.openxmlformats.org/drawingml/2006/main" noChangeAspect="1"/>
                       </wp:cNvGraphicFramePr>
@@ -5674,7 +5506,7 @@
                             <wpc:whole/>
                             <pic:pic xmlns:pic="http://schemas.openxmlformats.org/drawingml/2006/picture">
                               <pic:nvPicPr>
-                                <pic:cNvPr id="724303665" name="Image 724303665"/>
+                                <pic:cNvPr id="1649730796" name="Image 1649730796"/>
                                 <pic:cNvPicPr>
                                   <a:picLocks noChangeAspect="1"/>
                                 </pic:cNvPicPr>
@@ -5705,7 +5537,7 @@
                             </pic:pic>
                             <pic:pic xmlns:pic="http://schemas.openxmlformats.org/drawingml/2006/picture">
                               <pic:nvPicPr>
-                                <pic:cNvPr id="815748634" name="Image 815748634"/>
+                                <pic:cNvPr id="828340898" name="Image 828340898"/>
                                 <pic:cNvPicPr>
                                   <a:picLocks noChangeAspect="1"/>
                                 </pic:cNvPicPr>
@@ -5736,7 +5568,7 @@
                             </pic:pic>
                             <pic:pic xmlns:pic="http://schemas.openxmlformats.org/drawingml/2006/picture">
                               <pic:nvPicPr>
-                                <pic:cNvPr id="1311400863" name="Image 1311400863"/>
+                                <pic:cNvPr id="1113159811" name="Image 1113159811"/>
                                 <pic:cNvPicPr>
                                   <a:picLocks noChangeAspect="1"/>
                                 </pic:cNvPicPr>
@@ -5767,7 +5599,7 @@
                             </pic:pic>
                             <pic:pic xmlns:pic="http://schemas.openxmlformats.org/drawingml/2006/picture">
                               <pic:nvPicPr>
-                                <pic:cNvPr id="64216502" name="Image 64216502"/>
+                                <pic:cNvPr id="1691497937" name="Image 1691497937"/>
                                 <pic:cNvPicPr>
                                   <a:picLocks noChangeAspect="1"/>
                                 </pic:cNvPicPr>
@@ -5798,7 +5630,7 @@
                             </pic:pic>
                             <pic:pic xmlns:pic="http://schemas.openxmlformats.org/drawingml/2006/picture">
                               <pic:nvPicPr>
-                                <pic:cNvPr id="478575824" name="Image 478575824" descr="Une image contenant nourriture, confiserie&#10;&#10;Le contenu généré par l’IA peut être incorrect."/>
+                                <pic:cNvPr id="829064007" name="Image 829064007" descr="Une image contenant nourriture, confiserie&#10;&#10;Le contenu généré par l’IA peut être incorrect."/>
                                 <pic:cNvPicPr>
                                   <a:picLocks noChangeAspect="1"/>
                                 </pic:cNvPicPr>
@@ -5837,7 +5669,7 @@
                             </pic:pic>
                             <pic:pic xmlns:pic="http://schemas.openxmlformats.org/drawingml/2006/picture">
                               <pic:nvPicPr>
-                                <pic:cNvPr id="1078098089" name="Image 1078098089"/>
+                                <pic:cNvPr id="581746026" name="Image 581746026"/>
                                 <pic:cNvPicPr>
                                   <a:picLocks noChangeAspect="1"/>
                                 </pic:cNvPicPr>
@@ -5874,27 +5706,27 @@
                 </mc:Choice>
                 <mc:Fallback>
                   <w:pict>
-                    <v:group w14:anchorId="2AA5C4B5" id="Zone de dessin 5" o:spid="_x0000_s1026" editas="canvas" style="width:219.95pt;height:33.35pt;mso-position-horizontal-relative:char;mso-position-vertical-relative:line" coordsize="27933,4235" o:gfxdata="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